<commit_message>
Add training section on attributor combiner
</commit_message>
<xml_diff>
--- a/training/MSR_framework_training.docx
+++ b/training/MSR_framework_training.docx
@@ -945,8 +945,14 @@
     <w:p>
       <w:pPr>
         <w:pStyle w:val="Heading3"/>
-      </w:pPr>
-      <w:r>
+        <w:rPr>
+          <w:lang w:val="en-US"/>
+        </w:rPr>
+      </w:pPr>
+      <w:r>
+        <w:rPr>
+          <w:lang w:val="en-US"/>
+        </w:rPr>
         <w:t>Part 1.3: QGIS</w:t>
       </w:r>
     </w:p>
@@ -1213,6 +1219,12 @@
         </w:rPr>
         <w:t>Process regional geospatial inputs</w:t>
       </w:r>
+      <w:r>
+        <w:rPr>
+          <w:lang w:val="en-US"/>
+        </w:rPr>
+        <w:t>.</w:t>
+      </w:r>
     </w:p>
     <w:p>
       <w:pPr>
@@ -1231,6 +1243,12 @@
         </w:rPr>
         <w:t>Score land-suitability layers</w:t>
       </w:r>
+      <w:r>
+        <w:rPr>
+          <w:lang w:val="en-US"/>
+        </w:rPr>
+        <w:t>.</w:t>
+      </w:r>
     </w:p>
     <w:p>
       <w:pPr>
@@ -1249,6 +1267,12 @@
         </w:rPr>
         <w:t>Identify competitive renewable-resource areas</w:t>
       </w:r>
+      <w:r>
+        <w:rPr>
+          <w:lang w:val="en-US"/>
+        </w:rPr>
+        <w:t>.</w:t>
+      </w:r>
     </w:p>
     <w:p>
       <w:pPr>
@@ -1267,6 +1291,12 @@
         </w:rPr>
         <w:t>Optionally relax resource thresholds in resource-lagging regions</w:t>
       </w:r>
+      <w:r>
+        <w:rPr>
+          <w:lang w:val="en-US"/>
+        </w:rPr>
+        <w:t>.</w:t>
+      </w:r>
     </w:p>
     <w:p>
       <w:pPr>
@@ -1285,6 +1315,12 @@
         </w:rPr>
         <w:t>Polygonise contiguous suitable areas</w:t>
       </w:r>
+      <w:r>
+        <w:rPr>
+          <w:lang w:val="en-US"/>
+        </w:rPr>
+        <w:t>.</w:t>
+      </w:r>
     </w:p>
     <w:p>
       <w:pPr>
@@ -1333,6 +1369,12 @@
         <w:rPr>
           <w:lang w:val="en-US"/>
         </w:rPr>
+        <w:t xml:space="preserve"> class</w:t>
+      </w:r>
+      <w:r>
+        <w:rPr>
+          <w:lang w:val="en-US"/>
+        </w:rPr>
         <w:t>, climate</w:t>
       </w:r>
       <w:r>
@@ -1346,6 +1388,12 @@
           <w:lang w:val="en-US"/>
         </w:rPr>
         <w:t xml:space="preserve"> and elevation metrics</w:t>
+      </w:r>
+      <w:r>
+        <w:rPr>
+          <w:lang w:val="en-US"/>
+        </w:rPr>
+        <w:t>.</w:t>
       </w:r>
     </w:p>
     <w:p>
@@ -1828,14 +1876,27 @@
       <w:r>
         <w:t xml:space="preserve">Figure </w:t>
       </w:r>
-      <w:fldSimple w:instr=" SEQ Figure \* ARABIC ">
-        <w:r>
-          <w:rPr>
-            <w:noProof/>
-          </w:rPr>
-          <w:t>1</w:t>
-        </w:r>
-      </w:fldSimple>
+      <w:r>
+        <w:fldChar w:fldCharType="begin"/>
+      </w:r>
+      <w:r>
+        <w:instrText xml:space="preserve"> SEQ Figure \* ARABIC </w:instrText>
+      </w:r>
+      <w:r>
+        <w:fldChar w:fldCharType="separate"/>
+      </w:r>
+      <w:r>
+        <w:rPr>
+          <w:noProof/>
+        </w:rPr>
+        <w:t>1</w:t>
+      </w:r>
+      <w:r>
+        <w:rPr>
+          <w:noProof/>
+        </w:rPr>
+        <w:fldChar w:fldCharType="end"/>
+      </w:r>
       <w:bookmarkEnd w:id="2"/>
       <w:r>
         <w:t>: a) Elevation</w:t>
@@ -2047,6 +2108,9 @@
         <w:t>2</w:t>
       </w:r>
       <w:r>
+        <w:rPr>
+          <w:noProof/>
+        </w:rPr>
         <w:fldChar w:fldCharType="end"/>
       </w:r>
       <w:bookmarkEnd w:id="3"/>
@@ -2122,10 +2186,10 @@
           <w:lang w:val="en-BE"/>
         </w:rPr>
         <w:drawing>
-          <wp:inline distT="0" distB="0" distL="0" distR="0" wp14:anchorId="44A7B1D6" wp14:editId="705E48FD">
-            <wp:extent cx="2171589" cy="1800000"/>
-            <wp:effectExtent l="0" t="0" r="635" b="0"/>
-            <wp:docPr id="448515696" name="Picture 4"/>
+          <wp:inline distT="0" distB="0" distL="0" distR="0" wp14:anchorId="365F960D" wp14:editId="106B6380">
+            <wp:extent cx="1661346" cy="1800000"/>
+            <wp:effectExtent l="0" t="0" r="0" b="0"/>
+            <wp:docPr id="1747593084" name="Picture 2"/>
             <wp:cNvGraphicFramePr>
               <a:graphicFrameLocks xmlns:a="http://schemas.openxmlformats.org/drawingml/2006/main" noChangeAspect="1"/>
             </wp:cNvGraphicFramePr>
@@ -2133,7 +2197,7 @@
               <a:graphicData uri="http://schemas.openxmlformats.org/drawingml/2006/picture">
                 <pic:pic xmlns:pic="http://schemas.openxmlformats.org/drawingml/2006/picture">
                   <pic:nvPicPr>
-                    <pic:cNvPr id="448515696" name="Picture 448515696"/>
+                    <pic:cNvPr id="1747593084" name="Picture 1747593084"/>
                     <pic:cNvPicPr/>
                   </pic:nvPicPr>
                   <pic:blipFill rotWithShape="1">
@@ -2144,7 +2208,7 @@
                         </a:ext>
                       </a:extLst>
                     </a:blip>
-                    <a:srcRect l="13981" t="19662" r="27016" b="11180"/>
+                    <a:srcRect l="28435" t="18204" r="26075" b="12100"/>
                     <a:stretch>
                       <a:fillRect/>
                     </a:stretch>
@@ -2152,7 +2216,7 @@
                   <pic:spPr bwMode="auto">
                     <a:xfrm>
                       <a:off x="0" y="0"/>
-                      <a:ext cx="2171589" cy="1800000"/>
+                      <a:ext cx="1661346" cy="1800000"/>
                     </a:xfrm>
                     <a:prstGeom prst="rect">
                       <a:avLst/>
@@ -2172,6 +2236,118 @@
           </wp:inline>
         </w:drawing>
       </w:r>
+      <w:r>
+        <w:rPr>
+          <w:noProof/>
+          <w:lang w:val="en-BE"/>
+        </w:rPr>
+        <w:drawing>
+          <wp:inline distT="0" distB="0" distL="0" distR="0" wp14:anchorId="0CDED7A1" wp14:editId="6652C563">
+            <wp:extent cx="1713061" cy="1800000"/>
+            <wp:effectExtent l="0" t="0" r="1905" b="0"/>
+            <wp:docPr id="17795008" name="Picture 3"/>
+            <wp:cNvGraphicFramePr>
+              <a:graphicFrameLocks xmlns:a="http://schemas.openxmlformats.org/drawingml/2006/main" noChangeAspect="1"/>
+            </wp:cNvGraphicFramePr>
+            <a:graphic xmlns:a="http://schemas.openxmlformats.org/drawingml/2006/main">
+              <a:graphicData uri="http://schemas.openxmlformats.org/drawingml/2006/picture">
+                <pic:pic xmlns:pic="http://schemas.openxmlformats.org/drawingml/2006/picture">
+                  <pic:nvPicPr>
+                    <pic:cNvPr id="17795008" name="Picture 17795008"/>
+                    <pic:cNvPicPr/>
+                  </pic:nvPicPr>
+                  <pic:blipFill rotWithShape="1">
+                    <a:blip r:embed="rId11" cstate="print">
+                      <a:extLst>
+                        <a:ext uri="{28A0092B-C50C-407E-A947-70E740481C1C}">
+                          <a14:useLocalDpi xmlns:a14="http://schemas.microsoft.com/office/drawing/2010/main" val="0"/>
+                        </a:ext>
+                      </a:extLst>
+                    </a:blip>
+                    <a:srcRect l="27331" t="17980" r="25759" b="12319"/>
+                    <a:stretch>
+                      <a:fillRect/>
+                    </a:stretch>
+                  </pic:blipFill>
+                  <pic:spPr bwMode="auto">
+                    <a:xfrm>
+                      <a:off x="0" y="0"/>
+                      <a:ext cx="1713061" cy="1800000"/>
+                    </a:xfrm>
+                    <a:prstGeom prst="rect">
+                      <a:avLst/>
+                    </a:prstGeom>
+                    <a:ln>
+                      <a:noFill/>
+                    </a:ln>
+                    <a:extLst>
+                      <a:ext uri="{53640926-AAD7-44D8-BBD7-CCE9431645EC}">
+                        <a14:shadowObscured xmlns:a14="http://schemas.microsoft.com/office/drawing/2010/main"/>
+                      </a:ext>
+                    </a:extLst>
+                  </pic:spPr>
+                </pic:pic>
+              </a:graphicData>
+            </a:graphic>
+          </wp:inline>
+        </w:drawing>
+      </w:r>
+      <w:r>
+        <w:rPr>
+          <w:noProof/>
+          <w:lang w:val="en-BE"/>
+        </w:rPr>
+        <w:drawing>
+          <wp:inline distT="0" distB="0" distL="0" distR="0" wp14:anchorId="7D06B639" wp14:editId="62049EF3">
+            <wp:extent cx="1799953" cy="1800000"/>
+            <wp:effectExtent l="0" t="0" r="0" b="0"/>
+            <wp:docPr id="186566694" name="Picture 1"/>
+            <wp:cNvGraphicFramePr>
+              <a:graphicFrameLocks xmlns:a="http://schemas.openxmlformats.org/drawingml/2006/main" noChangeAspect="1"/>
+            </wp:cNvGraphicFramePr>
+            <a:graphic xmlns:a="http://schemas.openxmlformats.org/drawingml/2006/main">
+              <a:graphicData uri="http://schemas.openxmlformats.org/drawingml/2006/picture">
+                <pic:pic xmlns:pic="http://schemas.openxmlformats.org/drawingml/2006/picture">
+                  <pic:nvPicPr>
+                    <pic:cNvPr id="186566694" name="Picture 186566694"/>
+                    <pic:cNvPicPr/>
+                  </pic:nvPicPr>
+                  <pic:blipFill rotWithShape="1">
+                    <a:blip r:embed="rId12" cstate="print">
+                      <a:extLst>
+                        <a:ext uri="{28A0092B-C50C-407E-A947-70E740481C1C}">
+                          <a14:useLocalDpi xmlns:a14="http://schemas.microsoft.com/office/drawing/2010/main" val="0"/>
+                        </a:ext>
+                      </a:extLst>
+                    </a:blip>
+                    <a:srcRect l="19827" t="11393" r="22126" b="6521"/>
+                    <a:stretch>
+                      <a:fillRect/>
+                    </a:stretch>
+                  </pic:blipFill>
+                  <pic:spPr bwMode="auto">
+                    <a:xfrm>
+                      <a:off x="0" y="0"/>
+                      <a:ext cx="1799953" cy="1800000"/>
+                    </a:xfrm>
+                    <a:prstGeom prst="rect">
+                      <a:avLst/>
+                    </a:prstGeom>
+                    <a:ln>
+                      <a:noFill/>
+                    </a:ln>
+                    <a:extLst>
+                      <a:ext uri="{53640926-AAD7-44D8-BBD7-CCE9431645EC}">
+                        <a14:shadowObscured xmlns:a14="http://schemas.microsoft.com/office/drawing/2010/main"/>
+                      </a:ext>
+                    </a:extLst>
+                  </pic:spPr>
+                </pic:pic>
+              </a:graphicData>
+            </a:graphic>
+          </wp:inline>
+        </w:drawing>
+      </w:r>
     </w:p>
     <w:p>
       <w:pPr>
@@ -2185,14 +2361,27 @@
       <w:r>
         <w:t xml:space="preserve">Figure </w:t>
       </w:r>
-      <w:fldSimple w:instr=" SEQ Figure \* ARABIC ">
-        <w:r>
-          <w:rPr>
-            <w:noProof/>
-          </w:rPr>
-          <w:t>3</w:t>
-        </w:r>
-      </w:fldSimple>
+      <w:r>
+        <w:fldChar w:fldCharType="begin"/>
+      </w:r>
+      <w:r>
+        <w:instrText xml:space="preserve"> SEQ Figure \* ARABIC </w:instrText>
+      </w:r>
+      <w:r>
+        <w:fldChar w:fldCharType="separate"/>
+      </w:r>
+      <w:r>
+        <w:rPr>
+          <w:noProof/>
+        </w:rPr>
+        <w:t>3</w:t>
+      </w:r>
+      <w:r>
+        <w:rPr>
+          <w:noProof/>
+        </w:rPr>
+        <w:fldChar w:fldCharType="end"/>
+      </w:r>
       <w:r>
         <w:t xml:space="preserve">: a) </w:t>
       </w:r>
@@ -2612,7 +2801,7 @@
                     <pic:cNvPicPr/>
                   </pic:nvPicPr>
                   <pic:blipFill rotWithShape="1">
-                    <a:blip r:embed="rId11" cstate="print">
+                    <a:blip r:embed="rId13" cstate="print">
                       <a:extLst>
                         <a:ext uri="{28A0092B-C50C-407E-A947-70E740481C1C}">
                           <a14:useLocalDpi xmlns:a14="http://schemas.microsoft.com/office/drawing/2010/main" val="0"/>
@@ -2668,7 +2857,7 @@
                     <pic:cNvPicPr/>
                   </pic:nvPicPr>
                   <pic:blipFill rotWithShape="1">
-                    <a:blip r:embed="rId12" cstate="print">
+                    <a:blip r:embed="rId14" cstate="print">
                       <a:extLst>
                         <a:ext uri="{28A0092B-C50C-407E-A947-70E740481C1C}">
                           <a14:useLocalDpi xmlns:a14="http://schemas.microsoft.com/office/drawing/2010/main" val="0"/>
@@ -2733,6 +2922,9 @@
         <w:t>4</w:t>
       </w:r>
       <w:r>
+        <w:rPr>
+          <w:noProof/>
+        </w:rPr>
         <w:fldChar w:fldCharType="end"/>
       </w:r>
       <w:bookmarkEnd w:id="5"/>
@@ -3944,13 +4136,7 @@
         <w:rPr>
           <w:lang w:val="en-US"/>
         </w:rPr>
-        <w:t xml:space="preserve"> i</w:t>
-      </w:r>
-      <w:r>
-        <w:rPr>
-          <w:lang w:val="en-US"/>
-        </w:rPr>
-        <w:t xml:space="preserve">n the </w:t>
+        <w:t xml:space="preserve"> in the </w:t>
       </w:r>
       <w:r>
         <w:rPr>
@@ -4630,7 +4816,7 @@
                     <pic:cNvPicPr/>
                   </pic:nvPicPr>
                   <pic:blipFill rotWithShape="1">
-                    <a:blip r:embed="rId13" cstate="print">
+                    <a:blip r:embed="rId15" cstate="print">
                       <a:extLst>
                         <a:ext uri="{28A0092B-C50C-407E-A947-70E740481C1C}">
                           <a14:useLocalDpi xmlns:a14="http://schemas.microsoft.com/office/drawing/2010/main" val="0"/>
@@ -4692,6 +4878,9 @@
         <w:t>5</w:t>
       </w:r>
       <w:r>
+        <w:rPr>
+          <w:noProof/>
+        </w:rPr>
         <w:fldChar w:fldCharType="end"/>
       </w:r>
       <w:bookmarkEnd w:id="6"/>
@@ -4750,7 +4939,7 @@
                     <pic:cNvPicPr/>
                   </pic:nvPicPr>
                   <pic:blipFill>
-                    <a:blip r:embed="rId14" cstate="print">
+                    <a:blip r:embed="rId16" cstate="print">
                       <a:extLst>
                         <a:ext uri="{28A0092B-C50C-407E-A947-70E740481C1C}">
                           <a14:useLocalDpi xmlns:a14="http://schemas.microsoft.com/office/drawing/2010/main" val="0"/>
@@ -4790,14 +4979,27 @@
       <w:r>
         <w:t xml:space="preserve">Figure </w:t>
       </w:r>
-      <w:fldSimple w:instr=" SEQ Figure \* ARABIC ">
-        <w:r>
-          <w:rPr>
-            <w:noProof/>
-          </w:rPr>
-          <w:t>6</w:t>
-        </w:r>
-      </w:fldSimple>
+      <w:r>
+        <w:fldChar w:fldCharType="begin"/>
+      </w:r>
+      <w:r>
+        <w:instrText xml:space="preserve"> SEQ Figure \* ARABIC </w:instrText>
+      </w:r>
+      <w:r>
+        <w:fldChar w:fldCharType="separate"/>
+      </w:r>
+      <w:r>
+        <w:rPr>
+          <w:noProof/>
+        </w:rPr>
+        <w:t>6</w:t>
+      </w:r>
+      <w:r>
+        <w:rPr>
+          <w:noProof/>
+        </w:rPr>
+        <w:fldChar w:fldCharType="end"/>
+      </w:r>
       <w:bookmarkEnd w:id="7"/>
       <w:r>
         <w:t xml:space="preserve">: Composition of wind </w:t>
@@ -4926,13 +5128,7 @@
         <w:rPr>
           <w:lang w:val="en-US"/>
         </w:rPr>
-        <w:t xml:space="preserve"> </w:t>
-      </w:r>
-      <w:r>
-        <w:rPr>
-          <w:lang w:val="en-US"/>
-        </w:rPr>
-        <w:t>to investigate how access to higher-elevation areas affects the resulting MSRs.</w:t>
+        <w:t xml:space="preserve"> to investigate how access to higher-elevation areas affects the resulting MSRs.</w:t>
       </w:r>
     </w:p>
     <w:p>
@@ -5308,13 +5504,7 @@
         <w:rPr>
           <w:lang w:val="en-US"/>
         </w:rPr>
-        <w:t>i</w:t>
-      </w:r>
-      <w:r>
-        <w:rPr>
-          <w:lang w:val="en-US"/>
-        </w:rPr>
-        <w:t xml:space="preserve">n the </w:t>
+        <w:t xml:space="preserve">in the </w:t>
       </w:r>
       <w:r>
         <w:rPr>
@@ -5562,7 +5752,7 @@
                     <pic:cNvPicPr/>
                   </pic:nvPicPr>
                   <pic:blipFill rotWithShape="1">
-                    <a:blip r:embed="rId15" cstate="print">
+                    <a:blip r:embed="rId17" cstate="print">
                       <a:extLst>
                         <a:ext uri="{28A0092B-C50C-407E-A947-70E740481C1C}">
                           <a14:useLocalDpi xmlns:a14="http://schemas.microsoft.com/office/drawing/2010/main" val="0"/>
@@ -5608,14 +5798,27 @@
       <w:r>
         <w:t xml:space="preserve">Figure </w:t>
       </w:r>
-      <w:fldSimple w:instr=" SEQ Figure \* ARABIC ">
-        <w:r>
-          <w:rPr>
-            <w:noProof/>
-          </w:rPr>
-          <w:t>7</w:t>
-        </w:r>
-      </w:fldSimple>
+      <w:r>
+        <w:fldChar w:fldCharType="begin"/>
+      </w:r>
+      <w:r>
+        <w:instrText xml:space="preserve"> SEQ Figure \* ARABIC </w:instrText>
+      </w:r>
+      <w:r>
+        <w:fldChar w:fldCharType="separate"/>
+      </w:r>
+      <w:r>
+        <w:rPr>
+          <w:noProof/>
+        </w:rPr>
+        <w:t>7</w:t>
+      </w:r>
+      <w:r>
+        <w:rPr>
+          <w:noProof/>
+        </w:rPr>
+        <w:fldChar w:fldCharType="end"/>
+      </w:r>
       <w:bookmarkEnd w:id="8"/>
       <w:r>
         <w:t xml:space="preserve">: Wind </w:t>
@@ -5672,7 +5875,7 @@
                     <pic:cNvPicPr/>
                   </pic:nvPicPr>
                   <pic:blipFill>
-                    <a:blip r:embed="rId16" cstate="print">
+                    <a:blip r:embed="rId18" cstate="print">
                       <a:extLst>
                         <a:ext uri="{28A0092B-C50C-407E-A947-70E740481C1C}">
                           <a14:useLocalDpi xmlns:a14="http://schemas.microsoft.com/office/drawing/2010/main" val="0"/>
@@ -5712,14 +5915,27 @@
       <w:r>
         <w:t xml:space="preserve">Figure </w:t>
       </w:r>
-      <w:fldSimple w:instr=" SEQ Figure \* ARABIC ">
-        <w:r>
-          <w:rPr>
-            <w:noProof/>
-          </w:rPr>
-          <w:t>8</w:t>
-        </w:r>
-      </w:fldSimple>
+      <w:r>
+        <w:fldChar w:fldCharType="begin"/>
+      </w:r>
+      <w:r>
+        <w:instrText xml:space="preserve"> SEQ Figure \* ARABIC </w:instrText>
+      </w:r>
+      <w:r>
+        <w:fldChar w:fldCharType="separate"/>
+      </w:r>
+      <w:r>
+        <w:rPr>
+          <w:noProof/>
+        </w:rPr>
+        <w:t>8</w:t>
+      </w:r>
+      <w:r>
+        <w:rPr>
+          <w:noProof/>
+        </w:rPr>
+        <w:fldChar w:fldCharType="end"/>
+      </w:r>
       <w:bookmarkEnd w:id="9"/>
       <w:r>
         <w:t xml:space="preserve">: Composition of wind </w:t>
@@ -5944,7 +6160,7 @@
                     <pic:cNvPicPr/>
                   </pic:nvPicPr>
                   <pic:blipFill>
-                    <a:blip r:embed="rId17" cstate="print">
+                    <a:blip r:embed="rId19" cstate="print">
                       <a:extLst>
                         <a:ext uri="{28A0092B-C50C-407E-A947-70E740481C1C}">
                           <a14:useLocalDpi xmlns:a14="http://schemas.microsoft.com/office/drawing/2010/main" val="0"/>
@@ -5984,14 +6200,27 @@
       <w:r>
         <w:t xml:space="preserve">Figure </w:t>
       </w:r>
-      <w:fldSimple w:instr=" SEQ Figure \* ARABIC ">
-        <w:r>
-          <w:rPr>
-            <w:noProof/>
-          </w:rPr>
-          <w:t>9</w:t>
-        </w:r>
-      </w:fldSimple>
+      <w:r>
+        <w:fldChar w:fldCharType="begin"/>
+      </w:r>
+      <w:r>
+        <w:instrText xml:space="preserve"> SEQ Figure \* ARABIC </w:instrText>
+      </w:r>
+      <w:r>
+        <w:fldChar w:fldCharType="separate"/>
+      </w:r>
+      <w:r>
+        <w:rPr>
+          <w:noProof/>
+        </w:rPr>
+        <w:t>9</w:t>
+      </w:r>
+      <w:r>
+        <w:rPr>
+          <w:noProof/>
+        </w:rPr>
+        <w:fldChar w:fldCharType="end"/>
+      </w:r>
       <w:bookmarkEnd w:id="10"/>
       <w:r>
         <w:t xml:space="preserve">: Composition of wind </w:t>
@@ -6034,7 +6263,7 @@
                     <pic:cNvPicPr/>
                   </pic:nvPicPr>
                   <pic:blipFill>
-                    <a:blip r:embed="rId18" cstate="print">
+                    <a:blip r:embed="rId20" cstate="print">
                       <a:extLst>
                         <a:ext uri="{28A0092B-C50C-407E-A947-70E740481C1C}">
                           <a14:useLocalDpi xmlns:a14="http://schemas.microsoft.com/office/drawing/2010/main" val="0"/>
@@ -6074,14 +6303,27 @@
       <w:r>
         <w:t xml:space="preserve">Figure </w:t>
       </w:r>
-      <w:fldSimple w:instr=" SEQ Figure \* ARABIC ">
-        <w:r>
-          <w:rPr>
-            <w:noProof/>
-          </w:rPr>
-          <w:t>10</w:t>
-        </w:r>
-      </w:fldSimple>
+      <w:r>
+        <w:fldChar w:fldCharType="begin"/>
+      </w:r>
+      <w:r>
+        <w:instrText xml:space="preserve"> SEQ Figure \* ARABIC </w:instrText>
+      </w:r>
+      <w:r>
+        <w:fldChar w:fldCharType="separate"/>
+      </w:r>
+      <w:r>
+        <w:rPr>
+          <w:noProof/>
+        </w:rPr>
+        <w:t>10</w:t>
+      </w:r>
+      <w:r>
+        <w:rPr>
+          <w:noProof/>
+        </w:rPr>
+        <w:fldChar w:fldCharType="end"/>
+      </w:r>
       <w:bookmarkEnd w:id="11"/>
       <w:r>
         <w:t xml:space="preserve">: Composition of wind </w:t>
@@ -6366,13 +6608,7 @@
         <w:rPr>
           <w:lang w:val="en-US"/>
         </w:rPr>
-        <w:t>i</w:t>
-      </w:r>
-      <w:r>
-        <w:rPr>
-          <w:lang w:val="en-US"/>
-        </w:rPr>
-        <w:t xml:space="preserve">n the </w:t>
+        <w:t xml:space="preserve">in the </w:t>
       </w:r>
       <w:r>
         <w:rPr>
@@ -6430,7 +6666,7 @@
                     <pic:cNvPicPr/>
                   </pic:nvPicPr>
                   <pic:blipFill rotWithShape="1">
-                    <a:blip r:embed="rId19" cstate="print">
+                    <a:blip r:embed="rId21" cstate="print">
                       <a:extLst>
                         <a:ext uri="{28A0092B-C50C-407E-A947-70E740481C1C}">
                           <a14:useLocalDpi xmlns:a14="http://schemas.microsoft.com/office/drawing/2010/main" val="0"/>
@@ -6478,19 +6714,2377 @@
       <w:r>
         <w:t xml:space="preserve">Figure </w:t>
       </w:r>
+      <w:r>
+        <w:fldChar w:fldCharType="begin"/>
+      </w:r>
+      <w:r>
+        <w:instrText xml:space="preserve"> SEQ Figure \* ARABIC </w:instrText>
+      </w:r>
+      <w:r>
+        <w:fldChar w:fldCharType="separate"/>
+      </w:r>
+      <w:r>
+        <w:rPr>
+          <w:noProof/>
+        </w:rPr>
+        <w:t>11</w:t>
+      </w:r>
+      <w:r>
+        <w:rPr>
+          <w:noProof/>
+        </w:rPr>
+        <w:fldChar w:fldCharType="end"/>
+      </w:r>
+      <w:r>
+        <w:t xml:space="preserve">: </w:t>
+      </w:r>
+      <w:r>
+        <w:t xml:space="preserve">Solar PV </w:t>
+      </w:r>
+      <w:proofErr w:type="spellStart"/>
+      <w:r>
+        <w:t>MSRs</w:t>
+      </w:r>
+      <w:proofErr w:type="spellEnd"/>
+      <w:r>
+        <w:t xml:space="preserve"> in Ecuador.</w:t>
+      </w:r>
+    </w:p>
+    <w:p>
+      <w:pPr>
+        <w:rPr>
+          <w:lang w:val="en-US"/>
+        </w:rPr>
+      </w:pPr>
+    </w:p>
+    <w:p>
+      <w:pPr>
+        <w:pStyle w:val="Heading2"/>
+        <w:rPr>
+          <w:lang w:val="en-US"/>
+        </w:rPr>
+      </w:pPr>
+      <w:r>
+        <w:rPr>
+          <w:lang w:val="en-US"/>
+        </w:rPr>
+        <w:t xml:space="preserve">Part </w:t>
+      </w:r>
+      <w:r>
+        <w:rPr>
+          <w:lang w:val="en-US"/>
+        </w:rPr>
+        <w:t>3</w:t>
+      </w:r>
+      <w:r>
+        <w:rPr>
+          <w:lang w:val="en-US"/>
+        </w:rPr>
+        <w:t xml:space="preserve">: </w:t>
+      </w:r>
+      <w:r>
+        <w:rPr>
+          <w:lang w:val="en-US"/>
+        </w:rPr>
+        <w:t>Profile Generator</w:t>
+      </w:r>
+    </w:p>
+    <w:p>
+      <w:pPr>
+        <w:rPr>
+          <w:lang w:val="en-US"/>
+        </w:rPr>
+      </w:pPr>
+    </w:p>
+    <w:p>
+      <w:pPr>
+        <w:rPr>
+          <w:i/>
+          <w:iCs/>
+          <w:lang w:val="en-US"/>
+        </w:rPr>
+      </w:pPr>
+      <w:r>
+        <w:rPr>
+          <w:i/>
+          <w:iCs/>
+          <w:lang w:val="en-US"/>
+        </w:rPr>
+        <w:t xml:space="preserve">**Add </w:t>
+      </w:r>
+      <w:r>
+        <w:rPr>
+          <w:i/>
+          <w:iCs/>
+          <w:lang w:val="en-US"/>
+        </w:rPr>
+        <w:t xml:space="preserve">Plot </w:t>
+      </w:r>
+      <w:r>
+        <w:rPr>
+          <w:i/>
+          <w:iCs/>
+          <w:lang w:val="en-US"/>
+        </w:rPr>
+        <w:t>duration curves</w:t>
+      </w:r>
+      <w:r>
+        <w:rPr>
+          <w:i/>
+          <w:iCs/>
+          <w:lang w:val="en-US"/>
+        </w:rPr>
+        <w:t xml:space="preserve">, </w:t>
+      </w:r>
+      <w:r>
+        <w:rPr>
+          <w:i/>
+          <w:iCs/>
+          <w:lang w:val="en-US"/>
+        </w:rPr>
+        <w:t>frequency</w:t>
+      </w:r>
+      <w:r>
+        <w:rPr>
+          <w:i/>
+          <w:iCs/>
+          <w:lang w:val="en-US"/>
+        </w:rPr>
+        <w:t xml:space="preserve"> distribution</w:t>
+      </w:r>
+      <w:r>
+        <w:rPr>
+          <w:i/>
+          <w:iCs/>
+          <w:lang w:val="en-US"/>
+        </w:rPr>
+        <w:t>, typical</w:t>
+      </w:r>
+      <w:r>
+        <w:rPr>
+          <w:i/>
+          <w:iCs/>
+          <w:lang w:val="en-US"/>
+        </w:rPr>
+        <w:t xml:space="preserve"> </w:t>
+      </w:r>
+      <w:r>
+        <w:rPr>
+          <w:i/>
+          <w:iCs/>
+          <w:lang w:val="en-US"/>
+        </w:rPr>
+        <w:t xml:space="preserve">daily and seasonal </w:t>
+      </w:r>
+      <w:proofErr w:type="gramStart"/>
+      <w:r>
+        <w:rPr>
+          <w:i/>
+          <w:iCs/>
+          <w:lang w:val="en-US"/>
+        </w:rPr>
+        <w:t>profile</w:t>
+      </w:r>
+      <w:r>
+        <w:rPr>
+          <w:i/>
+          <w:iCs/>
+          <w:lang w:val="en-US"/>
+        </w:rPr>
+        <w:t>.</w:t>
+      </w:r>
+      <w:r>
+        <w:rPr>
+          <w:i/>
+          <w:iCs/>
+          <w:lang w:val="en-US"/>
+        </w:rPr>
+        <w:t>*</w:t>
+      </w:r>
+      <w:proofErr w:type="gramEnd"/>
+      <w:r>
+        <w:rPr>
+          <w:i/>
+          <w:iCs/>
+          <w:lang w:val="en-US"/>
+        </w:rPr>
+        <w:t>*</w:t>
+      </w:r>
+    </w:p>
+    <w:p>
+      <w:pPr>
+        <w:pStyle w:val="Heading2"/>
+        <w:rPr>
+          <w:lang w:val="en-US"/>
+        </w:rPr>
+      </w:pPr>
+      <w:r>
+        <w:rPr>
+          <w:lang w:val="en-US"/>
+        </w:rPr>
+        <w:t xml:space="preserve">Part </w:t>
+      </w:r>
+      <w:r>
+        <w:rPr>
+          <w:lang w:val="en-US"/>
+        </w:rPr>
+        <w:t>4</w:t>
+      </w:r>
+      <w:r>
+        <w:rPr>
+          <w:lang w:val="en-US"/>
+        </w:rPr>
+        <w:t xml:space="preserve">: </w:t>
+      </w:r>
+      <w:r>
+        <w:rPr>
+          <w:lang w:val="en-US"/>
+        </w:rPr>
+        <w:t>Attributor Combiner</w:t>
+      </w:r>
+    </w:p>
+    <w:p>
+      <w:pPr>
+        <w:rPr>
+          <w:lang w:val="en-US"/>
+        </w:rPr>
+      </w:pPr>
+    </w:p>
+    <w:p>
+      <w:pPr>
+        <w:rPr>
+          <w:lang w:val="en-US"/>
+        </w:rPr>
+      </w:pPr>
+      <w:r>
+        <w:rPr>
+          <w:lang w:val="en-US"/>
+        </w:rPr>
+        <w:lastRenderedPageBreak/>
+        <w:t xml:space="preserve">The attributor combiner determines for each individual MSR the cost and performance attributes including loss adjusted annual capacity factors and </w:t>
+      </w:r>
+      <w:r>
+        <w:rPr>
+          <w:lang w:val="en-US"/>
+        </w:rPr>
+        <w:t xml:space="preserve">three </w:t>
+      </w:r>
+      <w:proofErr w:type="gramStart"/>
+      <w:r>
+        <w:rPr>
+          <w:lang w:val="en-US"/>
+        </w:rPr>
+        <w:t>part-</w:t>
+      </w:r>
+      <w:r>
+        <w:rPr>
+          <w:lang w:val="en-US"/>
+        </w:rPr>
+        <w:t>wise</w:t>
+      </w:r>
+      <w:proofErr w:type="gramEnd"/>
+      <w:r>
+        <w:rPr>
+          <w:lang w:val="en-US"/>
+        </w:rPr>
+        <w:t xml:space="preserve"> </w:t>
+      </w:r>
+      <w:proofErr w:type="spellStart"/>
+      <w:r>
+        <w:rPr>
+          <w:lang w:val="en-US"/>
+        </w:rPr>
+        <w:t>Levelised</w:t>
+      </w:r>
+      <w:proofErr w:type="spellEnd"/>
+      <w:r>
+        <w:rPr>
+          <w:lang w:val="en-US"/>
+        </w:rPr>
+        <w:t xml:space="preserve"> Cost of Electricity (LCOE) metrics for supply, grid tie line and substations, and road connection.</w:t>
+      </w:r>
+    </w:p>
+    <w:p>
+      <w:pPr>
+        <w:rPr>
+          <w:lang w:val="en-US"/>
+        </w:rPr>
+      </w:pPr>
+    </w:p>
+    <w:p>
+      <w:pPr>
+        <w:pStyle w:val="Heading3"/>
+      </w:pPr>
+      <w:r>
+        <w:t>Part 4.1: LCOE</w:t>
+      </w:r>
+    </w:p>
+    <w:p>
+      <w:pPr>
+        <w:rPr>
+          <w:lang w:val="en-US"/>
+        </w:rPr>
+      </w:pPr>
+    </w:p>
+    <w:p>
+      <w:pPr>
+        <w:rPr>
+          <w:i/>
+          <w:iCs/>
+          <w:lang w:val="en-US"/>
+        </w:rPr>
+      </w:pPr>
+      <w:r>
+        <w:rPr>
+          <w:i/>
+          <w:iCs/>
+          <w:lang w:val="en-US"/>
+        </w:rPr>
+        <w:t>**Explain cost assumptions and calculations. How does the capacity factor and the distance from the grid influence the costs. Distinguish</w:t>
+      </w:r>
+      <w:r>
+        <w:rPr>
+          <w:i/>
+          <w:iCs/>
+          <w:lang w:val="en-US"/>
+        </w:rPr>
+        <w:t xml:space="preserve"> between resources with different</w:t>
+      </w:r>
+      <w:r>
+        <w:rPr>
+          <w:i/>
+          <w:iCs/>
+          <w:lang w:val="en-US"/>
+        </w:rPr>
+        <w:t xml:space="preserve"> </w:t>
+      </w:r>
+      <w:r>
+        <w:rPr>
+          <w:i/>
+          <w:iCs/>
+          <w:lang w:val="en-US"/>
+        </w:rPr>
+        <w:t>quality and resources with different accessibility.</w:t>
+      </w:r>
+      <w:r>
+        <w:rPr>
+          <w:i/>
+          <w:iCs/>
+          <w:lang w:val="en-US"/>
+        </w:rPr>
+        <w:t xml:space="preserve"> Remoteness premium**</w:t>
+      </w:r>
+    </w:p>
+    <w:p>
+      <w:pPr>
+        <w:pStyle w:val="Heading3"/>
+        <w:rPr>
+          <w:lang w:val="en-US"/>
+        </w:rPr>
+      </w:pPr>
+      <w:r>
+        <w:rPr>
+          <w:lang w:val="en-US"/>
+        </w:rPr>
+        <w:t xml:space="preserve">Parth </w:t>
+      </w:r>
+      <w:r>
+        <w:rPr>
+          <w:lang w:val="en-US"/>
+        </w:rPr>
+        <w:t>4.2: Setting up the control file</w:t>
+      </w:r>
+    </w:p>
+    <w:p>
+      <w:pPr>
+        <w:rPr>
+          <w:lang w:val="en-US"/>
+        </w:rPr>
+      </w:pPr>
+    </w:p>
+    <w:p>
+      <w:pPr>
+        <w:rPr>
+          <w:lang w:val="en-US"/>
+        </w:rPr>
+      </w:pPr>
+      <w:r>
+        <w:rPr>
+          <w:lang w:val="en-US"/>
+        </w:rPr>
+        <w:t>Open the</w:t>
+      </w:r>
+      <w:r>
+        <w:rPr>
+          <w:lang w:val="en-US"/>
+        </w:rPr>
+        <w:t xml:space="preserve"> control file, </w:t>
+      </w:r>
+      <w:r>
+        <w:rPr>
+          <w:color w:val="FFFF00"/>
+          <w:lang w:val="en-US"/>
+        </w:rPr>
+        <w:t>control_file_</w:t>
+      </w:r>
+      <w:r>
+        <w:rPr>
+          <w:color w:val="FFFF00"/>
+          <w:lang w:val="en-US"/>
+        </w:rPr>
+        <w:t>attributor_combiner</w:t>
+      </w:r>
+      <w:r>
+        <w:rPr>
+          <w:color w:val="FFFF00"/>
+          <w:lang w:val="en-US"/>
+        </w:rPr>
+        <w:t>.xlsx</w:t>
+      </w:r>
+      <w:r>
+        <w:rPr>
+          <w:lang w:val="en-US"/>
+        </w:rPr>
+        <w:t xml:space="preserve">, </w:t>
+      </w:r>
+      <w:r>
+        <w:rPr>
+          <w:lang w:val="en-US"/>
+        </w:rPr>
+        <w:t>that includes the same worksheet structure as the other control files.</w:t>
+      </w:r>
+    </w:p>
+    <w:p>
+      <w:pPr>
+        <w:rPr>
+          <w:lang w:val="en-US"/>
+        </w:rPr>
+      </w:pPr>
+    </w:p>
+    <w:p>
+      <w:pPr>
+        <w:rPr>
+          <w:lang w:val="en-US"/>
+        </w:rPr>
+      </w:pPr>
+      <w:r>
+        <w:rPr>
+          <w:lang w:val="en-US"/>
+        </w:rPr>
+        <w:t xml:space="preserve">Open the control file and go to the </w:t>
+      </w:r>
+      <w:proofErr w:type="gramStart"/>
+      <w:r>
+        <w:rPr>
+          <w:i/>
+          <w:iCs/>
+          <w:lang w:val="en-US"/>
+        </w:rPr>
+        <w:t>paths</w:t>
+      </w:r>
+      <w:proofErr w:type="gramEnd"/>
+      <w:r>
+        <w:rPr>
+          <w:lang w:val="en-US"/>
+        </w:rPr>
+        <w:t xml:space="preserve"> worksheet.</w:t>
+      </w:r>
+    </w:p>
+    <w:p>
+      <w:pPr>
+        <w:rPr>
+          <w:lang w:val="en-US"/>
+        </w:rPr>
+      </w:pPr>
+    </w:p>
+    <w:p>
+      <w:pPr>
+        <w:rPr>
+          <w:lang w:val="en-US"/>
+        </w:rPr>
+      </w:pPr>
+      <w:r>
+        <w:rPr>
+          <w:lang w:val="en-US"/>
+        </w:rPr>
+        <w:t xml:space="preserve">Specify the paths to the </w:t>
+      </w:r>
+      <w:r>
+        <w:rPr>
+          <w:i/>
+          <w:iCs/>
+          <w:lang w:val="en-US"/>
+        </w:rPr>
+        <w:t>inputs</w:t>
+      </w:r>
+      <w:r>
+        <w:rPr>
+          <w:lang w:val="en-US"/>
+        </w:rPr>
+        <w:t xml:space="preserve"> and </w:t>
+      </w:r>
+      <w:r>
+        <w:rPr>
+          <w:i/>
+          <w:iCs/>
+          <w:lang w:val="en-US"/>
+        </w:rPr>
+        <w:t>outputs</w:t>
+      </w:r>
+      <w:r>
+        <w:rPr>
+          <w:lang w:val="en-US"/>
+        </w:rPr>
+        <w:t xml:space="preserve"> folders in the appropriate cells.</w:t>
+      </w:r>
+      <w:r>
+        <w:rPr>
+          <w:lang w:val="en-US"/>
+        </w:rPr>
+        <w:t xml:space="preserve">  </w:t>
+      </w:r>
+    </w:p>
+    <w:p>
+      <w:pPr>
+        <w:rPr>
+          <w:lang w:val="en-US"/>
+        </w:rPr>
+      </w:pPr>
+    </w:p>
+    <w:p>
+      <w:pPr>
+        <w:rPr>
+          <w:lang w:val="en-US"/>
+        </w:rPr>
+      </w:pPr>
+      <w:r>
+        <w:rPr>
+          <w:lang w:val="en-US"/>
+        </w:rPr>
+        <w:t xml:space="preserve">Go to the </w:t>
+      </w:r>
+      <w:proofErr w:type="gramStart"/>
+      <w:r>
+        <w:rPr>
+          <w:i/>
+          <w:iCs/>
+          <w:lang w:val="en-US"/>
+        </w:rPr>
+        <w:t>datasets</w:t>
+      </w:r>
+      <w:proofErr w:type="gramEnd"/>
+      <w:r>
+        <w:rPr>
+          <w:lang w:val="en-US"/>
+        </w:rPr>
+        <w:t xml:space="preserve"> worksheet.</w:t>
+      </w:r>
+    </w:p>
+    <w:p>
+      <w:pPr>
+        <w:rPr>
+          <w:lang w:val="en-US"/>
+        </w:rPr>
+      </w:pPr>
+    </w:p>
+    <w:p>
+      <w:pPr>
+        <w:rPr>
+          <w:lang w:val="en-US"/>
+        </w:rPr>
+      </w:pPr>
+      <w:r>
+        <w:rPr>
+          <w:lang w:val="en-US"/>
+        </w:rPr>
+        <w:t xml:space="preserve">The file names required for this exercise are listed in </w:t>
+      </w:r>
+      <w:r>
+        <w:rPr>
+          <w:color w:val="FFFF00"/>
+          <w:lang w:val="en-US"/>
+        </w:rPr>
+        <w:t>training_datasets.xlsx</w:t>
+      </w:r>
+      <w:r>
+        <w:rPr>
+          <w:lang w:val="en-US"/>
+        </w:rPr>
+        <w:t>, in the</w:t>
+      </w:r>
+      <w:r>
+        <w:rPr>
+          <w:lang w:val="en-US"/>
+        </w:rPr>
+        <w:t xml:space="preserve"> </w:t>
+      </w:r>
+      <w:proofErr w:type="spellStart"/>
+      <w:r>
+        <w:rPr>
+          <w:i/>
+          <w:iCs/>
+          <w:lang w:val="en-US"/>
+        </w:rPr>
+        <w:t>attributor_combiner</w:t>
+      </w:r>
+      <w:proofErr w:type="spellEnd"/>
+      <w:r>
+        <w:rPr>
+          <w:lang w:val="en-US"/>
+        </w:rPr>
+        <w:t xml:space="preserve"> worksheet. The file names are arranged in the correct order and can be copied directly into the value column of the control file.</w:t>
+      </w:r>
+    </w:p>
+    <w:p>
+      <w:pPr>
+        <w:rPr>
+          <w:lang w:val="en-US"/>
+        </w:rPr>
+      </w:pPr>
+    </w:p>
+    <w:p>
+      <w:pPr>
+        <w:rPr>
+          <w:lang w:val="en-US"/>
+        </w:rPr>
+      </w:pPr>
+      <w:r>
+        <w:rPr>
+          <w:lang w:val="en-US"/>
+        </w:rPr>
+        <w:t xml:space="preserve">Go to the </w:t>
+      </w:r>
+      <w:proofErr w:type="gramStart"/>
+      <w:r>
+        <w:rPr>
+          <w:i/>
+          <w:iCs/>
+          <w:lang w:val="en-US"/>
+        </w:rPr>
+        <w:t>configurations</w:t>
+      </w:r>
+      <w:proofErr w:type="gramEnd"/>
+      <w:r>
+        <w:rPr>
+          <w:lang w:val="en-US"/>
+        </w:rPr>
+        <w:t xml:space="preserve"> worksheet.</w:t>
+      </w:r>
+    </w:p>
+    <w:p>
+      <w:pPr>
+        <w:rPr>
+          <w:lang w:val="en-US"/>
+        </w:rPr>
+      </w:pPr>
+    </w:p>
+    <w:p>
+      <w:pPr>
+        <w:rPr>
+          <w:lang w:val="en-US"/>
+        </w:rPr>
+      </w:pPr>
+      <w:r>
+        <w:rPr>
+          <w:lang w:val="en-US"/>
+        </w:rPr>
+        <w:t xml:space="preserve">For the first run, enable wind by setting the </w:t>
+      </w:r>
+      <w:proofErr w:type="spellStart"/>
+      <w:r>
+        <w:rPr>
+          <w:i/>
+          <w:iCs/>
+          <w:lang w:val="en-US"/>
+        </w:rPr>
+        <w:t>run_code_for_wind</w:t>
+      </w:r>
+      <w:proofErr w:type="spellEnd"/>
+      <w:r>
+        <w:rPr>
+          <w:lang w:val="en-US"/>
+        </w:rPr>
+        <w:t xml:space="preserve"> configuration equal to 1 and disable the other technologies. Enable </w:t>
+      </w:r>
+      <w:proofErr w:type="spellStart"/>
+      <w:r>
+        <w:rPr>
+          <w:i/>
+          <w:iCs/>
+          <w:lang w:val="en-US"/>
+        </w:rPr>
+        <w:t>local_time_profile</w:t>
+      </w:r>
+      <w:proofErr w:type="spellEnd"/>
+      <w:r>
+        <w:rPr>
+          <w:i/>
+          <w:iCs/>
+          <w:lang w:val="en-US"/>
+        </w:rPr>
+        <w:t xml:space="preserve"> </w:t>
+      </w:r>
+      <w:r>
+        <w:rPr>
+          <w:lang w:val="en-US"/>
+        </w:rPr>
+        <w:t>to use the local time profiles that were generated by the Profile Generator.</w:t>
+      </w:r>
+    </w:p>
+    <w:p>
+      <w:pPr>
+        <w:rPr>
+          <w:lang w:val="en-US"/>
+        </w:rPr>
+      </w:pPr>
+    </w:p>
+    <w:p>
+      <w:pPr>
+        <w:rPr>
+          <w:lang w:val="en-US"/>
+        </w:rPr>
+      </w:pPr>
+      <w:r>
+        <w:rPr>
+          <w:lang w:val="en-US"/>
+        </w:rPr>
+        <w:t xml:space="preserve">Go to the </w:t>
+      </w:r>
+      <w:proofErr w:type="gramStart"/>
+      <w:r>
+        <w:rPr>
+          <w:i/>
+          <w:iCs/>
+          <w:lang w:val="en-US"/>
+        </w:rPr>
+        <w:t>parameters</w:t>
+      </w:r>
+      <w:proofErr w:type="gramEnd"/>
+      <w:r>
+        <w:rPr>
+          <w:lang w:val="en-US"/>
+        </w:rPr>
+        <w:t xml:space="preserve"> worksheet.</w:t>
+      </w:r>
+    </w:p>
+    <w:p>
+      <w:pPr>
+        <w:rPr>
+          <w:lang w:val="en-US"/>
+        </w:rPr>
+      </w:pPr>
+    </w:p>
+    <w:p>
+      <w:pPr>
+        <w:rPr>
+          <w:lang w:val="en-US"/>
+        </w:rPr>
+      </w:pPr>
+      <w:r>
+        <w:rPr>
+          <w:lang w:val="en-US"/>
+        </w:rPr>
+        <w:t xml:space="preserve">The parameters required for this exercise are listed in </w:t>
+      </w:r>
+      <w:r>
+        <w:rPr>
+          <w:color w:val="FFFF00"/>
+          <w:lang w:val="en-US"/>
+        </w:rPr>
+        <w:t>training_parameters.xlsx</w:t>
+      </w:r>
+      <w:r>
+        <w:rPr>
+          <w:lang w:val="en-US"/>
+        </w:rPr>
+        <w:t xml:space="preserve">, in the </w:t>
+      </w:r>
+      <w:proofErr w:type="spellStart"/>
+      <w:r>
+        <w:rPr>
+          <w:i/>
+          <w:iCs/>
+          <w:lang w:val="en-US"/>
+        </w:rPr>
+        <w:t>attributor_combiner</w:t>
+      </w:r>
+      <w:proofErr w:type="spellEnd"/>
+      <w:r>
+        <w:rPr>
+          <w:lang w:val="en-US"/>
+        </w:rPr>
+        <w:t xml:space="preserve"> </w:t>
+      </w:r>
+      <w:r>
+        <w:rPr>
+          <w:lang w:val="en-US"/>
+        </w:rPr>
+        <w:t xml:space="preserve">worksheet. The parameters are arranged in the correct order and can be copied directly into the </w:t>
+      </w:r>
+      <w:r>
+        <w:rPr>
+          <w:i/>
+          <w:iCs/>
+          <w:lang w:val="en-US"/>
+        </w:rPr>
+        <w:t>value</w:t>
+      </w:r>
+      <w:r>
+        <w:rPr>
+          <w:lang w:val="en-US"/>
+        </w:rPr>
+        <w:t xml:space="preserve"> column of the control file. Further information on the methodological assumptions is provided in the MSR paper.</w:t>
+      </w:r>
+      <w:r>
+        <w:rPr>
+          <w:lang w:val="en-US"/>
+        </w:rPr>
+        <w:t xml:space="preserve"> Note that the value of elevation threshold should equal to the value from the last MSR Creator run.</w:t>
+      </w:r>
+    </w:p>
+    <w:p>
+      <w:pPr>
+        <w:rPr>
+          <w:lang w:val="en-US"/>
+        </w:rPr>
+      </w:pPr>
+    </w:p>
+    <w:p>
+      <w:pPr>
+        <w:pStyle w:val="Heading3"/>
+        <w:rPr>
+          <w:lang w:val="en-US"/>
+        </w:rPr>
+      </w:pPr>
+      <w:r>
+        <w:rPr>
+          <w:lang w:val="en-US"/>
+        </w:rPr>
+        <w:t>Part 4.3: Running the Attributor C</w:t>
+      </w:r>
+      <w:r>
+        <w:rPr>
+          <w:lang w:val="en-US"/>
+        </w:rPr>
+        <w:t>ombiner for wind</w:t>
+      </w:r>
+    </w:p>
+    <w:p>
+      <w:pPr>
+        <w:rPr>
+          <w:lang w:val="en-US"/>
+        </w:rPr>
+      </w:pPr>
+    </w:p>
+    <w:p>
+      <w:pPr>
+        <w:rPr>
+          <w:lang w:val="en-US"/>
+        </w:rPr>
+      </w:pPr>
+      <w:r>
+        <w:rPr>
+          <w:lang w:val="en-US"/>
+        </w:rPr>
+        <w:t xml:space="preserve">Once the control file </w:t>
+      </w:r>
+      <w:r>
+        <w:rPr>
+          <w:lang w:val="en-US"/>
+        </w:rPr>
+        <w:t>has</w:t>
+      </w:r>
+      <w:r>
+        <w:rPr>
+          <w:lang w:val="en-US"/>
+        </w:rPr>
+        <w:t xml:space="preserve"> been prepared, open a terminal </w:t>
+      </w:r>
+      <w:r>
+        <w:rPr>
+          <w:lang w:val="en-US"/>
+        </w:rPr>
+        <w:t>and n</w:t>
+      </w:r>
+      <w:r>
+        <w:rPr>
+          <w:lang w:val="en-US"/>
+        </w:rPr>
+        <w:t xml:space="preserve">avigate to the </w:t>
+      </w:r>
+      <w:r>
+        <w:rPr>
+          <w:i/>
+          <w:iCs/>
+          <w:lang w:val="en-US"/>
+        </w:rPr>
+        <w:t>3_attributor_combiner</w:t>
+      </w:r>
+      <w:r>
+        <w:rPr>
+          <w:lang w:val="en-US"/>
+        </w:rPr>
+        <w:t xml:space="preserve"> folder and run</w:t>
+      </w:r>
+    </w:p>
+    <w:p>
+      <w:pPr>
+        <w:rPr>
+          <w:lang w:val="en-US"/>
+        </w:rPr>
+      </w:pPr>
+    </w:p>
+    <w:p>
+      <w:pPr>
+        <w:rPr>
+          <w:color w:val="FFC000"/>
+          <w:lang w:val="en-US"/>
+        </w:rPr>
+      </w:pPr>
+      <w:r>
+        <w:rPr>
+          <w:color w:val="FFC000"/>
+          <w:lang w:val="en-US"/>
+        </w:rPr>
+        <w:t xml:space="preserve">python </w:t>
+      </w:r>
+      <w:r>
+        <w:rPr>
+          <w:color w:val="FFC000"/>
+          <w:lang w:val="en-US"/>
+        </w:rPr>
+        <w:t>attributor_combiner</w:t>
+      </w:r>
+      <w:r>
+        <w:rPr>
+          <w:color w:val="FFC000"/>
+          <w:lang w:val="en-US"/>
+        </w:rPr>
+        <w:t>.py</w:t>
+      </w:r>
+    </w:p>
+    <w:p>
+      <w:pPr>
+        <w:rPr>
+          <w:lang w:val="en-US"/>
+        </w:rPr>
+      </w:pPr>
+    </w:p>
+    <w:p>
+      <w:pPr>
+        <w:rPr>
+          <w:lang w:val="en-US"/>
+        </w:rPr>
+      </w:pPr>
+      <w:r>
+        <w:rPr>
+          <w:lang w:val="en-US"/>
+        </w:rPr>
+        <w:t>Follow the log messages in the terminal to monitor the progress of the workflow. The script reports the active region, technology and workflow stage. The run is complete when the message “</w:t>
+      </w:r>
+      <w:r>
+        <w:rPr>
+          <w:lang w:val="en-US"/>
+        </w:rPr>
+        <w:t>Attributor Combiner workflow completed</w:t>
+      </w:r>
+      <w:r>
+        <w:rPr>
+          <w:lang w:val="en-US"/>
+        </w:rPr>
+        <w:t>” appears in the terminal.</w:t>
+      </w:r>
+    </w:p>
+    <w:p>
+      <w:pPr>
+        <w:rPr>
+          <w:lang w:val="en-US"/>
+        </w:rPr>
+      </w:pPr>
+    </w:p>
+    <w:p>
+      <w:pPr>
+        <w:rPr>
+          <w:lang w:val="en-US"/>
+        </w:rPr>
+      </w:pPr>
+      <w:r>
+        <w:rPr>
+          <w:lang w:val="en-US"/>
+        </w:rPr>
+        <w:t xml:space="preserve">The script creates a subfolder for each modelled region in the </w:t>
+      </w:r>
+      <w:r>
+        <w:rPr>
+          <w:i/>
+          <w:iCs/>
+          <w:lang w:val="en-US"/>
+        </w:rPr>
+        <w:t>output</w:t>
+      </w:r>
+      <w:r>
+        <w:rPr>
+          <w:lang w:val="en-US"/>
+        </w:rPr>
+        <w:t xml:space="preserve"> folder. For this exercise, the outputs are stored in the </w:t>
+      </w:r>
+      <w:r>
+        <w:rPr>
+          <w:i/>
+          <w:iCs/>
+          <w:lang w:val="en-US"/>
+        </w:rPr>
+        <w:t>Ecuador</w:t>
+      </w:r>
+      <w:r>
+        <w:rPr>
+          <w:lang w:val="en-US"/>
+        </w:rPr>
+        <w:t xml:space="preserve"> subfolder</w:t>
+      </w:r>
+      <w:r>
+        <w:rPr>
+          <w:lang w:val="en-US"/>
+        </w:rPr>
+        <w:t xml:space="preserve"> where the attributed suitable</w:t>
+      </w:r>
+      <w:r>
+        <w:rPr>
+          <w:lang w:val="en-US"/>
+        </w:rPr>
+        <w:t xml:space="preserve"> wind</w:t>
+      </w:r>
+      <w:r>
+        <w:rPr>
+          <w:lang w:val="en-US"/>
+        </w:rPr>
+        <w:t xml:space="preserve"> MSRs are defined in the </w:t>
+      </w:r>
+      <w:r>
+        <w:rPr>
+          <w:color w:val="FFFF00"/>
+          <w:lang w:val="en-US"/>
+        </w:rPr>
+        <w:t xml:space="preserve">wind_3000_prescreen.shp </w:t>
+      </w:r>
+      <w:r>
+        <w:rPr>
+          <w:lang w:val="en-US"/>
+        </w:rPr>
+        <w:t>shapefile.</w:t>
+      </w:r>
+      <w:r>
+        <w:rPr>
+          <w:lang w:val="en-US"/>
+        </w:rPr>
+        <w:t xml:space="preserve"> </w:t>
+      </w:r>
+      <w:r>
+        <w:rPr>
+          <w:lang w:val="en-US"/>
+        </w:rPr>
+        <w:t xml:space="preserve">The region subfolder also contains summary figures showing the composition of </w:t>
+      </w:r>
+      <w:r>
+        <w:rPr>
+          <w:lang w:val="en-US"/>
+        </w:rPr>
+        <w:t xml:space="preserve">suitable </w:t>
+      </w:r>
+      <w:r>
+        <w:rPr>
+          <w:lang w:val="en-US"/>
+        </w:rPr>
+        <w:t xml:space="preserve">MSR areas by </w:t>
+      </w:r>
+      <w:r>
+        <w:rPr>
+          <w:lang w:val="en-US"/>
+        </w:rPr>
+        <w:t>distance from the grid</w:t>
+      </w:r>
+      <w:r>
+        <w:rPr>
+          <w:lang w:val="en-US"/>
+        </w:rPr>
+        <w:t xml:space="preserve"> (</w:t>
+      </w:r>
+      <w:r>
+        <w:rPr>
+          <w:lang w:val="en-US"/>
+        </w:rPr>
+        <w:fldChar w:fldCharType="begin"/>
+      </w:r>
+      <w:r>
+        <w:rPr>
+          <w:lang w:val="en-US"/>
+        </w:rPr>
+        <w:instrText xml:space="preserve"> REF _Ref235183406 \h </w:instrText>
+      </w:r>
+      <w:r>
+        <w:rPr>
+          <w:lang w:val="en-US"/>
+        </w:rPr>
+      </w:r>
+      <w:r>
+        <w:rPr>
+          <w:lang w:val="en-US"/>
+        </w:rPr>
+        <w:fldChar w:fldCharType="separate"/>
+      </w:r>
+      <w:r>
+        <w:t xml:space="preserve">Figure </w:t>
+      </w:r>
+      <w:r>
+        <w:rPr>
+          <w:noProof/>
+        </w:rPr>
+        <w:t>12</w:t>
+      </w:r>
+      <w:r>
+        <w:rPr>
+          <w:lang w:val="en-US"/>
+        </w:rPr>
+        <w:fldChar w:fldCharType="end"/>
+      </w:r>
+      <w:r>
+        <w:rPr>
+          <w:lang w:val="en-US"/>
+        </w:rPr>
+        <w:t>)</w:t>
+      </w:r>
+      <w:r>
+        <w:rPr>
+          <w:lang w:val="en-US"/>
+        </w:rPr>
+        <w:t>, capacity factor</w:t>
+      </w:r>
+      <w:r>
+        <w:rPr>
+          <w:lang w:val="en-US"/>
+        </w:rPr>
+        <w:t xml:space="preserve"> (</w:t>
+      </w:r>
+      <w:r>
+        <w:rPr>
+          <w:lang w:val="en-US"/>
+        </w:rPr>
+        <w:fldChar w:fldCharType="begin"/>
+      </w:r>
+      <w:r>
+        <w:rPr>
+          <w:lang w:val="en-US"/>
+        </w:rPr>
+        <w:instrText xml:space="preserve"> REF _Ref235183419 \h </w:instrText>
+      </w:r>
+      <w:r>
+        <w:rPr>
+          <w:lang w:val="en-US"/>
+        </w:rPr>
+      </w:r>
+      <w:r>
+        <w:rPr>
+          <w:lang w:val="en-US"/>
+        </w:rPr>
+        <w:fldChar w:fldCharType="separate"/>
+      </w:r>
+      <w:r>
+        <w:t xml:space="preserve">Figure </w:t>
+      </w:r>
+      <w:r>
+        <w:rPr>
+          <w:noProof/>
+        </w:rPr>
+        <w:t>13</w:t>
+      </w:r>
+      <w:r>
+        <w:rPr>
+          <w:lang w:val="en-US"/>
+        </w:rPr>
+        <w:fldChar w:fldCharType="end"/>
+      </w:r>
+      <w:r>
+        <w:rPr>
+          <w:lang w:val="en-US"/>
+        </w:rPr>
+        <w:t>)</w:t>
+      </w:r>
+      <w:r>
+        <w:rPr>
+          <w:lang w:val="en-US"/>
+        </w:rPr>
+        <w:t xml:space="preserve"> and LCOE</w:t>
+      </w:r>
+      <w:r>
+        <w:rPr>
+          <w:lang w:val="en-US"/>
+        </w:rPr>
+        <w:t xml:space="preserve"> (</w:t>
+      </w:r>
+      <w:r>
+        <w:rPr>
+          <w:lang w:val="en-US"/>
+        </w:rPr>
+        <w:fldChar w:fldCharType="begin"/>
+      </w:r>
+      <w:r>
+        <w:rPr>
+          <w:lang w:val="en-US"/>
+        </w:rPr>
+        <w:instrText xml:space="preserve"> REF _Ref235183429 \h </w:instrText>
+      </w:r>
+      <w:r>
+        <w:rPr>
+          <w:lang w:val="en-US"/>
+        </w:rPr>
+      </w:r>
+      <w:r>
+        <w:rPr>
+          <w:lang w:val="en-US"/>
+        </w:rPr>
+        <w:fldChar w:fldCharType="separate"/>
+      </w:r>
+      <w:r>
+        <w:t>Figure 14</w:t>
+      </w:r>
+      <w:r>
+        <w:rPr>
+          <w:lang w:val="en-US"/>
+        </w:rPr>
+        <w:fldChar w:fldCharType="end"/>
+      </w:r>
+      <w:r>
+        <w:rPr>
+          <w:lang w:val="en-US"/>
+        </w:rPr>
+        <w:t>).</w:t>
+      </w:r>
+    </w:p>
+    <w:p>
+      <w:pPr>
+        <w:jc w:val="center"/>
+        <w:rPr>
+          <w:lang w:val="en-US"/>
+        </w:rPr>
+      </w:pPr>
+    </w:p>
+    <w:p>
+      <w:pPr>
+        <w:jc w:val="center"/>
+        <w:rPr>
+          <w:noProof/>
+          <w:lang w:val="en-US"/>
+        </w:rPr>
+      </w:pPr>
+    </w:p>
+    <w:p>
+      <w:pPr>
+        <w:jc w:val="center"/>
+        <w:rPr>
+          <w:lang w:val="en-US"/>
+        </w:rPr>
+      </w:pPr>
+      <w:r>
+        <w:rPr>
+          <w:noProof/>
+          <w:lang w:val="en-US"/>
+        </w:rPr>
+        <w:drawing>
+          <wp:inline distT="0" distB="0" distL="0" distR="0" wp14:anchorId="7F88BA43" wp14:editId="32B608AA">
+            <wp:extent cx="3600000" cy="2393216"/>
+            <wp:effectExtent l="0" t="0" r="635" b="7620"/>
+            <wp:docPr id="1687001287" name="Picture 9"/>
+            <wp:cNvGraphicFramePr>
+              <a:graphicFrameLocks xmlns:a="http://schemas.openxmlformats.org/drawingml/2006/main" noChangeAspect="1"/>
+            </wp:cNvGraphicFramePr>
+            <a:graphic xmlns:a="http://schemas.openxmlformats.org/drawingml/2006/main">
+              <a:graphicData uri="http://schemas.openxmlformats.org/drawingml/2006/picture">
+                <pic:pic xmlns:pic="http://schemas.openxmlformats.org/drawingml/2006/picture">
+                  <pic:nvPicPr>
+                    <pic:cNvPr id="1687001287" name="Picture 1687001287"/>
+                    <pic:cNvPicPr/>
+                  </pic:nvPicPr>
+                  <pic:blipFill>
+                    <a:blip r:embed="rId22" cstate="print">
+                      <a:extLst>
+                        <a:ext uri="{28A0092B-C50C-407E-A947-70E740481C1C}">
+                          <a14:useLocalDpi xmlns:a14="http://schemas.microsoft.com/office/drawing/2010/main" val="0"/>
+                        </a:ext>
+                      </a:extLst>
+                    </a:blip>
+                    <a:stretch>
+                      <a:fillRect/>
+                    </a:stretch>
+                  </pic:blipFill>
+                  <pic:spPr>
+                    <a:xfrm>
+                      <a:off x="0" y="0"/>
+                      <a:ext cx="3600000" cy="2393216"/>
+                    </a:xfrm>
+                    <a:prstGeom prst="rect">
+                      <a:avLst/>
+                    </a:prstGeom>
+                  </pic:spPr>
+                </pic:pic>
+              </a:graphicData>
+            </a:graphic>
+          </wp:inline>
+        </w:drawing>
+      </w:r>
+    </w:p>
+    <w:p>
+      <w:pPr>
+        <w:pStyle w:val="Caption"/>
+        <w:spacing w:before="0"/>
+        <w:jc w:val="center"/>
+        <w:rPr>
+          <w:lang w:val="en-US"/>
+        </w:rPr>
+      </w:pPr>
+      <w:bookmarkStart w:id="12" w:name="_Ref235183406"/>
+      <w:r>
+        <w:t xml:space="preserve">Figure </w:t>
+      </w:r>
+      <w:r>
+        <w:fldChar w:fldCharType="begin"/>
+      </w:r>
+      <w:r>
+        <w:instrText xml:space="preserve"> SEQ Figure \* ARABIC </w:instrText>
+      </w:r>
+      <w:r>
+        <w:fldChar w:fldCharType="separate"/>
+      </w:r>
+      <w:r>
+        <w:rPr>
+          <w:noProof/>
+        </w:rPr>
+        <w:t>12</w:t>
+      </w:r>
+      <w:r>
+        <w:fldChar w:fldCharType="end"/>
+      </w:r>
+      <w:bookmarkEnd w:id="12"/>
+      <w:r>
+        <w:t xml:space="preserve">: Composition of wind </w:t>
+      </w:r>
+      <w:proofErr w:type="spellStart"/>
+      <w:r>
+        <w:t>MSRs</w:t>
+      </w:r>
+      <w:proofErr w:type="spellEnd"/>
+      <w:r>
+        <w:t xml:space="preserve"> by distance to transmission grid (km) in Ecuador.</w:t>
+      </w:r>
+    </w:p>
+    <w:p>
+      <w:pPr>
+        <w:jc w:val="center"/>
+        <w:rPr>
+          <w:lang w:val="en-US"/>
+        </w:rPr>
+      </w:pPr>
+      <w:r>
+        <w:rPr>
+          <w:noProof/>
+          <w:lang w:val="en-US"/>
+        </w:rPr>
+        <w:drawing>
+          <wp:inline distT="0" distB="0" distL="0" distR="0" wp14:anchorId="6DADAE95" wp14:editId="6D460837">
+            <wp:extent cx="3600000" cy="2393216"/>
+            <wp:effectExtent l="0" t="0" r="635" b="7620"/>
+            <wp:docPr id="385515405" name="Picture 3"/>
+            <wp:cNvGraphicFramePr>
+              <a:graphicFrameLocks xmlns:a="http://schemas.openxmlformats.org/drawingml/2006/main" noChangeAspect="1"/>
+            </wp:cNvGraphicFramePr>
+            <a:graphic xmlns:a="http://schemas.openxmlformats.org/drawingml/2006/main">
+              <a:graphicData uri="http://schemas.openxmlformats.org/drawingml/2006/picture">
+                <pic:pic xmlns:pic="http://schemas.openxmlformats.org/drawingml/2006/picture">
+                  <pic:nvPicPr>
+                    <pic:cNvPr id="385515405" name="Picture 385515405"/>
+                    <pic:cNvPicPr/>
+                  </pic:nvPicPr>
+                  <pic:blipFill>
+                    <a:blip r:embed="rId23" cstate="print">
+                      <a:extLst>
+                        <a:ext uri="{28A0092B-C50C-407E-A947-70E740481C1C}">
+                          <a14:useLocalDpi xmlns:a14="http://schemas.microsoft.com/office/drawing/2010/main" val="0"/>
+                        </a:ext>
+                      </a:extLst>
+                    </a:blip>
+                    <a:stretch>
+                      <a:fillRect/>
+                    </a:stretch>
+                  </pic:blipFill>
+                  <pic:spPr>
+                    <a:xfrm>
+                      <a:off x="0" y="0"/>
+                      <a:ext cx="3600000" cy="2393216"/>
+                    </a:xfrm>
+                    <a:prstGeom prst="rect">
+                      <a:avLst/>
+                    </a:prstGeom>
+                  </pic:spPr>
+                </pic:pic>
+              </a:graphicData>
+            </a:graphic>
+          </wp:inline>
+        </w:drawing>
+      </w:r>
+    </w:p>
+    <w:p>
+      <w:pPr>
+        <w:pStyle w:val="Caption"/>
+        <w:spacing w:before="0"/>
+        <w:jc w:val="center"/>
+      </w:pPr>
+      <w:bookmarkStart w:id="13" w:name="_Ref235183419"/>
+      <w:r>
+        <w:t xml:space="preserve">Figure </w:t>
+      </w:r>
+      <w:r>
+        <w:fldChar w:fldCharType="begin"/>
+      </w:r>
+      <w:r>
+        <w:instrText xml:space="preserve"> SEQ Figure \* ARABIC </w:instrText>
+      </w:r>
+      <w:r>
+        <w:fldChar w:fldCharType="separate"/>
+      </w:r>
+      <w:r>
+        <w:rPr>
+          <w:noProof/>
+        </w:rPr>
+        <w:t>13</w:t>
+      </w:r>
+      <w:r>
+        <w:fldChar w:fldCharType="end"/>
+      </w:r>
+      <w:bookmarkEnd w:id="13"/>
+      <w:r>
+        <w:t xml:space="preserve">: Composition of wind </w:t>
+      </w:r>
+      <w:proofErr w:type="spellStart"/>
+      <w:r>
+        <w:t>MSRs</w:t>
+      </w:r>
+      <w:proofErr w:type="spellEnd"/>
+      <w:r>
+        <w:t xml:space="preserve"> by capacity factor (%) in Ecuador.</w:t>
+      </w:r>
+    </w:p>
+    <w:p>
+      <w:pPr>
+        <w:rPr>
+          <w:lang w:val="en-US"/>
+        </w:rPr>
+      </w:pPr>
+    </w:p>
+    <w:p>
+      <w:pPr>
+        <w:jc w:val="center"/>
+        <w:rPr>
+          <w:lang w:val="en-US"/>
+        </w:rPr>
+      </w:pPr>
+      <w:r>
+        <w:rPr>
+          <w:noProof/>
+          <w:lang w:val="en-US"/>
+        </w:rPr>
+        <w:lastRenderedPageBreak/>
+        <w:drawing>
+          <wp:inline distT="0" distB="0" distL="0" distR="0" wp14:anchorId="7A5A4BAA" wp14:editId="7515B0CA">
+            <wp:extent cx="3600000" cy="2291464"/>
+            <wp:effectExtent l="0" t="0" r="635" b="0"/>
+            <wp:docPr id="2039565610" name="Picture 2"/>
+            <wp:cNvGraphicFramePr>
+              <a:graphicFrameLocks xmlns:a="http://schemas.openxmlformats.org/drawingml/2006/main" noChangeAspect="1"/>
+            </wp:cNvGraphicFramePr>
+            <a:graphic xmlns:a="http://schemas.openxmlformats.org/drawingml/2006/main">
+              <a:graphicData uri="http://schemas.openxmlformats.org/drawingml/2006/picture">
+                <pic:pic xmlns:pic="http://schemas.openxmlformats.org/drawingml/2006/picture">
+                  <pic:nvPicPr>
+                    <pic:cNvPr id="2039565610" name="Picture 2039565610"/>
+                    <pic:cNvPicPr/>
+                  </pic:nvPicPr>
+                  <pic:blipFill>
+                    <a:blip r:embed="rId24" cstate="print">
+                      <a:extLst>
+                        <a:ext uri="{28A0092B-C50C-407E-A947-70E740481C1C}">
+                          <a14:useLocalDpi xmlns:a14="http://schemas.microsoft.com/office/drawing/2010/main" val="0"/>
+                        </a:ext>
+                      </a:extLst>
+                    </a:blip>
+                    <a:stretch>
+                      <a:fillRect/>
+                    </a:stretch>
+                  </pic:blipFill>
+                  <pic:spPr>
+                    <a:xfrm>
+                      <a:off x="0" y="0"/>
+                      <a:ext cx="3600000" cy="2291464"/>
+                    </a:xfrm>
+                    <a:prstGeom prst="rect">
+                      <a:avLst/>
+                    </a:prstGeom>
+                  </pic:spPr>
+                </pic:pic>
+              </a:graphicData>
+            </a:graphic>
+          </wp:inline>
+        </w:drawing>
+      </w:r>
+    </w:p>
+    <w:p>
+      <w:pPr>
+        <w:pStyle w:val="Caption"/>
+        <w:spacing w:before="0"/>
+        <w:jc w:val="center"/>
+      </w:pPr>
+      <w:bookmarkStart w:id="14" w:name="_Ref235183429"/>
+      <w:r>
+        <w:t xml:space="preserve">Figure </w:t>
+      </w:r>
+      <w:r>
+        <w:fldChar w:fldCharType="begin"/>
+      </w:r>
+      <w:r>
+        <w:instrText xml:space="preserve"> SEQ Figure \* ARABIC </w:instrText>
+      </w:r>
+      <w:r>
+        <w:fldChar w:fldCharType="separate"/>
+      </w:r>
+      <w:r>
+        <w:rPr>
+          <w:noProof/>
+        </w:rPr>
+        <w:t>14</w:t>
+      </w:r>
+      <w:r>
+        <w:fldChar w:fldCharType="end"/>
+      </w:r>
+      <w:bookmarkEnd w:id="14"/>
+      <w:r>
+        <w:t xml:space="preserve">: Composition of wind </w:t>
+      </w:r>
+      <w:proofErr w:type="spellStart"/>
+      <w:r>
+        <w:t>MSRs</w:t>
+      </w:r>
+      <w:proofErr w:type="spellEnd"/>
+      <w:r>
+        <w:t xml:space="preserve"> by LCOE (USD/MWh) in Ecuador.</w:t>
+      </w:r>
+    </w:p>
+    <w:p>
+      <w:pPr>
+        <w:pStyle w:val="Heading3"/>
+        <w:rPr>
+          <w:lang w:val="en-US"/>
+        </w:rPr>
+      </w:pPr>
+      <w:r>
+        <w:rPr>
+          <w:lang w:val="en-US"/>
+        </w:rPr>
+        <w:t>Part 4.3: Running the Attributor C</w:t>
+      </w:r>
+      <w:r>
+        <w:rPr>
+          <w:lang w:val="en-US"/>
+        </w:rPr>
+        <w:t xml:space="preserve">ombiner for </w:t>
+      </w:r>
+      <w:r>
+        <w:rPr>
+          <w:lang w:val="en-US"/>
+        </w:rPr>
+        <w:t>solar PV</w:t>
+      </w:r>
+    </w:p>
+    <w:p>
+      <w:pPr>
+        <w:rPr>
+          <w:lang w:val="en-US"/>
+        </w:rPr>
+      </w:pPr>
+    </w:p>
+    <w:p>
+      <w:pPr>
+        <w:rPr>
+          <w:lang w:val="en-US"/>
+        </w:rPr>
+      </w:pPr>
+      <w:r>
+        <w:rPr>
+          <w:lang w:val="en-US"/>
+        </w:rPr>
+        <w:t xml:space="preserve">Prepare the control file with the correct settings and run the Attributor Combiner for solar PV. </w:t>
+      </w:r>
+      <w:proofErr w:type="gramStart"/>
+      <w:r>
+        <w:rPr>
+          <w:lang w:val="en-US"/>
+        </w:rPr>
+        <w:t>Similarly</w:t>
+      </w:r>
+      <w:proofErr w:type="gramEnd"/>
+      <w:r>
+        <w:rPr>
+          <w:lang w:val="en-US"/>
+        </w:rPr>
+        <w:t xml:space="preserve"> the </w:t>
+      </w:r>
+      <w:r>
+        <w:rPr>
+          <w:lang w:val="en-US"/>
+        </w:rPr>
+        <w:t xml:space="preserve">summary figures showing the composition of suitable </w:t>
+      </w:r>
+      <w:r>
+        <w:rPr>
+          <w:lang w:val="en-US"/>
+        </w:rPr>
+        <w:t xml:space="preserve">solar PV </w:t>
+      </w:r>
+      <w:r>
+        <w:rPr>
+          <w:lang w:val="en-US"/>
+        </w:rPr>
+        <w:t>MSR areas by distance from the grid (</w:t>
+      </w:r>
+      <w:r>
+        <w:rPr>
+          <w:lang w:val="en-US"/>
+        </w:rPr>
+        <w:fldChar w:fldCharType="begin"/>
+      </w:r>
+      <w:r>
+        <w:rPr>
+          <w:lang w:val="en-US"/>
+        </w:rPr>
+        <w:instrText xml:space="preserve"> REF _Ref235187310 \h </w:instrText>
+      </w:r>
+      <w:r>
+        <w:rPr>
+          <w:lang w:val="en-US"/>
+        </w:rPr>
+      </w:r>
+      <w:r>
+        <w:rPr>
+          <w:lang w:val="en-US"/>
+        </w:rPr>
+        <w:fldChar w:fldCharType="separate"/>
+      </w:r>
+      <w:r>
+        <w:t xml:space="preserve">Figure </w:t>
+      </w:r>
+      <w:r>
+        <w:rPr>
+          <w:noProof/>
+        </w:rPr>
+        <w:t>15</w:t>
+      </w:r>
+      <w:r>
+        <w:rPr>
+          <w:lang w:val="en-US"/>
+        </w:rPr>
+        <w:fldChar w:fldCharType="end"/>
+      </w:r>
+      <w:r>
+        <w:rPr>
+          <w:lang w:val="en-US"/>
+        </w:rPr>
+        <w:t>), capacity factor (</w:t>
+      </w:r>
+      <w:r>
+        <w:rPr>
+          <w:lang w:val="en-US"/>
+        </w:rPr>
+        <w:fldChar w:fldCharType="begin"/>
+      </w:r>
+      <w:r>
+        <w:rPr>
+          <w:lang w:val="en-US"/>
+        </w:rPr>
+        <w:instrText xml:space="preserve"> REF _Ref235187303 \h </w:instrText>
+      </w:r>
+      <w:r>
+        <w:rPr>
+          <w:lang w:val="en-US"/>
+        </w:rPr>
+      </w:r>
+      <w:r>
+        <w:rPr>
+          <w:lang w:val="en-US"/>
+        </w:rPr>
+        <w:fldChar w:fldCharType="separate"/>
+      </w:r>
+      <w:r>
+        <w:t xml:space="preserve">Figure </w:t>
+      </w:r>
+      <w:r>
+        <w:rPr>
+          <w:noProof/>
+        </w:rPr>
+        <w:t>16</w:t>
+      </w:r>
+      <w:r>
+        <w:rPr>
+          <w:lang w:val="en-US"/>
+        </w:rPr>
+        <w:fldChar w:fldCharType="end"/>
+      </w:r>
+      <w:r>
+        <w:rPr>
+          <w:lang w:val="en-US"/>
+        </w:rPr>
+        <w:t>) and LCOE (</w:t>
+      </w:r>
+      <w:r>
+        <w:rPr>
+          <w:lang w:val="en-US"/>
+        </w:rPr>
+        <w:fldChar w:fldCharType="begin"/>
+      </w:r>
+      <w:r>
+        <w:rPr>
+          <w:lang w:val="en-US"/>
+        </w:rPr>
+        <w:instrText xml:space="preserve"> REF _Ref235187295 \h </w:instrText>
+      </w:r>
+      <w:r>
+        <w:rPr>
+          <w:lang w:val="en-US"/>
+        </w:rPr>
+      </w:r>
+      <w:r>
+        <w:rPr>
+          <w:lang w:val="en-US"/>
+        </w:rPr>
+        <w:fldChar w:fldCharType="separate"/>
+      </w:r>
+      <w:r>
+        <w:t xml:space="preserve">Figure </w:t>
+      </w:r>
+      <w:r>
+        <w:rPr>
+          <w:noProof/>
+        </w:rPr>
+        <w:t>17</w:t>
+      </w:r>
+      <w:r>
+        <w:rPr>
+          <w:lang w:val="en-US"/>
+        </w:rPr>
+        <w:fldChar w:fldCharType="end"/>
+      </w:r>
+      <w:r>
+        <w:rPr>
+          <w:lang w:val="en-US"/>
+        </w:rPr>
+        <w:t>).</w:t>
+      </w:r>
+      <w:r>
+        <w:rPr>
+          <w:lang w:val="en-US"/>
+        </w:rPr>
+        <w:t xml:space="preserve"> We can also investigate how the attributes compositions </w:t>
+      </w:r>
+      <w:proofErr w:type="gramStart"/>
+      <w:r>
+        <w:rPr>
+          <w:lang w:val="en-US"/>
+        </w:rPr>
+        <w:t>is</w:t>
+      </w:r>
+      <w:proofErr w:type="gramEnd"/>
+      <w:r>
+        <w:rPr>
+          <w:lang w:val="en-US"/>
+        </w:rPr>
+        <w:t xml:space="preserve"> distributed spatially across the country using the created shapefile in QGIS (</w:t>
+      </w:r>
+      <w:r>
+        <w:rPr>
+          <w:lang w:val="en-US"/>
+        </w:rPr>
+        <w:fldChar w:fldCharType="begin"/>
+      </w:r>
+      <w:r>
+        <w:rPr>
+          <w:lang w:val="en-US"/>
+        </w:rPr>
+        <w:instrText xml:space="preserve"> REF _Ref235188012 \h </w:instrText>
+      </w:r>
+      <w:r>
+        <w:rPr>
+          <w:lang w:val="en-US"/>
+        </w:rPr>
+      </w:r>
+      <w:r>
+        <w:rPr>
+          <w:lang w:val="en-US"/>
+        </w:rPr>
+        <w:fldChar w:fldCharType="separate"/>
+      </w:r>
+      <w:r>
+        <w:t xml:space="preserve">Figure </w:t>
+      </w:r>
+      <w:r>
+        <w:rPr>
+          <w:noProof/>
+        </w:rPr>
+        <w:t>18</w:t>
+      </w:r>
+      <w:r>
+        <w:rPr>
+          <w:lang w:val="en-US"/>
+        </w:rPr>
+        <w:fldChar w:fldCharType="end"/>
+      </w:r>
+      <w:r>
+        <w:rPr>
+          <w:lang w:val="en-US"/>
+        </w:rPr>
+        <w:t>).</w:t>
+      </w:r>
+    </w:p>
+    <w:p>
+      <w:pPr>
+        <w:rPr>
+          <w:lang w:val="en-US"/>
+        </w:rPr>
+      </w:pPr>
+    </w:p>
+    <w:p>
+      <w:pPr>
+        <w:jc w:val="center"/>
+        <w:rPr>
+          <w:lang w:val="en-US"/>
+        </w:rPr>
+      </w:pPr>
+      <w:r>
+        <w:rPr>
+          <w:noProof/>
+          <w:lang w:val="en-US"/>
+        </w:rPr>
+        <w:drawing>
+          <wp:inline distT="0" distB="0" distL="0" distR="0" wp14:anchorId="761CB044" wp14:editId="1E52E5C9">
+            <wp:extent cx="3600000" cy="2291464"/>
+            <wp:effectExtent l="0" t="0" r="635" b="0"/>
+            <wp:docPr id="587817395" name="Picture 5"/>
+            <wp:cNvGraphicFramePr>
+              <a:graphicFrameLocks xmlns:a="http://schemas.openxmlformats.org/drawingml/2006/main" noChangeAspect="1"/>
+            </wp:cNvGraphicFramePr>
+            <a:graphic xmlns:a="http://schemas.openxmlformats.org/drawingml/2006/main">
+              <a:graphicData uri="http://schemas.openxmlformats.org/drawingml/2006/picture">
+                <pic:pic xmlns:pic="http://schemas.openxmlformats.org/drawingml/2006/picture">
+                  <pic:nvPicPr>
+                    <pic:cNvPr id="587817395" name="Picture 587817395"/>
+                    <pic:cNvPicPr/>
+                  </pic:nvPicPr>
+                  <pic:blipFill>
+                    <a:blip r:embed="rId25" cstate="print">
+                      <a:extLst>
+                        <a:ext uri="{28A0092B-C50C-407E-A947-70E740481C1C}">
+                          <a14:useLocalDpi xmlns:a14="http://schemas.microsoft.com/office/drawing/2010/main" val="0"/>
+                        </a:ext>
+                      </a:extLst>
+                    </a:blip>
+                    <a:stretch>
+                      <a:fillRect/>
+                    </a:stretch>
+                  </pic:blipFill>
+                  <pic:spPr>
+                    <a:xfrm>
+                      <a:off x="0" y="0"/>
+                      <a:ext cx="3600000" cy="2291464"/>
+                    </a:xfrm>
+                    <a:prstGeom prst="rect">
+                      <a:avLst/>
+                    </a:prstGeom>
+                  </pic:spPr>
+                </pic:pic>
+              </a:graphicData>
+            </a:graphic>
+          </wp:inline>
+        </w:drawing>
+      </w:r>
+    </w:p>
+    <w:p>
+      <w:pPr>
+        <w:pStyle w:val="Caption"/>
+        <w:spacing w:before="0"/>
+        <w:jc w:val="center"/>
+        <w:rPr>
+          <w:lang w:val="en-US"/>
+        </w:rPr>
+      </w:pPr>
+      <w:bookmarkStart w:id="15" w:name="_Ref235187310"/>
+      <w:r>
+        <w:t xml:space="preserve">Figure </w:t>
+      </w:r>
+      <w:r>
+        <w:fldChar w:fldCharType="begin"/>
+      </w:r>
+      <w:r>
+        <w:instrText xml:space="preserve"> SEQ Figure \* ARABIC </w:instrText>
+      </w:r>
+      <w:r>
+        <w:fldChar w:fldCharType="separate"/>
+      </w:r>
+      <w:r>
+        <w:rPr>
+          <w:noProof/>
+        </w:rPr>
+        <w:t>15</w:t>
+      </w:r>
+      <w:r>
+        <w:fldChar w:fldCharType="end"/>
+      </w:r>
+      <w:bookmarkEnd w:id="15"/>
+      <w:r>
+        <w:t xml:space="preserve">: </w:t>
+      </w:r>
+      <w:r>
+        <w:t xml:space="preserve">Composition of </w:t>
+      </w:r>
+      <w:r>
+        <w:t>solar PV</w:t>
+      </w:r>
+      <w:r>
+        <w:t xml:space="preserve"> </w:t>
+      </w:r>
+      <w:proofErr w:type="spellStart"/>
+      <w:r>
+        <w:t>MSRs</w:t>
+      </w:r>
+      <w:proofErr w:type="spellEnd"/>
+      <w:r>
+        <w:t xml:space="preserve"> by distance to transmission grid (km) in Ecuador.</w:t>
+      </w:r>
+    </w:p>
+    <w:p>
+      <w:pPr>
+        <w:jc w:val="center"/>
+        <w:rPr>
+          <w:lang w:val="en-US"/>
+        </w:rPr>
+      </w:pPr>
+      <w:r>
+        <w:rPr>
+          <w:noProof/>
+          <w:lang w:val="en-US"/>
+        </w:rPr>
+        <w:lastRenderedPageBreak/>
+        <w:drawing>
+          <wp:inline distT="0" distB="0" distL="0" distR="0" wp14:anchorId="313EB970" wp14:editId="5C575B35">
+            <wp:extent cx="3600000" cy="2393216"/>
+            <wp:effectExtent l="0" t="0" r="635" b="7620"/>
+            <wp:docPr id="1742591669" name="Picture 8"/>
+            <wp:cNvGraphicFramePr>
+              <a:graphicFrameLocks xmlns:a="http://schemas.openxmlformats.org/drawingml/2006/main" noChangeAspect="1"/>
+            </wp:cNvGraphicFramePr>
+            <a:graphic xmlns:a="http://schemas.openxmlformats.org/drawingml/2006/main">
+              <a:graphicData uri="http://schemas.openxmlformats.org/drawingml/2006/picture">
+                <pic:pic xmlns:pic="http://schemas.openxmlformats.org/drawingml/2006/picture">
+                  <pic:nvPicPr>
+                    <pic:cNvPr id="1742591669" name="Picture 1742591669"/>
+                    <pic:cNvPicPr/>
+                  </pic:nvPicPr>
+                  <pic:blipFill>
+                    <a:blip r:embed="rId26" cstate="print">
+                      <a:extLst>
+                        <a:ext uri="{28A0092B-C50C-407E-A947-70E740481C1C}">
+                          <a14:useLocalDpi xmlns:a14="http://schemas.microsoft.com/office/drawing/2010/main" val="0"/>
+                        </a:ext>
+                      </a:extLst>
+                    </a:blip>
+                    <a:stretch>
+                      <a:fillRect/>
+                    </a:stretch>
+                  </pic:blipFill>
+                  <pic:spPr>
+                    <a:xfrm>
+                      <a:off x="0" y="0"/>
+                      <a:ext cx="3600000" cy="2393216"/>
+                    </a:xfrm>
+                    <a:prstGeom prst="rect">
+                      <a:avLst/>
+                    </a:prstGeom>
+                  </pic:spPr>
+                </pic:pic>
+              </a:graphicData>
+            </a:graphic>
+          </wp:inline>
+        </w:drawing>
+      </w:r>
+    </w:p>
+    <w:p>
+      <w:pPr>
+        <w:pStyle w:val="Caption"/>
+        <w:spacing w:before="0"/>
+        <w:jc w:val="center"/>
+        <w:rPr>
+          <w:lang w:val="en-US"/>
+        </w:rPr>
+      </w:pPr>
+      <w:bookmarkStart w:id="16" w:name="_Ref235187303"/>
+      <w:r>
+        <w:t xml:space="preserve">Figure </w:t>
+      </w:r>
+      <w:r>
+        <w:fldChar w:fldCharType="begin"/>
+      </w:r>
+      <w:r>
+        <w:instrText xml:space="preserve"> SEQ Figure \* ARABIC </w:instrText>
+      </w:r>
+      <w:r>
+        <w:fldChar w:fldCharType="separate"/>
+      </w:r>
+      <w:r>
+        <w:rPr>
+          <w:noProof/>
+        </w:rPr>
+        <w:t>16</w:t>
+      </w:r>
+      <w:r>
+        <w:fldChar w:fldCharType="end"/>
+      </w:r>
+      <w:bookmarkEnd w:id="16"/>
+      <w:r>
+        <w:t xml:space="preserve">: </w:t>
+      </w:r>
+      <w:r>
+        <w:t xml:space="preserve">Composition of </w:t>
+      </w:r>
+      <w:r>
+        <w:t>solar PV</w:t>
+      </w:r>
+      <w:r>
+        <w:t xml:space="preserve"> </w:t>
+      </w:r>
+      <w:proofErr w:type="spellStart"/>
+      <w:r>
+        <w:t>MSRs</w:t>
+      </w:r>
+      <w:proofErr w:type="spellEnd"/>
+      <w:r>
+        <w:t xml:space="preserve"> by capacity factor (%) in Ecuador.</w:t>
+      </w:r>
+    </w:p>
+    <w:p>
+      <w:pPr>
+        <w:jc w:val="center"/>
+        <w:rPr>
+          <w:lang w:val="en-US"/>
+        </w:rPr>
+      </w:pPr>
+      <w:r>
+        <w:rPr>
+          <w:noProof/>
+          <w:lang w:val="en-US"/>
+        </w:rPr>
+        <w:drawing>
+          <wp:inline distT="0" distB="0" distL="0" distR="0" wp14:anchorId="65186EF4" wp14:editId="62045C57">
+            <wp:extent cx="3600000" cy="2393216"/>
+            <wp:effectExtent l="0" t="0" r="635" b="7620"/>
+            <wp:docPr id="1826305937" name="Picture 7"/>
+            <wp:cNvGraphicFramePr>
+              <a:graphicFrameLocks xmlns:a="http://schemas.openxmlformats.org/drawingml/2006/main" noChangeAspect="1"/>
+            </wp:cNvGraphicFramePr>
+            <a:graphic xmlns:a="http://schemas.openxmlformats.org/drawingml/2006/main">
+              <a:graphicData uri="http://schemas.openxmlformats.org/drawingml/2006/picture">
+                <pic:pic xmlns:pic="http://schemas.openxmlformats.org/drawingml/2006/picture">
+                  <pic:nvPicPr>
+                    <pic:cNvPr id="1826305937" name="Picture 1826305937"/>
+                    <pic:cNvPicPr/>
+                  </pic:nvPicPr>
+                  <pic:blipFill>
+                    <a:blip r:embed="rId27" cstate="print">
+                      <a:extLst>
+                        <a:ext uri="{28A0092B-C50C-407E-A947-70E740481C1C}">
+                          <a14:useLocalDpi xmlns:a14="http://schemas.microsoft.com/office/drawing/2010/main" val="0"/>
+                        </a:ext>
+                      </a:extLst>
+                    </a:blip>
+                    <a:stretch>
+                      <a:fillRect/>
+                    </a:stretch>
+                  </pic:blipFill>
+                  <pic:spPr>
+                    <a:xfrm>
+                      <a:off x="0" y="0"/>
+                      <a:ext cx="3600000" cy="2393216"/>
+                    </a:xfrm>
+                    <a:prstGeom prst="rect">
+                      <a:avLst/>
+                    </a:prstGeom>
+                  </pic:spPr>
+                </pic:pic>
+              </a:graphicData>
+            </a:graphic>
+          </wp:inline>
+        </w:drawing>
+      </w:r>
+    </w:p>
+    <w:p>
+      <w:pPr>
+        <w:pStyle w:val="Caption"/>
+        <w:spacing w:before="0"/>
+        <w:jc w:val="center"/>
+        <w:rPr>
+          <w:lang w:val="en-US"/>
+        </w:rPr>
+      </w:pPr>
+      <w:bookmarkStart w:id="17" w:name="_Ref235187295"/>
+      <w:r>
+        <w:t xml:space="preserve">Figure </w:t>
+      </w:r>
+      <w:r>
+        <w:fldChar w:fldCharType="begin"/>
+      </w:r>
+      <w:r>
+        <w:instrText xml:space="preserve"> SEQ Figure \* ARABIC </w:instrText>
+      </w:r>
+      <w:r>
+        <w:fldChar w:fldCharType="separate"/>
+      </w:r>
+      <w:r>
+        <w:rPr>
+          <w:noProof/>
+        </w:rPr>
+        <w:t>17</w:t>
+      </w:r>
+      <w:r>
+        <w:fldChar w:fldCharType="end"/>
+      </w:r>
+      <w:bookmarkEnd w:id="17"/>
+      <w:r>
+        <w:t>:</w:t>
+      </w:r>
+      <w:r>
+        <w:t xml:space="preserve"> </w:t>
+      </w:r>
+      <w:r>
+        <w:t xml:space="preserve">Composition of </w:t>
+      </w:r>
+      <w:r>
+        <w:t>solar PV</w:t>
+      </w:r>
+      <w:r>
+        <w:t xml:space="preserve"> M</w:t>
+      </w:r>
+      <w:proofErr w:type="spellStart"/>
+      <w:r>
+        <w:t>SRs</w:t>
+      </w:r>
+      <w:proofErr w:type="spellEnd"/>
+      <w:r>
+        <w:t xml:space="preserve"> by LCOE (USD/MWh) in Ecuador.</w:t>
+      </w:r>
+    </w:p>
+    <w:p>
+      <w:pPr>
+        <w:jc w:val="center"/>
+        <w:rPr>
+          <w:lang w:val="en-US"/>
+        </w:rPr>
+      </w:pPr>
+      <w:r>
+        <w:rPr>
+          <w:noProof/>
+          <w:lang w:val="en-US"/>
+        </w:rPr>
+        <w:drawing>
+          <wp:inline distT="0" distB="0" distL="0" distR="0" wp14:anchorId="48B52EA6" wp14:editId="19DB2A19">
+            <wp:extent cx="1691232" cy="1440000"/>
+            <wp:effectExtent l="0" t="0" r="4445" b="8255"/>
+            <wp:docPr id="1764830010" name="Picture 10"/>
+            <wp:cNvGraphicFramePr>
+              <a:graphicFrameLocks xmlns:a="http://schemas.openxmlformats.org/drawingml/2006/main" noChangeAspect="1"/>
+            </wp:cNvGraphicFramePr>
+            <a:graphic xmlns:a="http://schemas.openxmlformats.org/drawingml/2006/main">
+              <a:graphicData uri="http://schemas.openxmlformats.org/drawingml/2006/picture">
+                <pic:pic xmlns:pic="http://schemas.openxmlformats.org/drawingml/2006/picture">
+                  <pic:nvPicPr>
+                    <pic:cNvPr id="1764830010" name="Picture 1764830010"/>
+                    <pic:cNvPicPr/>
+                  </pic:nvPicPr>
+                  <pic:blipFill rotWithShape="1">
+                    <a:blip r:embed="rId28" cstate="print">
+                      <a:extLst>
+                        <a:ext uri="{28A0092B-C50C-407E-A947-70E740481C1C}">
+                          <a14:useLocalDpi xmlns:a14="http://schemas.microsoft.com/office/drawing/2010/main" val="0"/>
+                        </a:ext>
+                      </a:extLst>
+                    </a:blip>
+                    <a:srcRect l="17541" t="20461" r="27761" b="13683"/>
+                    <a:stretch>
+                      <a:fillRect/>
+                    </a:stretch>
+                  </pic:blipFill>
+                  <pic:spPr bwMode="auto">
+                    <a:xfrm>
+                      <a:off x="0" y="0"/>
+                      <a:ext cx="1691232" cy="1440000"/>
+                    </a:xfrm>
+                    <a:prstGeom prst="rect">
+                      <a:avLst/>
+                    </a:prstGeom>
+                    <a:ln>
+                      <a:noFill/>
+                    </a:ln>
+                    <a:extLst>
+                      <a:ext uri="{53640926-AAD7-44D8-BBD7-CCE9431645EC}">
+                        <a14:shadowObscured xmlns:a14="http://schemas.microsoft.com/office/drawing/2010/main"/>
+                      </a:ext>
+                    </a:extLst>
+                  </pic:spPr>
+                </pic:pic>
+              </a:graphicData>
+            </a:graphic>
+          </wp:inline>
+        </w:drawing>
+      </w:r>
+      <w:r>
+        <w:rPr>
+          <w:noProof/>
+          <w:lang w:val="en-US"/>
+        </w:rPr>
+        <w:drawing>
+          <wp:inline distT="0" distB="0" distL="0" distR="0" wp14:anchorId="08FAD4D9" wp14:editId="35D7260A">
+            <wp:extent cx="1666414" cy="1440000"/>
+            <wp:effectExtent l="0" t="0" r="0" b="8255"/>
+            <wp:docPr id="628174700" name="Picture 11"/>
+            <wp:cNvGraphicFramePr>
+              <a:graphicFrameLocks xmlns:a="http://schemas.openxmlformats.org/drawingml/2006/main" noChangeAspect="1"/>
+            </wp:cNvGraphicFramePr>
+            <a:graphic xmlns:a="http://schemas.openxmlformats.org/drawingml/2006/main">
+              <a:graphicData uri="http://schemas.openxmlformats.org/drawingml/2006/picture">
+                <pic:pic xmlns:pic="http://schemas.openxmlformats.org/drawingml/2006/picture">
+                  <pic:nvPicPr>
+                    <pic:cNvPr id="628174700" name="Picture 628174700"/>
+                    <pic:cNvPicPr/>
+                  </pic:nvPicPr>
+                  <pic:blipFill rotWithShape="1">
+                    <a:blip r:embed="rId29" cstate="print">
+                      <a:extLst>
+                        <a:ext uri="{28A0092B-C50C-407E-A947-70E740481C1C}">
+                          <a14:useLocalDpi xmlns:a14="http://schemas.microsoft.com/office/drawing/2010/main" val="0"/>
+                        </a:ext>
+                      </a:extLst>
+                    </a:blip>
+                    <a:srcRect l="17739" t="20458" r="27563" b="12703"/>
+                    <a:stretch>
+                      <a:fillRect/>
+                    </a:stretch>
+                  </pic:blipFill>
+                  <pic:spPr bwMode="auto">
+                    <a:xfrm>
+                      <a:off x="0" y="0"/>
+                      <a:ext cx="1666414" cy="1440000"/>
+                    </a:xfrm>
+                    <a:prstGeom prst="rect">
+                      <a:avLst/>
+                    </a:prstGeom>
+                    <a:ln>
+                      <a:noFill/>
+                    </a:ln>
+                    <a:extLst>
+                      <a:ext uri="{53640926-AAD7-44D8-BBD7-CCE9431645EC}">
+                        <a14:shadowObscured xmlns:a14="http://schemas.microsoft.com/office/drawing/2010/main"/>
+                      </a:ext>
+                    </a:extLst>
+                  </pic:spPr>
+                </pic:pic>
+              </a:graphicData>
+            </a:graphic>
+          </wp:inline>
+        </w:drawing>
+      </w:r>
+      <w:r>
+        <w:rPr>
+          <w:noProof/>
+          <w:lang w:val="en-US"/>
+        </w:rPr>
+        <w:drawing>
+          <wp:inline distT="0" distB="0" distL="0" distR="0" wp14:anchorId="7FA97674" wp14:editId="10CD7A3D">
+            <wp:extent cx="1687023" cy="1440000"/>
+            <wp:effectExtent l="0" t="0" r="8890" b="8255"/>
+            <wp:docPr id="1423278724" name="Picture 12"/>
+            <wp:cNvGraphicFramePr>
+              <a:graphicFrameLocks xmlns:a="http://schemas.openxmlformats.org/drawingml/2006/main" noChangeAspect="1"/>
+            </wp:cNvGraphicFramePr>
+            <a:graphic xmlns:a="http://schemas.openxmlformats.org/drawingml/2006/main">
+              <a:graphicData uri="http://schemas.openxmlformats.org/drawingml/2006/picture">
+                <pic:pic xmlns:pic="http://schemas.openxmlformats.org/drawingml/2006/picture">
+                  <pic:nvPicPr>
+                    <pic:cNvPr id="1423278724" name="Picture 1423278724"/>
+                    <pic:cNvPicPr/>
+                  </pic:nvPicPr>
+                  <pic:blipFill rotWithShape="1">
+                    <a:blip r:embed="rId30" cstate="print">
+                      <a:extLst>
+                        <a:ext uri="{28A0092B-C50C-407E-A947-70E740481C1C}">
+                          <a14:useLocalDpi xmlns:a14="http://schemas.microsoft.com/office/drawing/2010/main" val="0"/>
+                        </a:ext>
+                      </a:extLst>
+                    </a:blip>
+                    <a:srcRect l="17441" t="20598" r="27761" b="13260"/>
+                    <a:stretch>
+                      <a:fillRect/>
+                    </a:stretch>
+                  </pic:blipFill>
+                  <pic:spPr bwMode="auto">
+                    <a:xfrm>
+                      <a:off x="0" y="0"/>
+                      <a:ext cx="1687023" cy="1440000"/>
+                    </a:xfrm>
+                    <a:prstGeom prst="rect">
+                      <a:avLst/>
+                    </a:prstGeom>
+                    <a:ln>
+                      <a:noFill/>
+                    </a:ln>
+                    <a:extLst>
+                      <a:ext uri="{53640926-AAD7-44D8-BBD7-CCE9431645EC}">
+                        <a14:shadowObscured xmlns:a14="http://schemas.microsoft.com/office/drawing/2010/main"/>
+                      </a:ext>
+                    </a:extLst>
+                  </pic:spPr>
+                </pic:pic>
+              </a:graphicData>
+            </a:graphic>
+          </wp:inline>
+        </w:drawing>
+      </w:r>
+    </w:p>
+    <w:p>
+      <w:pPr>
+        <w:pStyle w:val="Caption"/>
+        <w:spacing w:before="0"/>
+        <w:jc w:val="center"/>
+        <w:rPr>
+          <w:lang w:val="en-US"/>
+        </w:rPr>
+      </w:pPr>
+      <w:bookmarkStart w:id="18" w:name="_Ref235188012"/>
+      <w:r>
+        <w:t xml:space="preserve">Figure </w:t>
+      </w:r>
       <w:fldSimple w:instr=" SEQ Figure \* ARABIC ">
         <w:r>
           <w:rPr>
             <w:noProof/>
           </w:rPr>
-          <w:t>11</w:t>
+          <w:t>18</w:t>
         </w:r>
       </w:fldSimple>
-      <w:r>
-        <w:t xml:space="preserve">: </w:t>
-      </w:r>
-      <w:r>
-        <w:t xml:space="preserve">Solar PV </w:t>
+      <w:bookmarkEnd w:id="18"/>
+      <w:r>
+        <w:t xml:space="preserve">: Spatial distribution of a) grid distance (km), b) capacity factor (%) and c) LCOE (USD/MWh) composition of solar PV </w:t>
       </w:r>
       <w:proofErr w:type="spellStart"/>
       <w:r>
@@ -6503,13 +9097,6 @@
     </w:p>
     <w:p>
       <w:pPr>
-        <w:rPr>
-          <w:lang w:val="en-US"/>
-        </w:rPr>
-      </w:pPr>
-    </w:p>
-    <w:p>
-      <w:pPr>
         <w:pStyle w:val="Heading2"/>
         <w:rPr>
           <w:lang w:val="en-US"/>
@@ -6519,147 +9106,103 @@
         <w:rPr>
           <w:lang w:val="en-US"/>
         </w:rPr>
-        <w:t xml:space="preserve">Part </w:t>
-      </w:r>
-      <w:r>
-        <w:rPr>
-          <w:lang w:val="en-US"/>
-        </w:rPr>
-        <w:t>3</w:t>
-      </w:r>
-      <w:r>
-        <w:rPr>
-          <w:lang w:val="en-US"/>
-        </w:rPr>
-        <w:t xml:space="preserve">: </w:t>
-      </w:r>
-      <w:r>
-        <w:rPr>
-          <w:lang w:val="en-US"/>
-        </w:rPr>
-        <w:t>Profile Generator</w:t>
-      </w:r>
-    </w:p>
-    <w:p>
-      <w:pPr>
-        <w:rPr>
-          <w:lang w:val="en-US"/>
-        </w:rPr>
-      </w:pPr>
-    </w:p>
-    <w:p>
-      <w:pPr>
-        <w:pStyle w:val="ListParagraph"/>
-        <w:numPr>
-          <w:ilvl w:val="0"/>
-          <w:numId w:val="6"/>
-        </w:numPr>
-        <w:rPr>
-          <w:lang w:val="en-US"/>
-        </w:rPr>
-      </w:pPr>
-      <w:r>
-        <w:rPr>
-          <w:lang w:val="en-US"/>
-        </w:rPr>
-        <w:t xml:space="preserve">Plot </w:t>
-      </w:r>
-      <w:r>
-        <w:rPr>
-          <w:lang w:val="en-US"/>
-        </w:rPr>
-        <w:t>duration curves.</w:t>
-      </w:r>
-    </w:p>
-    <w:p>
-      <w:pPr>
-        <w:pStyle w:val="ListParagraph"/>
-        <w:numPr>
-          <w:ilvl w:val="0"/>
-          <w:numId w:val="6"/>
-        </w:numPr>
-        <w:rPr>
-          <w:lang w:val="en-US"/>
-        </w:rPr>
-      </w:pPr>
-      <w:r>
-        <w:rPr>
-          <w:lang w:val="en-US"/>
-        </w:rPr>
-        <w:t>Plot</w:t>
-      </w:r>
-      <w:r>
-        <w:rPr>
-          <w:lang w:val="en-US"/>
-        </w:rPr>
-        <w:t xml:space="preserve"> frequency</w:t>
-      </w:r>
-      <w:r>
-        <w:rPr>
-          <w:lang w:val="en-US"/>
-        </w:rPr>
-        <w:t xml:space="preserve"> distribution</w:t>
-      </w:r>
-      <w:r>
-        <w:rPr>
-          <w:lang w:val="en-US"/>
-        </w:rPr>
-        <w:t>.</w:t>
-      </w:r>
-    </w:p>
-    <w:p>
-      <w:pPr>
-        <w:pStyle w:val="ListParagraph"/>
-        <w:numPr>
-          <w:ilvl w:val="0"/>
-          <w:numId w:val="6"/>
-        </w:numPr>
-        <w:rPr>
-          <w:lang w:val="en-US"/>
-        </w:rPr>
-      </w:pPr>
-      <w:r>
-        <w:rPr>
-          <w:lang w:val="en-US"/>
-        </w:rPr>
-        <w:t xml:space="preserve">Plot </w:t>
-      </w:r>
-      <w:r>
-        <w:rPr>
-          <w:lang w:val="en-US"/>
-        </w:rPr>
-        <w:t>daily and seasonal profile.</w:t>
-      </w:r>
-    </w:p>
-    <w:p>
-      <w:pPr>
-        <w:pStyle w:val="ListParagraph"/>
-        <w:numPr>
-          <w:ilvl w:val="0"/>
-          <w:numId w:val="6"/>
-        </w:numPr>
-        <w:rPr>
-          <w:lang w:val="en-US"/>
-        </w:rPr>
-      </w:pPr>
-      <w:r>
-        <w:rPr>
-          <w:lang w:val="en-US"/>
-        </w:rPr>
-        <w:t xml:space="preserve">Plot </w:t>
-      </w:r>
-      <w:r>
-        <w:rPr>
-          <w:lang w:val="en-US"/>
-        </w:rPr>
-        <w:t>composition</w:t>
-      </w:r>
-      <w:r>
-        <w:rPr>
-          <w:lang w:val="en-US"/>
-        </w:rPr>
-        <w:t xml:space="preserve"> of CF.</w:t>
-      </w:r>
+        <w:t xml:space="preserve">Part 6: </w:t>
+      </w:r>
+      <w:r>
+        <w:rPr>
+          <w:lang w:val="en-US"/>
+        </w:rPr>
+        <w:t>Screener</w:t>
+      </w:r>
+    </w:p>
+    <w:p>
+      <w:pPr>
+        <w:rPr>
+          <w:lang w:val="en-US"/>
+        </w:rPr>
+      </w:pPr>
+    </w:p>
+    <w:p>
+      <w:pPr>
+        <w:rPr>
+          <w:i/>
+          <w:iCs/>
+          <w:lang w:val="en-US"/>
+        </w:rPr>
+      </w:pPr>
+      <w:r>
+        <w:rPr>
+          <w:i/>
+          <w:iCs/>
+          <w:lang w:val="en-US"/>
+        </w:rPr>
+        <w:t>**</w:t>
+      </w:r>
+      <w:r>
+        <w:rPr>
+          <w:i/>
+          <w:iCs/>
+          <w:lang w:val="en-US"/>
+        </w:rPr>
+        <w:t xml:space="preserve">Move from suitable to </w:t>
+      </w:r>
+      <w:r>
+        <w:rPr>
+          <w:i/>
+          <w:iCs/>
+          <w:lang w:val="en-US"/>
+        </w:rPr>
+        <w:t>attractive MSRs.</w:t>
+      </w:r>
+      <w:r>
+        <w:rPr>
+          <w:i/>
+          <w:iCs/>
+          <w:lang w:val="en-US"/>
+        </w:rPr>
+        <w:t xml:space="preserve"> </w:t>
+      </w:r>
+      <w:r>
+        <w:rPr>
+          <w:i/>
+          <w:iCs/>
+          <w:lang w:val="en-BE"/>
+        </w:rPr>
+        <w:t xml:space="preserve">For both solar and wind power the most attractive locations are seen to be found across the Andean mountain range traversing the country longitudinally, where solar irradiation and wind speeds are highest and the transmission grid is never too </w:t>
+      </w:r>
+      <w:proofErr w:type="gramStart"/>
+      <w:r>
+        <w:rPr>
+          <w:i/>
+          <w:iCs/>
+          <w:lang w:val="en-BE"/>
+        </w:rPr>
+        <w:t>distant.</w:t>
+      </w:r>
+      <w:r>
+        <w:rPr>
+          <w:i/>
+          <w:iCs/>
+          <w:lang w:val="en-BE"/>
+        </w:rPr>
+        <w:t>*</w:t>
+      </w:r>
+      <w:proofErr w:type="gramEnd"/>
+      <w:r>
+        <w:rPr>
+          <w:i/>
+          <w:iCs/>
+          <w:lang w:val="en-BE"/>
+        </w:rPr>
+        <w:t>*</w:t>
+      </w:r>
+    </w:p>
+    <w:p>
+      <w:pPr>
+        <w:rPr>
+          <w:lang w:val="en-US"/>
+        </w:rPr>
+      </w:pPr>
     </w:p>
     <w:p>
       <w:pPr>
@@ -6673,193 +9216,6 @@
           <w:lang w:val="en-US"/>
         </w:rPr>
         <w:lastRenderedPageBreak/>
-        <w:t xml:space="preserve">Part 5: </w:t>
-      </w:r>
-      <w:r>
-        <w:rPr>
-          <w:lang w:val="en-US"/>
-        </w:rPr>
-        <w:t>Attributor Combiner</w:t>
-      </w:r>
-    </w:p>
-    <w:p>
-      <w:pPr>
-        <w:rPr>
-          <w:lang w:val="en-US"/>
-        </w:rPr>
-      </w:pPr>
-    </w:p>
-    <w:p>
-      <w:pPr>
-        <w:pStyle w:val="ListParagraph"/>
-        <w:numPr>
-          <w:ilvl w:val="0"/>
-          <w:numId w:val="7"/>
-        </w:numPr>
-        <w:rPr>
-          <w:lang w:val="en-US"/>
-        </w:rPr>
-      </w:pPr>
-      <w:r>
-        <w:rPr>
-          <w:lang w:val="en-US"/>
-        </w:rPr>
-        <w:t>Understand the cost assumptions</w:t>
-      </w:r>
-      <w:r>
-        <w:rPr>
-          <w:lang w:val="en-US"/>
-        </w:rPr>
-        <w:t>.</w:t>
-      </w:r>
-    </w:p>
-    <w:p>
-      <w:pPr>
-        <w:pStyle w:val="ListParagraph"/>
-        <w:numPr>
-          <w:ilvl w:val="0"/>
-          <w:numId w:val="7"/>
-        </w:numPr>
-        <w:rPr>
-          <w:lang w:val="en-US"/>
-        </w:rPr>
-      </w:pPr>
-      <w:r>
-        <w:rPr>
-          <w:lang w:val="en-US"/>
-        </w:rPr>
-        <w:t xml:space="preserve">Plot </w:t>
-      </w:r>
-      <w:r>
-        <w:rPr>
-          <w:lang w:val="en-US"/>
-        </w:rPr>
-        <w:t xml:space="preserve">composition </w:t>
-      </w:r>
-      <w:r>
-        <w:rPr>
-          <w:lang w:val="en-US"/>
-        </w:rPr>
-        <w:t>of distance to grid.</w:t>
-      </w:r>
-    </w:p>
-    <w:p>
-      <w:pPr>
-        <w:pStyle w:val="ListParagraph"/>
-        <w:numPr>
-          <w:ilvl w:val="0"/>
-          <w:numId w:val="7"/>
-        </w:numPr>
-        <w:rPr>
-          <w:lang w:val="en-US"/>
-        </w:rPr>
-      </w:pPr>
-      <w:r>
-        <w:rPr>
-          <w:lang w:val="en-US"/>
-        </w:rPr>
-        <w:t xml:space="preserve">Plot </w:t>
-      </w:r>
-      <w:r>
-        <w:rPr>
-          <w:lang w:val="en-US"/>
-        </w:rPr>
-        <w:t xml:space="preserve">composition </w:t>
-      </w:r>
-      <w:r>
-        <w:rPr>
-          <w:lang w:val="en-US"/>
-        </w:rPr>
-        <w:t>of LCOE</w:t>
-      </w:r>
-    </w:p>
-    <w:p>
-      <w:pPr>
-        <w:pStyle w:val="Heading2"/>
-        <w:rPr>
-          <w:lang w:val="en-US"/>
-        </w:rPr>
-      </w:pPr>
-      <w:r>
-        <w:rPr>
-          <w:lang w:val="en-US"/>
-        </w:rPr>
-        <w:t xml:space="preserve">Part 6: </w:t>
-      </w:r>
-      <w:r>
-        <w:rPr>
-          <w:lang w:val="en-US"/>
-        </w:rPr>
-        <w:t>Screener</w:t>
-      </w:r>
-    </w:p>
-    <w:p>
-      <w:pPr>
-        <w:rPr>
-          <w:lang w:val="en-US"/>
-        </w:rPr>
-      </w:pPr>
-    </w:p>
-    <w:p>
-      <w:pPr>
-        <w:pStyle w:val="ListParagraph"/>
-        <w:numPr>
-          <w:ilvl w:val="0"/>
-          <w:numId w:val="8"/>
-        </w:numPr>
-        <w:rPr>
-          <w:lang w:val="en-US"/>
-        </w:rPr>
-      </w:pPr>
-      <w:r>
-        <w:rPr>
-          <w:lang w:val="en-US"/>
-        </w:rPr>
-        <w:t xml:space="preserve">Move from suitable to </w:t>
-      </w:r>
-      <w:r>
-        <w:rPr>
-          <w:lang w:val="en-US"/>
-        </w:rPr>
-        <w:t>attractive MSRs.</w:t>
-      </w:r>
-    </w:p>
-    <w:p>
-      <w:pPr>
-        <w:pStyle w:val="ListParagraph"/>
-        <w:numPr>
-          <w:ilvl w:val="0"/>
-          <w:numId w:val="8"/>
-        </w:numPr>
-        <w:rPr>
-          <w:lang w:val="en-US"/>
-        </w:rPr>
-      </w:pPr>
-      <w:r>
-        <w:rPr>
-          <w:lang w:val="en-BE"/>
-        </w:rPr>
-        <w:t>For both solar and wind power the most attractive locations are seen to be found across the Andean mountain range traversing the country longitudinally, where solar irradiation and wind speeds are highest and the transmission grid is never too distant.</w:t>
-      </w:r>
-    </w:p>
-    <w:p>
-      <w:pPr>
-        <w:rPr>
-          <w:lang w:val="en-US"/>
-        </w:rPr>
-      </w:pPr>
-    </w:p>
-    <w:p>
-      <w:pPr>
-        <w:pStyle w:val="Heading2"/>
-        <w:rPr>
-          <w:lang w:val="en-US"/>
-        </w:rPr>
-      </w:pPr>
-      <w:r>
-        <w:rPr>
-          <w:lang w:val="en-US"/>
-        </w:rPr>
         <w:t xml:space="preserve">Part 7: </w:t>
       </w:r>
       <w:r>
@@ -8521,6 +10877,7 @@
   <w:style w:type="character" w:default="1" w:styleId="DefaultParagraphFont">
     <w:name w:val="Default Paragraph Font"/>
     <w:uiPriority w:val="1"/>
+    <w:semiHidden/>
     <w:unhideWhenUsed/>
   </w:style>
   <w:style w:type="table" w:default="1" w:styleId="TableNormal">

</xml_diff>

<commit_message>
adapt training material to removed resource relaxation step
</commit_message>
<xml_diff>
--- a/training/MSR_framework_training.docx
+++ b/training/MSR_framework_training.docx
@@ -2124,7 +2124,6 @@
           <w:lang w:val="en-US"/>
         </w:rPr>
       </w:pPr>
-      <w:commentRangeStart w:id="3"/>
       <w:r>
         <w:rPr>
           <w:rFonts w:ascii="Garamond" w:hAnsi="Garamond"/>
@@ -2137,25 +2136,20 @@
         </w:rPr>
         <w:t>inputs/</w:t>
       </w:r>
-      <w:commentRangeEnd w:id="3"/>
-      <w:r>
-        <w:rPr>
-          <w:rStyle w:val="CommentReference"/>
+    </w:p>
+    <w:p>
+      <w:pPr>
+        <w:rPr>
           <w:rFonts w:ascii="Garamond" w:hAnsi="Garamond"/>
           <w:b/>
           <w:bCs/>
           <w:i/>
           <w:iCs/>
           <w:color w:val="00B050"/>
-          <w:sz w:val="22"/>
-          <w:szCs w:val="20"/>
-          <w:lang w:val="en-US"/>
-        </w:rPr>
-        <w:commentReference w:id="3"/>
-      </w:r>
-    </w:p>
-    <w:p>
-      <w:pPr>
+          <w:lang w:val="en-US"/>
+        </w:rPr>
+      </w:pPr>
+      <w:r>
         <w:rPr>
           <w:rFonts w:ascii="Garamond" w:hAnsi="Garamond"/>
           <w:b/>
@@ -2165,8 +2159,11 @@
           <w:color w:val="00B050"/>
           <w:lang w:val="en-US"/>
         </w:rPr>
-      </w:pPr>
-      <w:r>
+        <w:t>outputs/</w:t>
+      </w:r>
+    </w:p>
+    <w:p>
+      <w:pPr>
         <w:rPr>
           <w:rFonts w:ascii="Garamond" w:hAnsi="Garamond"/>
           <w:b/>
@@ -2176,11 +2173,8 @@
           <w:color w:val="00B050"/>
           <w:lang w:val="en-US"/>
         </w:rPr>
-        <w:t>outputs/</w:t>
-      </w:r>
-    </w:p>
-    <w:p>
-      <w:pPr>
+      </w:pPr>
+      <w:r>
         <w:rPr>
           <w:rFonts w:ascii="Garamond" w:hAnsi="Garamond"/>
           <w:b/>
@@ -2190,8 +2184,11 @@
           <w:color w:val="00B050"/>
           <w:lang w:val="en-US"/>
         </w:rPr>
-      </w:pPr>
-      <w:r>
+        <w:t>envs/</w:t>
+      </w:r>
+    </w:p>
+    <w:p>
+      <w:pPr>
         <w:rPr>
           <w:rFonts w:ascii="Garamond" w:hAnsi="Garamond"/>
           <w:b/>
@@ -2201,11 +2198,8 @@
           <w:color w:val="00B050"/>
           <w:lang w:val="en-US"/>
         </w:rPr>
-        <w:t>envs/</w:t>
-      </w:r>
-    </w:p>
-    <w:p>
-      <w:pPr>
+      </w:pPr>
+      <w:r>
         <w:rPr>
           <w:rFonts w:ascii="Garamond" w:hAnsi="Garamond"/>
           <w:b/>
@@ -2215,8 +2209,11 @@
           <w:color w:val="00B050"/>
           <w:lang w:val="en-US"/>
         </w:rPr>
-      </w:pPr>
-      <w:r>
+        <w:t>training/</w:t>
+      </w:r>
+    </w:p>
+    <w:p>
+      <w:pPr>
         <w:rPr>
           <w:rFonts w:ascii="Garamond" w:hAnsi="Garamond"/>
           <w:b/>
@@ -2226,11 +2223,8 @@
           <w:color w:val="00B050"/>
           <w:lang w:val="en-US"/>
         </w:rPr>
-        <w:t>training/</w:t>
-      </w:r>
-    </w:p>
-    <w:p>
-      <w:pPr>
+      </w:pPr>
+      <w:r>
         <w:rPr>
           <w:rFonts w:ascii="Garamond" w:hAnsi="Garamond"/>
           <w:b/>
@@ -2240,7 +2234,59 @@
           <w:color w:val="00B050"/>
           <w:lang w:val="en-US"/>
         </w:rPr>
-      </w:pPr>
+        <w:t>README</w:t>
+      </w:r>
+    </w:p>
+    <w:p>
+      <w:pPr>
+        <w:rPr>
+          <w:rFonts w:ascii="Garamond" w:hAnsi="Garamond"/>
+          <w:lang w:val="en-US"/>
+        </w:rPr>
+      </w:pPr>
+    </w:p>
+    <w:p>
+      <w:pPr>
+        <w:rPr>
+          <w:rFonts w:ascii="Garamond" w:hAnsi="Garamond"/>
+          <w:lang w:val="en-US"/>
+        </w:rPr>
+      </w:pPr>
+      <w:r>
+        <w:rPr>
+          <w:rFonts w:ascii="Garamond" w:hAnsi="Garamond"/>
+          <w:lang w:val="en-US"/>
+        </w:rPr>
+        <w:t xml:space="preserve">Each </w:t>
+      </w:r>
+      <w:r>
+        <w:rPr>
+          <w:rFonts w:ascii="Garamond" w:hAnsi="Garamond"/>
+          <w:lang w:val="en-US"/>
+        </w:rPr>
+        <w:t xml:space="preserve">workflow </w:t>
+      </w:r>
+      <w:r>
+        <w:rPr>
+          <w:rFonts w:ascii="Garamond" w:hAnsi="Garamond"/>
+          <w:lang w:val="en-US"/>
+        </w:rPr>
+        <w:t>folder contains the relevant Python script and control file.</w:t>
+      </w:r>
+      <w:r>
+        <w:rPr>
+          <w:rFonts w:ascii="Garamond" w:hAnsi="Garamond"/>
+          <w:lang w:val="en-US"/>
+        </w:rPr>
+        <w:t xml:space="preserve"> </w:t>
+      </w:r>
+      <w:r>
+        <w:rPr>
+          <w:rFonts w:ascii="Garamond" w:hAnsi="Garamond"/>
+          <w:lang w:val="en-US"/>
+        </w:rPr>
+        <w:t xml:space="preserve">The </w:t>
+      </w:r>
       <w:r>
         <w:rPr>
           <w:rFonts w:ascii="Garamond" w:hAnsi="Garamond"/>
@@ -2251,48 +2297,12 @@
           <w:color w:val="00B050"/>
           <w:lang w:val="en-US"/>
         </w:rPr>
-        <w:t>README</w:t>
-      </w:r>
-    </w:p>
-    <w:p>
-      <w:pPr>
-        <w:rPr>
-          <w:rFonts w:ascii="Garamond" w:hAnsi="Garamond"/>
-          <w:lang w:val="en-US"/>
-        </w:rPr>
-      </w:pPr>
-    </w:p>
-    <w:p>
-      <w:pPr>
-        <w:rPr>
-          <w:rFonts w:ascii="Garamond" w:hAnsi="Garamond"/>
-          <w:lang w:val="en-US"/>
-        </w:rPr>
-      </w:pPr>
-      <w:r>
-        <w:rPr>
-          <w:rFonts w:ascii="Garamond" w:hAnsi="Garamond"/>
-          <w:lang w:val="en-US"/>
-        </w:rPr>
-        <w:t xml:space="preserve">Each </w:t>
-      </w:r>
-      <w:r>
-        <w:rPr>
-          <w:rFonts w:ascii="Garamond" w:hAnsi="Garamond"/>
-          <w:lang w:val="en-US"/>
-        </w:rPr>
-        <w:t xml:space="preserve">workflow </w:t>
-      </w:r>
-      <w:r>
-        <w:rPr>
-          <w:rFonts w:ascii="Garamond" w:hAnsi="Garamond"/>
-          <w:lang w:val="en-US"/>
-        </w:rPr>
-        <w:t>folder contains the relevant Python script and control file.</w:t>
-      </w:r>
-      <w:r>
-        <w:rPr>
-          <w:rFonts w:ascii="Garamond" w:hAnsi="Garamond"/>
+        <w:t>inputs</w:t>
+      </w:r>
+      <w:r>
+        <w:rPr>
+          <w:rFonts w:ascii="Garamond" w:hAnsi="Garamond"/>
+          <w:color w:val="00B050"/>
           <w:lang w:val="en-US"/>
         </w:rPr>
         <w:t xml:space="preserve"> </w:t>
@@ -2302,7 +2312,21 @@
           <w:rFonts w:ascii="Garamond" w:hAnsi="Garamond"/>
           <w:lang w:val="en-US"/>
         </w:rPr>
-        <w:t xml:space="preserve">The </w:t>
+        <w:t xml:space="preserve">folder stores the required </w:t>
+      </w:r>
+      <w:r>
+        <w:rPr>
+          <w:rFonts w:ascii="Garamond" w:hAnsi="Garamond"/>
+          <w:lang w:val="en-US"/>
+        </w:rPr>
+        <w:t xml:space="preserve">input </w:t>
+      </w:r>
+      <w:r>
+        <w:rPr>
+          <w:rFonts w:ascii="Garamond" w:hAnsi="Garamond"/>
+          <w:lang w:val="en-US"/>
+        </w:rPr>
+        <w:t xml:space="preserve">datasets, while the </w:t>
       </w:r>
       <w:r>
         <w:rPr>
@@ -2314,7 +2338,7 @@
           <w:color w:val="00B050"/>
           <w:lang w:val="en-US"/>
         </w:rPr>
-        <w:t>inputs</w:t>
+        <w:t>outputs</w:t>
       </w:r>
       <w:r>
         <w:rPr>
@@ -2329,21 +2353,127 @@
           <w:rFonts w:ascii="Garamond" w:hAnsi="Garamond"/>
           <w:lang w:val="en-US"/>
         </w:rPr>
-        <w:t xml:space="preserve">folder stores the required </w:t>
-      </w:r>
-      <w:r>
-        <w:rPr>
-          <w:rFonts w:ascii="Garamond" w:hAnsi="Garamond"/>
-          <w:lang w:val="en-US"/>
-        </w:rPr>
-        <w:t xml:space="preserve">input </w:t>
-      </w:r>
-      <w:r>
-        <w:rPr>
-          <w:rFonts w:ascii="Garamond" w:hAnsi="Garamond"/>
-          <w:lang w:val="en-US"/>
-        </w:rPr>
-        <w:t xml:space="preserve">datasets, while the </w:t>
+        <w:t>folder stores the results generated by the MSR framework.</w:t>
+      </w:r>
+    </w:p>
+    <w:p>
+      <w:pPr>
+        <w:pStyle w:val="Heading3"/>
+        <w:rPr>
+          <w:rFonts w:ascii="Garamond" w:hAnsi="Garamond"/>
+          <w:lang w:val="en-GB"/>
+        </w:rPr>
+      </w:pPr>
+      <w:bookmarkStart w:id="3" w:name="_Toc235198492"/>
+      <w:r>
+        <w:rPr>
+          <w:rFonts w:ascii="Garamond" w:hAnsi="Garamond"/>
+          <w:lang w:val="en-GB"/>
+        </w:rPr>
+        <w:t>Part 1.2: Python environment</w:t>
+      </w:r>
+      <w:bookmarkEnd w:id="3"/>
+    </w:p>
+    <w:p>
+      <w:pPr>
+        <w:rPr>
+          <w:rFonts w:ascii="Garamond" w:hAnsi="Garamond"/>
+          <w:lang w:val="en-US"/>
+        </w:rPr>
+      </w:pPr>
+    </w:p>
+    <w:p>
+      <w:pPr>
+        <w:rPr>
+          <w:rFonts w:ascii="Garamond" w:hAnsi="Garamond"/>
+          <w:lang w:val="en-US"/>
+        </w:rPr>
+      </w:pPr>
+      <w:r>
+        <w:rPr>
+          <w:rFonts w:ascii="Garamond" w:hAnsi="Garamond"/>
+          <w:lang w:val="en-US"/>
+        </w:rPr>
+        <w:t xml:space="preserve">Anaconda is used to manage the Python environment and the packages required by the MSR framework. The environment </w:t>
+      </w:r>
+      <w:r>
+        <w:rPr>
+          <w:rFonts w:ascii="Garamond" w:hAnsi="Garamond"/>
+          <w:lang w:val="en-US"/>
+        </w:rPr>
+        <w:t>is</w:t>
+      </w:r>
+      <w:r>
+        <w:rPr>
+          <w:rFonts w:ascii="Garamond" w:hAnsi="Garamond"/>
+          <w:lang w:val="en-US"/>
+        </w:rPr>
+        <w:t xml:space="preserve"> defined in the </w:t>
+      </w:r>
+      <w:r>
+        <w:rPr>
+          <w:rFonts w:ascii="Garamond" w:hAnsi="Garamond"/>
+          <w:i/>
+          <w:iCs/>
+          <w:color w:val="07BCE3" w:themeColor="accent5" w:themeShade="BF"/>
+          <w:lang w:val="en-US"/>
+        </w:rPr>
+        <w:t>msr</w:t>
+      </w:r>
+      <w:r>
+        <w:rPr>
+          <w:rFonts w:ascii="Garamond" w:hAnsi="Garamond"/>
+          <w:i/>
+          <w:iCs/>
+          <w:color w:val="07BCE3" w:themeColor="accent5" w:themeShade="BF"/>
+          <w:lang w:val="en-US"/>
+        </w:rPr>
+        <w:t>_</w:t>
+      </w:r>
+      <w:r>
+        <w:rPr>
+          <w:rFonts w:ascii="Garamond" w:hAnsi="Garamond"/>
+          <w:i/>
+          <w:iCs/>
+          <w:color w:val="07BCE3" w:themeColor="accent5" w:themeShade="BF"/>
+          <w:lang w:val="en-US"/>
+        </w:rPr>
+        <w:t>env</w:t>
+      </w:r>
+      <w:r>
+        <w:rPr>
+          <w:rFonts w:ascii="Garamond" w:hAnsi="Garamond"/>
+          <w:i/>
+          <w:iCs/>
+          <w:color w:val="07BCE3" w:themeColor="accent5" w:themeShade="BF"/>
+          <w:lang w:val="en-US"/>
+        </w:rPr>
+        <w:t>ironment</w:t>
+      </w:r>
+      <w:r>
+        <w:rPr>
+          <w:rFonts w:ascii="Garamond" w:hAnsi="Garamond"/>
+          <w:i/>
+          <w:iCs/>
+          <w:color w:val="07BCE3" w:themeColor="accent5" w:themeShade="BF"/>
+          <w:lang w:val="en-US"/>
+        </w:rPr>
+        <w:t>.yaml</w:t>
+      </w:r>
+      <w:r>
+        <w:rPr>
+          <w:rFonts w:ascii="Garamond" w:hAnsi="Garamond"/>
+          <w:color w:val="07BCE3" w:themeColor="accent5" w:themeShade="BF"/>
+          <w:lang w:val="en-US"/>
+        </w:rPr>
+        <w:t xml:space="preserve"> </w:t>
+      </w:r>
+      <w:r>
+        <w:rPr>
+          <w:rFonts w:ascii="Garamond" w:hAnsi="Garamond"/>
+          <w:lang w:val="en-US"/>
+        </w:rPr>
+        <w:t xml:space="preserve">file, located in the </w:t>
       </w:r>
       <w:r>
         <w:rPr>
@@ -2355,14 +2485,26 @@
           <w:color w:val="00B050"/>
           <w:lang w:val="en-US"/>
         </w:rPr>
-        <w:t>outputs</w:t>
-      </w:r>
-      <w:r>
-        <w:rPr>
-          <w:rFonts w:ascii="Garamond" w:hAnsi="Garamond"/>
+        <w:t>env</w:t>
+      </w:r>
+      <w:r>
+        <w:rPr>
+          <w:rFonts w:ascii="Garamond" w:hAnsi="Garamond"/>
+          <w:b/>
+          <w:bCs/>
+          <w:i/>
+          <w:iCs/>
           <w:color w:val="00B050"/>
           <w:lang w:val="en-US"/>
         </w:rPr>
+        <w:t>s</w:t>
+      </w:r>
+      <w:r>
+        <w:rPr>
+          <w:rFonts w:ascii="Garamond" w:hAnsi="Garamond"/>
+          <w:color w:val="00B050"/>
+          <w:lang w:val="en-US"/>
+        </w:rPr>
         <w:t xml:space="preserve"> </w:t>
       </w:r>
       <w:r>
@@ -2370,62 +2512,222 @@
           <w:rFonts w:ascii="Garamond" w:hAnsi="Garamond"/>
           <w:lang w:val="en-US"/>
         </w:rPr>
-        <w:t>folder stores the results generated by the MSR framework.</w:t>
-      </w:r>
-    </w:p>
-    <w:p>
-      <w:pPr>
-        <w:pStyle w:val="Heading3"/>
-        <w:rPr>
-          <w:rFonts w:ascii="Garamond" w:hAnsi="Garamond"/>
+        <w:t>folder.</w:t>
+      </w:r>
+      <w:r>
+        <w:rPr>
+          <w:rFonts w:ascii="Garamond" w:hAnsi="Garamond"/>
+          <w:lang w:val="en-US"/>
+        </w:rPr>
+        <w:t xml:space="preserve"> </w:t>
+      </w:r>
+    </w:p>
+    <w:p>
+      <w:pPr>
+        <w:rPr>
+          <w:rFonts w:ascii="Garamond" w:hAnsi="Garamond"/>
+          <w:lang w:val="en-US"/>
+        </w:rPr>
+      </w:pPr>
+    </w:p>
+    <w:p>
+      <w:pPr>
+        <w:rPr>
+          <w:rFonts w:ascii="Garamond" w:hAnsi="Garamond"/>
+          <w:lang w:val="en-US"/>
+        </w:rPr>
+      </w:pPr>
+      <w:r>
+        <w:rPr>
+          <w:rFonts w:ascii="Garamond" w:hAnsi="Garamond"/>
+          <w:lang w:val="en-US"/>
+        </w:rPr>
+        <w:t xml:space="preserve">Open an Anaconda Prompt or terminal, navigate to the </w:t>
+      </w:r>
+      <w:r>
+        <w:rPr>
+          <w:rFonts w:ascii="Garamond" w:hAnsi="Garamond"/>
+          <w:b/>
+          <w:bCs/>
+          <w:i/>
+          <w:iCs/>
+          <w:color w:val="00B050"/>
+          <w:lang w:val="en-US"/>
+        </w:rPr>
+        <w:t>envs</w:t>
+      </w:r>
+      <w:r>
+        <w:rPr>
+          <w:rFonts w:ascii="Garamond" w:hAnsi="Garamond"/>
+          <w:color w:val="00B050"/>
+          <w:lang w:val="en-US"/>
+        </w:rPr>
+        <w:t xml:space="preserve"> </w:t>
+      </w:r>
+      <w:r>
+        <w:rPr>
+          <w:rFonts w:ascii="Garamond" w:hAnsi="Garamond"/>
+          <w:lang w:val="en-US"/>
+        </w:rPr>
+        <w:t>folder and create and activate the environment using the following commands.</w:t>
+      </w:r>
+    </w:p>
+    <w:p>
+      <w:pPr>
+        <w:rPr>
+          <w:rFonts w:ascii="Garamond" w:hAnsi="Garamond"/>
+          <w:lang w:val="en-US"/>
+        </w:rPr>
+      </w:pPr>
+    </w:p>
+    <w:p>
+      <w:pPr>
+        <w:rPr>
+          <w:rFonts w:ascii="Garamond" w:hAnsi="Garamond"/>
+          <w:i/>
+          <w:iCs/>
+          <w:color w:val="808080" w:themeColor="background1" w:themeShade="80"/>
           <w:lang w:val="en-GB"/>
         </w:rPr>
       </w:pPr>
-      <w:bookmarkStart w:id="4" w:name="_Toc235198492"/>
-      <w:r>
-        <w:rPr>
-          <w:rFonts w:ascii="Garamond" w:hAnsi="Garamond"/>
+      <w:r>
+        <w:rPr>
+          <w:rFonts w:ascii="Garamond" w:hAnsi="Garamond"/>
+          <w:i/>
+          <w:iCs/>
+          <w:color w:val="808080" w:themeColor="background1" w:themeShade="80"/>
           <w:lang w:val="en-GB"/>
         </w:rPr>
-        <w:t>Part 1.2: Python environment</w:t>
-      </w:r>
-      <w:bookmarkEnd w:id="4"/>
-    </w:p>
-    <w:p>
-      <w:pPr>
-        <w:rPr>
-          <w:rFonts w:ascii="Garamond" w:hAnsi="Garamond"/>
-          <w:lang w:val="en-US"/>
-        </w:rPr>
-      </w:pPr>
-    </w:p>
-    <w:p>
-      <w:pPr>
-        <w:rPr>
-          <w:rFonts w:ascii="Garamond" w:hAnsi="Garamond"/>
-          <w:lang w:val="en-US"/>
-        </w:rPr>
-      </w:pPr>
-      <w:r>
-        <w:rPr>
-          <w:rFonts w:ascii="Garamond" w:hAnsi="Garamond"/>
-          <w:lang w:val="en-US"/>
-        </w:rPr>
-        <w:t xml:space="preserve">Anaconda is used to manage the Python environment and the packages required by the MSR framework. The environment </w:t>
-      </w:r>
-      <w:r>
-        <w:rPr>
-          <w:rFonts w:ascii="Garamond" w:hAnsi="Garamond"/>
-          <w:lang w:val="en-US"/>
-        </w:rPr>
-        <w:t>is</w:t>
-      </w:r>
-      <w:r>
-        <w:rPr>
-          <w:rFonts w:ascii="Garamond" w:hAnsi="Garamond"/>
-          <w:lang w:val="en-US"/>
-        </w:rPr>
-        <w:t xml:space="preserve"> defined in the </w:t>
+        <w:t>c</w:t>
+      </w:r>
+      <w:r>
+        <w:rPr>
+          <w:rFonts w:ascii="Garamond" w:hAnsi="Garamond"/>
+          <w:i/>
+          <w:iCs/>
+          <w:color w:val="808080" w:themeColor="background1" w:themeShade="80"/>
+          <w:lang w:val="en-GB"/>
+        </w:rPr>
+        <w:t xml:space="preserve">onda env create -f </w:t>
+      </w:r>
+      <w:r>
+        <w:rPr>
+          <w:rFonts w:ascii="Garamond" w:hAnsi="Garamond"/>
+          <w:i/>
+          <w:iCs/>
+          <w:color w:val="808080" w:themeColor="background1" w:themeShade="80"/>
+          <w:lang w:val="en-GB"/>
+        </w:rPr>
+        <w:t>msr_environment</w:t>
+      </w:r>
+      <w:r>
+        <w:rPr>
+          <w:rFonts w:ascii="Garamond" w:hAnsi="Garamond"/>
+          <w:i/>
+          <w:iCs/>
+          <w:color w:val="808080" w:themeColor="background1" w:themeShade="80"/>
+          <w:lang w:val="en-GB"/>
+        </w:rPr>
+        <w:t>.yaml</w:t>
+      </w:r>
+    </w:p>
+    <w:p>
+      <w:pPr>
+        <w:rPr>
+          <w:rFonts w:ascii="Garamond" w:hAnsi="Garamond"/>
+          <w:i/>
+          <w:iCs/>
+          <w:color w:val="808080" w:themeColor="background1" w:themeShade="80"/>
+          <w:lang w:val="en-US"/>
+        </w:rPr>
+      </w:pPr>
+      <w:r>
+        <w:rPr>
+          <w:rFonts w:ascii="Garamond" w:hAnsi="Garamond"/>
+          <w:i/>
+          <w:iCs/>
+          <w:color w:val="808080" w:themeColor="background1" w:themeShade="80"/>
+          <w:lang w:val="en-US"/>
+        </w:rPr>
+        <w:t>c</w:t>
+      </w:r>
+      <w:r>
+        <w:rPr>
+          <w:rFonts w:ascii="Garamond" w:hAnsi="Garamond"/>
+          <w:i/>
+          <w:iCs/>
+          <w:color w:val="808080" w:themeColor="background1" w:themeShade="80"/>
+          <w:lang w:val="en-US"/>
+        </w:rPr>
+        <w:t xml:space="preserve">onda activate </w:t>
+      </w:r>
+      <w:r>
+        <w:rPr>
+          <w:rFonts w:ascii="Garamond" w:hAnsi="Garamond"/>
+          <w:i/>
+          <w:iCs/>
+          <w:color w:val="808080" w:themeColor="background1" w:themeShade="80"/>
+          <w:lang w:val="en-US"/>
+        </w:rPr>
+        <w:t>mrs_env</w:t>
+      </w:r>
+    </w:p>
+    <w:p>
+      <w:pPr>
+        <w:rPr>
+          <w:rFonts w:ascii="Garamond" w:hAnsi="Garamond"/>
+          <w:lang w:val="en-US"/>
+        </w:rPr>
+      </w:pPr>
+    </w:p>
+    <w:p>
+      <w:pPr>
+        <w:rPr>
+          <w:rFonts w:ascii="Garamond" w:hAnsi="Garamond"/>
+          <w:lang w:val="en-US"/>
+        </w:rPr>
+      </w:pPr>
+      <w:r>
+        <w:rPr>
+          <w:rFonts w:ascii="Garamond" w:hAnsi="Garamond"/>
+          <w:lang w:val="en-US"/>
+        </w:rPr>
+        <w:t>Spyder</w:t>
+      </w:r>
+      <w:r>
+        <w:rPr>
+          <w:rFonts w:ascii="Garamond" w:hAnsi="Garamond"/>
+          <w:lang w:val="en-US"/>
+        </w:rPr>
+        <w:t xml:space="preserve"> is used as integrated development environment</w:t>
+      </w:r>
+      <w:r>
+        <w:rPr>
+          <w:rFonts w:ascii="Garamond" w:hAnsi="Garamond"/>
+          <w:lang w:val="en-US"/>
+        </w:rPr>
+        <w:t xml:space="preserve"> (IDE)</w:t>
+      </w:r>
+      <w:r>
+        <w:rPr>
+          <w:rFonts w:ascii="Garamond" w:hAnsi="Garamond"/>
+          <w:lang w:val="en-US"/>
+        </w:rPr>
+        <w:t xml:space="preserve"> for running the Python scripts. Open the MSR repository in </w:t>
+      </w:r>
+      <w:r>
+        <w:rPr>
+          <w:rFonts w:ascii="Garamond" w:hAnsi="Garamond"/>
+          <w:lang w:val="en-US"/>
+        </w:rPr>
+        <w:t>Spyder</w:t>
+      </w:r>
+      <w:r>
+        <w:rPr>
+          <w:rFonts w:ascii="Garamond" w:hAnsi="Garamond"/>
+          <w:lang w:val="en-US"/>
+        </w:rPr>
+        <w:t xml:space="preserve"> and select the </w:t>
       </w:r>
       <w:r>
         <w:rPr>
@@ -2445,44 +2747,14 @@
           <w:color w:val="07BCE3" w:themeColor="accent5" w:themeShade="BF"/>
           <w:lang w:val="en-US"/>
         </w:rPr>
-        <w:t>_</w:t>
-      </w:r>
-      <w:r>
-        <w:rPr>
-          <w:rFonts w:ascii="Garamond" w:hAnsi="Garamond"/>
-          <w:i/>
-          <w:iCs/>
+        <w:t>_env</w:t>
+      </w:r>
+      <w:r>
+        <w:rPr>
+          <w:rFonts w:ascii="Garamond" w:hAnsi="Garamond"/>
           <w:color w:val="07BCE3" w:themeColor="accent5" w:themeShade="BF"/>
           <w:lang w:val="en-US"/>
         </w:rPr>
-        <w:t>env</w:t>
-      </w:r>
-      <w:r>
-        <w:rPr>
-          <w:rFonts w:ascii="Garamond" w:hAnsi="Garamond"/>
-          <w:i/>
-          <w:iCs/>
-          <w:color w:val="07BCE3" w:themeColor="accent5" w:themeShade="BF"/>
-          <w:lang w:val="en-US"/>
-        </w:rPr>
-        <w:t>ironment</w:t>
-      </w:r>
-      <w:r>
-        <w:rPr>
-          <w:rFonts w:ascii="Garamond" w:hAnsi="Garamond"/>
-          <w:i/>
-          <w:iCs/>
-          <w:color w:val="07BCE3" w:themeColor="accent5" w:themeShade="BF"/>
-          <w:lang w:val="en-US"/>
-        </w:rPr>
-        <w:t>.yaml</w:t>
-      </w:r>
-      <w:r>
-        <w:rPr>
-          <w:rFonts w:ascii="Garamond" w:hAnsi="Garamond"/>
-          <w:color w:val="07BCE3" w:themeColor="accent5" w:themeShade="BF"/>
-          <w:lang w:val="en-US"/>
-        </w:rPr>
         <w:t xml:space="preserve"> </w:t>
       </w:r>
       <w:r>
@@ -2490,36 +2762,50 @@
           <w:rFonts w:ascii="Garamond" w:hAnsi="Garamond"/>
           <w:lang w:val="en-US"/>
         </w:rPr>
-        <w:t xml:space="preserve">file, located in the </w:t>
-      </w:r>
-      <w:r>
-        <w:rPr>
-          <w:rFonts w:ascii="Garamond" w:hAnsi="Garamond"/>
-          <w:b/>
-          <w:bCs/>
-          <w:i/>
-          <w:iCs/>
-          <w:color w:val="00B050"/>
-          <w:lang w:val="en-US"/>
-        </w:rPr>
-        <w:t>env</w:t>
-      </w:r>
-      <w:r>
-        <w:rPr>
-          <w:rFonts w:ascii="Garamond" w:hAnsi="Garamond"/>
-          <w:b/>
-          <w:bCs/>
-          <w:i/>
-          <w:iCs/>
-          <w:color w:val="00B050"/>
-          <w:lang w:val="en-US"/>
-        </w:rPr>
-        <w:t>s</w:t>
-      </w:r>
-      <w:r>
-        <w:rPr>
-          <w:rFonts w:ascii="Garamond" w:hAnsi="Garamond"/>
-          <w:color w:val="00B050"/>
+        <w:t xml:space="preserve">Python environment as the active interpreter. </w:t>
+      </w:r>
+    </w:p>
+    <w:p>
+      <w:pPr>
+        <w:rPr>
+          <w:rFonts w:ascii="Garamond" w:hAnsi="Garamond"/>
+          <w:lang w:val="en-US"/>
+        </w:rPr>
+      </w:pPr>
+    </w:p>
+    <w:p>
+      <w:pPr>
+        <w:rPr>
+          <w:rFonts w:ascii="Garamond" w:hAnsi="Garamond"/>
+          <w:lang w:val="en-US"/>
+        </w:rPr>
+      </w:pPr>
+      <w:r>
+        <w:rPr>
+          <w:rFonts w:ascii="Garamond" w:hAnsi="Garamond"/>
+          <w:lang w:val="en-US"/>
+        </w:rPr>
+        <w:t>Further installation and setup information is provided in</w:t>
+      </w:r>
+      <w:r>
+        <w:rPr>
+          <w:rFonts w:ascii="Garamond" w:hAnsi="Garamond"/>
+          <w:lang w:val="en-US"/>
+        </w:rPr>
+        <w:t xml:space="preserve"> the </w:t>
+      </w:r>
+      <w:r>
+        <w:rPr>
+          <w:rFonts w:ascii="Garamond" w:hAnsi="Garamond"/>
+          <w:color w:val="808080" w:themeColor="background1" w:themeShade="80"/>
+          <w:lang w:val="en-US"/>
+        </w:rPr>
+        <w:t>README</w:t>
+      </w:r>
+      <w:r>
+        <w:rPr>
+          <w:rFonts w:ascii="Garamond" w:hAnsi="Garamond"/>
+          <w:color w:val="808080" w:themeColor="background1" w:themeShade="80"/>
           <w:lang w:val="en-US"/>
         </w:rPr>
         <w:t xml:space="preserve"> </w:t>
@@ -2529,309 +2815,6 @@
           <w:rFonts w:ascii="Garamond" w:hAnsi="Garamond"/>
           <w:lang w:val="en-US"/>
         </w:rPr>
-        <w:t>folder.</w:t>
-      </w:r>
-      <w:r>
-        <w:rPr>
-          <w:rFonts w:ascii="Garamond" w:hAnsi="Garamond"/>
-          <w:lang w:val="en-US"/>
-        </w:rPr>
-        <w:t xml:space="preserve"> </w:t>
-      </w:r>
-    </w:p>
-    <w:p>
-      <w:pPr>
-        <w:rPr>
-          <w:rFonts w:ascii="Garamond" w:hAnsi="Garamond"/>
-          <w:lang w:val="en-US"/>
-        </w:rPr>
-      </w:pPr>
-    </w:p>
-    <w:p>
-      <w:pPr>
-        <w:rPr>
-          <w:rFonts w:ascii="Garamond" w:hAnsi="Garamond"/>
-          <w:lang w:val="en-US"/>
-        </w:rPr>
-      </w:pPr>
-      <w:r>
-        <w:rPr>
-          <w:rFonts w:ascii="Garamond" w:hAnsi="Garamond"/>
-          <w:lang w:val="en-US"/>
-        </w:rPr>
-        <w:t xml:space="preserve">Open an Anaconda Prompt or terminal, navigate to the </w:t>
-      </w:r>
-      <w:r>
-        <w:rPr>
-          <w:rFonts w:ascii="Garamond" w:hAnsi="Garamond"/>
-          <w:b/>
-          <w:bCs/>
-          <w:i/>
-          <w:iCs/>
-          <w:color w:val="00B050"/>
-          <w:lang w:val="en-US"/>
-        </w:rPr>
-        <w:t>envs</w:t>
-      </w:r>
-      <w:r>
-        <w:rPr>
-          <w:rFonts w:ascii="Garamond" w:hAnsi="Garamond"/>
-          <w:color w:val="00B050"/>
-          <w:lang w:val="en-US"/>
-        </w:rPr>
-        <w:t xml:space="preserve"> </w:t>
-      </w:r>
-      <w:r>
-        <w:rPr>
-          <w:rFonts w:ascii="Garamond" w:hAnsi="Garamond"/>
-          <w:lang w:val="en-US"/>
-        </w:rPr>
-        <w:t>folder and create and activate the environment using the following commands.</w:t>
-      </w:r>
-    </w:p>
-    <w:p>
-      <w:pPr>
-        <w:rPr>
-          <w:rFonts w:ascii="Garamond" w:hAnsi="Garamond"/>
-          <w:lang w:val="en-US"/>
-        </w:rPr>
-      </w:pPr>
-    </w:p>
-    <w:p>
-      <w:pPr>
-        <w:rPr>
-          <w:rFonts w:ascii="Garamond" w:hAnsi="Garamond"/>
-          <w:i/>
-          <w:iCs/>
-          <w:color w:val="808080" w:themeColor="background1" w:themeShade="80"/>
-          <w:lang w:val="fr-BE"/>
-        </w:rPr>
-      </w:pPr>
-      <w:r>
-        <w:rPr>
-          <w:rFonts w:ascii="Garamond" w:hAnsi="Garamond"/>
-          <w:i/>
-          <w:iCs/>
-          <w:color w:val="808080" w:themeColor="background1" w:themeShade="80"/>
-          <w:lang w:val="fr-BE"/>
-        </w:rPr>
-        <w:t>c</w:t>
-      </w:r>
-      <w:r>
-        <w:rPr>
-          <w:rFonts w:ascii="Garamond" w:hAnsi="Garamond"/>
-          <w:i/>
-          <w:iCs/>
-          <w:color w:val="808080" w:themeColor="background1" w:themeShade="80"/>
-          <w:lang w:val="fr-BE"/>
-        </w:rPr>
-        <w:t xml:space="preserve">onda env create -f </w:t>
-      </w:r>
-      <w:r>
-        <w:rPr>
-          <w:rFonts w:ascii="Garamond" w:hAnsi="Garamond"/>
-          <w:i/>
-          <w:iCs/>
-          <w:color w:val="808080" w:themeColor="background1" w:themeShade="80"/>
-          <w:lang w:val="fr-BE"/>
-        </w:rPr>
-        <w:t>msr_environment</w:t>
-      </w:r>
-      <w:r>
-        <w:rPr>
-          <w:rFonts w:ascii="Garamond" w:hAnsi="Garamond"/>
-          <w:i/>
-          <w:iCs/>
-          <w:color w:val="808080" w:themeColor="background1" w:themeShade="80"/>
-          <w:lang w:val="fr-BE"/>
-        </w:rPr>
-        <w:t>.yaml</w:t>
-      </w:r>
-    </w:p>
-    <w:p>
-      <w:pPr>
-        <w:rPr>
-          <w:rFonts w:ascii="Garamond" w:hAnsi="Garamond"/>
-          <w:i/>
-          <w:iCs/>
-          <w:color w:val="808080" w:themeColor="background1" w:themeShade="80"/>
-          <w:lang w:val="en-US"/>
-        </w:rPr>
-      </w:pPr>
-      <w:r>
-        <w:rPr>
-          <w:rFonts w:ascii="Garamond" w:hAnsi="Garamond"/>
-          <w:i/>
-          <w:iCs/>
-          <w:color w:val="808080" w:themeColor="background1" w:themeShade="80"/>
-          <w:lang w:val="en-US"/>
-        </w:rPr>
-        <w:t>c</w:t>
-      </w:r>
-      <w:r>
-        <w:rPr>
-          <w:rFonts w:ascii="Garamond" w:hAnsi="Garamond"/>
-          <w:i/>
-          <w:iCs/>
-          <w:color w:val="808080" w:themeColor="background1" w:themeShade="80"/>
-          <w:lang w:val="en-US"/>
-        </w:rPr>
-        <w:t xml:space="preserve">onda activate </w:t>
-      </w:r>
-      <w:r>
-        <w:rPr>
-          <w:rFonts w:ascii="Garamond" w:hAnsi="Garamond"/>
-          <w:i/>
-          <w:iCs/>
-          <w:color w:val="808080" w:themeColor="background1" w:themeShade="80"/>
-          <w:lang w:val="en-US"/>
-        </w:rPr>
-        <w:t>mrs_env</w:t>
-      </w:r>
-    </w:p>
-    <w:p>
-      <w:pPr>
-        <w:rPr>
-          <w:rFonts w:ascii="Garamond" w:hAnsi="Garamond"/>
-          <w:lang w:val="en-US"/>
-        </w:rPr>
-      </w:pPr>
-    </w:p>
-    <w:p>
-      <w:pPr>
-        <w:rPr>
-          <w:rFonts w:ascii="Garamond" w:hAnsi="Garamond"/>
-          <w:lang w:val="en-US"/>
-        </w:rPr>
-      </w:pPr>
-      <w:r>
-        <w:rPr>
-          <w:rFonts w:ascii="Garamond" w:hAnsi="Garamond"/>
-          <w:lang w:val="en-US"/>
-        </w:rPr>
-        <w:t>Spyder</w:t>
-      </w:r>
-      <w:r>
-        <w:rPr>
-          <w:rFonts w:ascii="Garamond" w:hAnsi="Garamond"/>
-          <w:lang w:val="en-US"/>
-        </w:rPr>
-        <w:t xml:space="preserve"> is used as integrated development environment</w:t>
-      </w:r>
-      <w:r>
-        <w:rPr>
-          <w:rFonts w:ascii="Garamond" w:hAnsi="Garamond"/>
-          <w:lang w:val="en-US"/>
-        </w:rPr>
-        <w:t xml:space="preserve"> (IDE)</w:t>
-      </w:r>
-      <w:r>
-        <w:rPr>
-          <w:rFonts w:ascii="Garamond" w:hAnsi="Garamond"/>
-          <w:lang w:val="en-US"/>
-        </w:rPr>
-        <w:t xml:space="preserve"> for running the Python scripts. Open the MSR repository in </w:t>
-      </w:r>
-      <w:r>
-        <w:rPr>
-          <w:rFonts w:ascii="Garamond" w:hAnsi="Garamond"/>
-          <w:lang w:val="en-US"/>
-        </w:rPr>
-        <w:t>Spyder</w:t>
-      </w:r>
-      <w:r>
-        <w:rPr>
-          <w:rFonts w:ascii="Garamond" w:hAnsi="Garamond"/>
-          <w:lang w:val="en-US"/>
-        </w:rPr>
-        <w:t xml:space="preserve"> and select the </w:t>
-      </w:r>
-      <w:r>
-        <w:rPr>
-          <w:rFonts w:ascii="Garamond" w:hAnsi="Garamond"/>
-          <w:i/>
-          <w:iCs/>
-          <w:color w:val="07BCE3" w:themeColor="accent5" w:themeShade="BF"/>
-          <w:lang w:val="en-US"/>
-        </w:rPr>
-        <w:t>msr</w:t>
-      </w:r>
-      <w:r>
-        <w:rPr>
-          <w:rFonts w:ascii="Garamond" w:hAnsi="Garamond"/>
-          <w:i/>
-          <w:iCs/>
-          <w:color w:val="07BCE3" w:themeColor="accent5" w:themeShade="BF"/>
-          <w:lang w:val="en-US"/>
-        </w:rPr>
-        <w:t>_env</w:t>
-      </w:r>
-      <w:r>
-        <w:rPr>
-          <w:rFonts w:ascii="Garamond" w:hAnsi="Garamond"/>
-          <w:color w:val="07BCE3" w:themeColor="accent5" w:themeShade="BF"/>
-          <w:lang w:val="en-US"/>
-        </w:rPr>
-        <w:t xml:space="preserve"> </w:t>
-      </w:r>
-      <w:r>
-        <w:rPr>
-          <w:rFonts w:ascii="Garamond" w:hAnsi="Garamond"/>
-          <w:lang w:val="en-US"/>
-        </w:rPr>
-        <w:t xml:space="preserve">Python environment as the active interpreter. </w:t>
-      </w:r>
-    </w:p>
-    <w:p>
-      <w:pPr>
-        <w:rPr>
-          <w:rFonts w:ascii="Garamond" w:hAnsi="Garamond"/>
-          <w:lang w:val="en-US"/>
-        </w:rPr>
-      </w:pPr>
-    </w:p>
-    <w:p>
-      <w:pPr>
-        <w:rPr>
-          <w:rFonts w:ascii="Garamond" w:hAnsi="Garamond"/>
-          <w:lang w:val="en-US"/>
-        </w:rPr>
-      </w:pPr>
-      <w:r>
-        <w:rPr>
-          <w:rFonts w:ascii="Garamond" w:hAnsi="Garamond"/>
-          <w:lang w:val="en-US"/>
-        </w:rPr>
-        <w:t>Further installation and setup information is provided in</w:t>
-      </w:r>
-      <w:r>
-        <w:rPr>
-          <w:rFonts w:ascii="Garamond" w:hAnsi="Garamond"/>
-          <w:lang w:val="en-US"/>
-        </w:rPr>
-        <w:t xml:space="preserve"> the </w:t>
-      </w:r>
-      <w:r>
-        <w:rPr>
-          <w:rFonts w:ascii="Garamond" w:hAnsi="Garamond"/>
-          <w:color w:val="808080" w:themeColor="background1" w:themeShade="80"/>
-          <w:lang w:val="en-US"/>
-        </w:rPr>
-        <w:t>README</w:t>
-      </w:r>
-      <w:r>
-        <w:rPr>
-          <w:rFonts w:ascii="Garamond" w:hAnsi="Garamond"/>
-          <w:color w:val="808080" w:themeColor="background1" w:themeShade="80"/>
-          <w:lang w:val="en-US"/>
-        </w:rPr>
-        <w:t xml:space="preserve"> </w:t>
-      </w:r>
-      <w:r>
-        <w:rPr>
-          <w:rFonts w:ascii="Garamond" w:hAnsi="Garamond"/>
-          <w:lang w:val="en-US"/>
-        </w:rPr>
         <w:t>file.</w:t>
       </w:r>
     </w:p>
@@ -2851,7 +2834,7 @@
           <w:lang w:val="en-GB"/>
         </w:rPr>
       </w:pPr>
-      <w:bookmarkStart w:id="5" w:name="_Toc235198493"/>
+      <w:bookmarkStart w:id="4" w:name="_Toc235198493"/>
       <w:r>
         <w:rPr>
           <w:rFonts w:ascii="Garamond" w:hAnsi="Garamond"/>
@@ -2860,7 +2843,7 @@
         <w:lastRenderedPageBreak/>
         <w:t>Part 1.3: QGIS</w:t>
       </w:r>
-      <w:bookmarkEnd w:id="5"/>
+      <w:bookmarkEnd w:id="4"/>
     </w:p>
     <w:p>
       <w:pPr>
@@ -2889,33 +2872,7 @@
           <w:rFonts w:ascii="Garamond" w:hAnsi="Garamond"/>
           <w:lang w:val="en-US"/>
         </w:rPr>
-        <w:t xml:space="preserve"> </w:t>
-      </w:r>
-      <w:commentRangeStart w:id="6"/>
-      <w:r>
-        <w:rPr>
-          <w:rFonts w:ascii="Garamond" w:hAnsi="Garamond"/>
-          <w:lang w:val="en-US"/>
-        </w:rPr>
-        <w:t xml:space="preserve">visualise </w:t>
-      </w:r>
-      <w:commentRangeEnd w:id="6"/>
-      <w:r>
-        <w:rPr>
-          <w:rStyle w:val="CommentReference"/>
-          <w:rFonts w:ascii="Garamond" w:hAnsi="Garamond"/>
-          <w:sz w:val="22"/>
-          <w:szCs w:val="20"/>
-          <w:lang w:val="en-US"/>
-        </w:rPr>
-        <w:commentReference w:id="6"/>
-      </w:r>
-      <w:r>
-        <w:rPr>
-          <w:rFonts w:ascii="Garamond" w:hAnsi="Garamond"/>
-          <w:lang w:val="en-US"/>
-        </w:rPr>
-        <w:t>the spatial input data and the outputs generated by the MSR framework.</w:t>
+        <w:t xml:space="preserve"> visualise the spatial input data and the outputs generated by the MSR framework.</w:t>
       </w:r>
       <w:r>
         <w:rPr>
@@ -3036,7 +2993,7 @@
           <w:rFonts w:ascii="Garamond" w:hAnsi="Garamond"/>
         </w:rPr>
       </w:pPr>
-      <w:bookmarkStart w:id="7" w:name="_Toc235198494"/>
+      <w:bookmarkStart w:id="5" w:name="_Toc235198494"/>
       <w:r>
         <w:rPr>
           <w:rFonts w:ascii="Garamond" w:hAnsi="Garamond"/>
@@ -3056,7 +3013,7 @@
         </w:rPr>
         <w:t>Creator</w:t>
       </w:r>
-      <w:bookmarkEnd w:id="7"/>
+      <w:bookmarkEnd w:id="5"/>
     </w:p>
     <w:p>
       <w:pPr>
@@ -3133,7 +3090,21 @@
           <w:rFonts w:ascii="Garamond" w:hAnsi="Garamond"/>
           <w:lang w:val="en-US"/>
         </w:rPr>
-        <w:t>The workflow consist of six stages:</w:t>
+        <w:t xml:space="preserve">The workflow consist of </w:t>
+      </w:r>
+      <w:r>
+        <w:rPr>
+          <w:rFonts w:ascii="Garamond" w:hAnsi="Garamond"/>
+          <w:lang w:val="en-US"/>
+        </w:rPr>
+        <w:t>five</w:t>
+      </w:r>
+      <w:r>
+        <w:rPr>
+          <w:rFonts w:ascii="Garamond" w:hAnsi="Garamond"/>
+          <w:lang w:val="en-US"/>
+        </w:rPr>
+        <w:t xml:space="preserve"> stages:</w:t>
       </w:r>
     </w:p>
     <w:p>
@@ -3242,7 +3213,7 @@
           <w:rFonts w:ascii="Garamond" w:hAnsi="Garamond"/>
           <w:lang w:val="en-US"/>
         </w:rPr>
-        <w:t>Optionally relax resource thresholds in resource-lagging regions</w:t>
+        <w:t>Polygonise contiguous suitable areas</w:t>
       </w:r>
       <w:r>
         <w:rPr>
@@ -3269,7 +3240,49 @@
           <w:rFonts w:ascii="Garamond" w:hAnsi="Garamond"/>
           <w:lang w:val="en-US"/>
         </w:rPr>
-        <w:t>Polygonise contiguous suitable areas</w:t>
+        <w:t>Attribute the resulting MSRs with capacity, infrastructure-distance, load-centre, land</w:t>
+      </w:r>
+      <w:r>
+        <w:rPr>
+          <w:rFonts w:ascii="Garamond" w:hAnsi="Garamond"/>
+          <w:lang w:val="en-US"/>
+        </w:rPr>
+        <w:t>-</w:t>
+      </w:r>
+      <w:r>
+        <w:rPr>
+          <w:rFonts w:ascii="Garamond" w:hAnsi="Garamond"/>
+          <w:lang w:val="en-US"/>
+        </w:rPr>
+        <w:t>cover</w:t>
+      </w:r>
+      <w:r>
+        <w:rPr>
+          <w:rFonts w:ascii="Garamond" w:hAnsi="Garamond"/>
+          <w:lang w:val="en-US"/>
+        </w:rPr>
+        <w:t xml:space="preserve"> class</w:t>
+      </w:r>
+      <w:r>
+        <w:rPr>
+          <w:rFonts w:ascii="Garamond" w:hAnsi="Garamond"/>
+          <w:lang w:val="en-US"/>
+        </w:rPr>
+        <w:t>, climate</w:t>
+      </w:r>
+      <w:r>
+        <w:rPr>
+          <w:rFonts w:ascii="Garamond" w:hAnsi="Garamond"/>
+          <w:lang w:val="en-US"/>
+        </w:rPr>
+        <w:t xml:space="preserve"> class</w:t>
+      </w:r>
+      <w:r>
+        <w:rPr>
+          <w:rFonts w:ascii="Garamond" w:hAnsi="Garamond"/>
+          <w:lang w:val="en-US"/>
+        </w:rPr>
+        <w:t xml:space="preserve"> and elevation metrics</w:t>
       </w:r>
       <w:r>
         <w:rPr>
@@ -3282,75 +3295,6 @@
     <w:p>
       <w:pPr>
         <w:pStyle w:val="ListParagraph"/>
-        <w:numPr>
-          <w:ilvl w:val="0"/>
-          <w:numId w:val="3"/>
-        </w:numPr>
-        <w:rPr>
-          <w:rFonts w:ascii="Garamond" w:hAnsi="Garamond"/>
-          <w:lang w:val="en-US"/>
-        </w:rPr>
-      </w:pPr>
-      <w:r>
-        <w:rPr>
-          <w:rFonts w:ascii="Garamond" w:hAnsi="Garamond"/>
-          <w:lang w:val="en-US"/>
-        </w:rPr>
-        <w:t>Attribute the resulting MSRs with capacity, infrastructure-distance, load-centre, land</w:t>
-      </w:r>
-      <w:r>
-        <w:rPr>
-          <w:rFonts w:ascii="Garamond" w:hAnsi="Garamond"/>
-          <w:lang w:val="en-US"/>
-        </w:rPr>
-        <w:t>-</w:t>
-      </w:r>
-      <w:r>
-        <w:rPr>
-          <w:rFonts w:ascii="Garamond" w:hAnsi="Garamond"/>
-          <w:lang w:val="en-US"/>
-        </w:rPr>
-        <w:t>cover</w:t>
-      </w:r>
-      <w:r>
-        <w:rPr>
-          <w:rFonts w:ascii="Garamond" w:hAnsi="Garamond"/>
-          <w:lang w:val="en-US"/>
-        </w:rPr>
-        <w:t xml:space="preserve"> class</w:t>
-      </w:r>
-      <w:r>
-        <w:rPr>
-          <w:rFonts w:ascii="Garamond" w:hAnsi="Garamond"/>
-          <w:lang w:val="en-US"/>
-        </w:rPr>
-        <w:t>, climate</w:t>
-      </w:r>
-      <w:r>
-        <w:rPr>
-          <w:rFonts w:ascii="Garamond" w:hAnsi="Garamond"/>
-          <w:lang w:val="en-US"/>
-        </w:rPr>
-        <w:t xml:space="preserve"> class</w:t>
-      </w:r>
-      <w:r>
-        <w:rPr>
-          <w:rFonts w:ascii="Garamond" w:hAnsi="Garamond"/>
-          <w:lang w:val="en-US"/>
-        </w:rPr>
-        <w:t xml:space="preserve"> and elevation metrics</w:t>
-      </w:r>
-      <w:r>
-        <w:rPr>
-          <w:rFonts w:ascii="Garamond" w:hAnsi="Garamond"/>
-          <w:lang w:val="en-US"/>
-        </w:rPr>
-        <w:t>.</w:t>
-      </w:r>
-    </w:p>
-    <w:p>
-      <w:pPr>
-        <w:pStyle w:val="ListParagraph"/>
         <w:rPr>
           <w:rFonts w:ascii="Garamond" w:hAnsi="Garamond"/>
           <w:lang w:val="en-US"/>
@@ -3365,8 +3309,8 @@
           <w:lang w:val="en-GB"/>
         </w:rPr>
       </w:pPr>
-      <w:bookmarkStart w:id="8" w:name="_Ref235115238"/>
-      <w:bookmarkStart w:id="9" w:name="_Toc235198495"/>
+      <w:bookmarkStart w:id="6" w:name="_Ref235115238"/>
+      <w:bookmarkStart w:id="7" w:name="_Toc235198495"/>
       <w:r>
         <w:rPr>
           <w:rFonts w:ascii="Garamond" w:hAnsi="Garamond"/>
@@ -3381,8 +3325,8 @@
         </w:rPr>
         <w:t xml:space="preserve"> regional geospatial inputs</w:t>
       </w:r>
-      <w:bookmarkEnd w:id="8"/>
-      <w:bookmarkEnd w:id="9"/>
+      <w:bookmarkEnd w:id="6"/>
+      <w:bookmarkEnd w:id="7"/>
     </w:p>
     <w:p>
       <w:pPr>
@@ -4104,7 +4048,7 @@
                     <pic:cNvPicPr/>
                   </pic:nvPicPr>
                   <pic:blipFill rotWithShape="1">
-                    <a:blip r:embed="rId10" cstate="print">
+                    <a:blip r:embed="rId6" cstate="print">
                       <a:extLst>
                         <a:ext uri="{28A0092B-C50C-407E-A947-70E740481C1C}">
                           <a14:useLocalDpi xmlns:a14="http://schemas.microsoft.com/office/drawing/2010/main" val="0"/>
@@ -4160,7 +4104,7 @@
                     <pic:cNvPicPr/>
                   </pic:nvPicPr>
                   <pic:blipFill rotWithShape="1">
-                    <a:blip r:embed="rId11" cstate="print">
+                    <a:blip r:embed="rId7" cstate="print">
                       <a:extLst>
                         <a:ext uri="{28A0092B-C50C-407E-A947-70E740481C1C}">
                           <a14:useLocalDpi xmlns:a14="http://schemas.microsoft.com/office/drawing/2010/main" val="0"/>
@@ -4216,7 +4160,7 @@
           <w:szCs w:val="16"/>
         </w:rPr>
       </w:pPr>
-      <w:bookmarkStart w:id="10" w:name="_Ref235105585"/>
+      <w:bookmarkStart w:id="8" w:name="_Ref235105585"/>
       <w:r>
         <w:rPr>
           <w:rFonts w:ascii="Garamond" w:hAnsi="Garamond"/>
@@ -4285,7 +4229,7 @@
         </w:rPr>
         <w:fldChar w:fldCharType="end"/>
       </w:r>
-      <w:bookmarkEnd w:id="10"/>
+      <w:bookmarkEnd w:id="8"/>
       <w:r>
         <w:rPr>
           <w:rFonts w:ascii="Garamond" w:hAnsi="Garamond"/>
@@ -4436,7 +4380,7 @@
                     <pic:cNvPicPr/>
                   </pic:nvPicPr>
                   <pic:blipFill rotWithShape="1">
-                    <a:blip r:embed="rId12" cstate="print">
+                    <a:blip r:embed="rId8" cstate="print">
                       <a:extLst>
                         <a:ext uri="{28A0092B-C50C-407E-A947-70E740481C1C}">
                           <a14:useLocalDpi xmlns:a14="http://schemas.microsoft.com/office/drawing/2010/main" val="0"/>
@@ -4492,7 +4436,7 @@
                     <pic:cNvPicPr/>
                   </pic:nvPicPr>
                   <pic:blipFill rotWithShape="1">
-                    <a:blip r:embed="rId13" cstate="print">
+                    <a:blip r:embed="rId9" cstate="print">
                       <a:extLst>
                         <a:ext uri="{28A0092B-C50C-407E-A947-70E740481C1C}">
                           <a14:useLocalDpi xmlns:a14="http://schemas.microsoft.com/office/drawing/2010/main" val="0"/>
@@ -4548,7 +4492,7 @@
           <w:szCs w:val="16"/>
         </w:rPr>
       </w:pPr>
-      <w:bookmarkStart w:id="11" w:name="_Ref235106124"/>
+      <w:bookmarkStart w:id="9" w:name="_Ref235106124"/>
       <w:r>
         <w:rPr>
           <w:rFonts w:ascii="Garamond" w:hAnsi="Garamond"/>
@@ -4617,7 +4561,7 @@
         </w:rPr>
         <w:fldChar w:fldCharType="end"/>
       </w:r>
-      <w:bookmarkEnd w:id="11"/>
+      <w:bookmarkEnd w:id="9"/>
       <w:r>
         <w:rPr>
           <w:rFonts w:ascii="Garamond" w:hAnsi="Garamond"/>
@@ -4808,7 +4752,7 @@
                     <pic:cNvPicPr/>
                   </pic:nvPicPr>
                   <pic:blipFill rotWithShape="1">
-                    <a:blip r:embed="rId14" cstate="print">
+                    <a:blip r:embed="rId10" cstate="print">
                       <a:extLst>
                         <a:ext uri="{28A0092B-C50C-407E-A947-70E740481C1C}">
                           <a14:useLocalDpi xmlns:a14="http://schemas.microsoft.com/office/drawing/2010/main" val="0"/>
@@ -4864,7 +4808,7 @@
                     <pic:cNvPicPr/>
                   </pic:nvPicPr>
                   <pic:blipFill rotWithShape="1">
-                    <a:blip r:embed="rId15" cstate="print">
+                    <a:blip r:embed="rId11" cstate="print">
                       <a:extLst>
                         <a:ext uri="{28A0092B-C50C-407E-A947-70E740481C1C}">
                           <a14:useLocalDpi xmlns:a14="http://schemas.microsoft.com/office/drawing/2010/main" val="0"/>
@@ -4920,7 +4864,7 @@
                     <pic:cNvPicPr/>
                   </pic:nvPicPr>
                   <pic:blipFill rotWithShape="1">
-                    <a:blip r:embed="rId16" cstate="print">
+                    <a:blip r:embed="rId12" cstate="print">
                       <a:extLst>
                         <a:ext uri="{28A0092B-C50C-407E-A947-70E740481C1C}">
                           <a14:useLocalDpi xmlns:a14="http://schemas.microsoft.com/office/drawing/2010/main" val="0"/>
@@ -4976,7 +4920,7 @@
           <w:szCs w:val="16"/>
         </w:rPr>
       </w:pPr>
-      <w:bookmarkStart w:id="12" w:name="_Ref235198926"/>
+      <w:bookmarkStart w:id="10" w:name="_Ref235198926"/>
       <w:r>
         <w:rPr>
           <w:rFonts w:ascii="Garamond" w:hAnsi="Garamond"/>
@@ -5045,84 +4989,84 @@
         </w:rPr>
         <w:fldChar w:fldCharType="end"/>
       </w:r>
+      <w:bookmarkEnd w:id="10"/>
+      <w:r>
+        <w:rPr>
+          <w:rFonts w:ascii="Garamond" w:hAnsi="Garamond"/>
+          <w:sz w:val="18"/>
+          <w:szCs w:val="16"/>
+        </w:rPr>
+        <w:t xml:space="preserve">: a) Köppen-Geiger climate </w:t>
+      </w:r>
+      <w:r>
+        <w:rPr>
+          <w:rFonts w:ascii="Garamond" w:hAnsi="Garamond"/>
+          <w:sz w:val="18"/>
+          <w:szCs w:val="16"/>
+        </w:rPr>
+        <w:t>classes</w:t>
+      </w:r>
+      <w:r>
+        <w:rPr>
+          <w:rFonts w:ascii="Garamond" w:hAnsi="Garamond"/>
+          <w:sz w:val="18"/>
+          <w:szCs w:val="16"/>
+        </w:rPr>
+        <w:t xml:space="preserve"> in Ecuador. b) Land-</w:t>
+      </w:r>
+      <w:r>
+        <w:rPr>
+          <w:rFonts w:ascii="Garamond" w:hAnsi="Garamond"/>
+          <w:sz w:val="18"/>
+          <w:szCs w:val="16"/>
+        </w:rPr>
+        <w:t>cover classes</w:t>
+      </w:r>
+      <w:r>
+        <w:rPr>
+          <w:rFonts w:ascii="Garamond" w:hAnsi="Garamond"/>
+          <w:sz w:val="18"/>
+          <w:szCs w:val="16"/>
+        </w:rPr>
+        <w:t xml:space="preserve"> in Ecuador</w:t>
+      </w:r>
+      <w:r>
+        <w:rPr>
+          <w:rFonts w:ascii="Garamond" w:hAnsi="Garamond"/>
+          <w:sz w:val="18"/>
+          <w:szCs w:val="16"/>
+        </w:rPr>
+        <w:t xml:space="preserve"> from ESA GlobCover</w:t>
+      </w:r>
+      <w:r>
+        <w:rPr>
+          <w:rFonts w:ascii="Garamond" w:hAnsi="Garamond"/>
+          <w:sz w:val="18"/>
+          <w:szCs w:val="16"/>
+        </w:rPr>
+        <w:t>.</w:t>
+      </w:r>
+    </w:p>
+    <w:p/>
+    <w:p>
+      <w:pPr>
+        <w:pStyle w:val="Heading3"/>
+        <w:rPr>
+          <w:rFonts w:ascii="Garamond" w:hAnsi="Garamond"/>
+          <w:lang w:val="en-GB"/>
+        </w:rPr>
+      </w:pPr>
+      <w:bookmarkStart w:id="11" w:name="_Ref235115185"/>
+      <w:bookmarkStart w:id="12" w:name="_Toc235198496"/>
+      <w:r>
+        <w:rPr>
+          <w:rFonts w:ascii="Garamond" w:hAnsi="Garamond"/>
+          <w:lang w:val="en-GB"/>
+        </w:rPr>
+        <w:t>Part 2.2: Exclusion criteria</w:t>
+      </w:r>
+      <w:bookmarkEnd w:id="11"/>
       <w:bookmarkEnd w:id="12"/>
-      <w:r>
-        <w:rPr>
-          <w:rFonts w:ascii="Garamond" w:hAnsi="Garamond"/>
-          <w:sz w:val="18"/>
-          <w:szCs w:val="16"/>
-        </w:rPr>
-        <w:t xml:space="preserve">: a) Köppen-Geiger climate </w:t>
-      </w:r>
-      <w:r>
-        <w:rPr>
-          <w:rFonts w:ascii="Garamond" w:hAnsi="Garamond"/>
-          <w:sz w:val="18"/>
-          <w:szCs w:val="16"/>
-        </w:rPr>
-        <w:t>classes</w:t>
-      </w:r>
-      <w:r>
-        <w:rPr>
-          <w:rFonts w:ascii="Garamond" w:hAnsi="Garamond"/>
-          <w:sz w:val="18"/>
-          <w:szCs w:val="16"/>
-        </w:rPr>
-        <w:t xml:space="preserve"> in Ecuador. b) Land-</w:t>
-      </w:r>
-      <w:r>
-        <w:rPr>
-          <w:rFonts w:ascii="Garamond" w:hAnsi="Garamond"/>
-          <w:sz w:val="18"/>
-          <w:szCs w:val="16"/>
-        </w:rPr>
-        <w:t>cover classes</w:t>
-      </w:r>
-      <w:r>
-        <w:rPr>
-          <w:rFonts w:ascii="Garamond" w:hAnsi="Garamond"/>
-          <w:sz w:val="18"/>
-          <w:szCs w:val="16"/>
-        </w:rPr>
-        <w:t xml:space="preserve"> in Ecuador</w:t>
-      </w:r>
-      <w:r>
-        <w:rPr>
-          <w:rFonts w:ascii="Garamond" w:hAnsi="Garamond"/>
-          <w:sz w:val="18"/>
-          <w:szCs w:val="16"/>
-        </w:rPr>
-        <w:t xml:space="preserve"> from ESA GlobCover</w:t>
-      </w:r>
-      <w:r>
-        <w:rPr>
-          <w:rFonts w:ascii="Garamond" w:hAnsi="Garamond"/>
-          <w:sz w:val="18"/>
-          <w:szCs w:val="16"/>
-        </w:rPr>
-        <w:t>.</w:t>
-      </w:r>
-    </w:p>
-    <w:p/>
-    <w:p>
-      <w:pPr>
-        <w:pStyle w:val="Heading3"/>
-        <w:rPr>
-          <w:rFonts w:ascii="Garamond" w:hAnsi="Garamond"/>
-          <w:lang w:val="en-GB"/>
-        </w:rPr>
-      </w:pPr>
-      <w:bookmarkStart w:id="13" w:name="_Ref235115185"/>
-      <w:bookmarkStart w:id="14" w:name="_Toc235198496"/>
-      <w:r>
-        <w:rPr>
-          <w:rFonts w:ascii="Garamond" w:hAnsi="Garamond"/>
-          <w:lang w:val="en-GB"/>
-        </w:rPr>
-        <w:t>Part 2.2: Exclusion criteria</w:t>
-      </w:r>
-      <w:bookmarkEnd w:id="13"/>
-      <w:bookmarkEnd w:id="14"/>
     </w:p>
     <w:p>
       <w:pPr>
@@ -5703,7 +5647,7 @@
                     <pic:cNvPicPr/>
                   </pic:nvPicPr>
                   <pic:blipFill rotWithShape="1">
-                    <a:blip r:embed="rId17" cstate="print">
+                    <a:blip r:embed="rId13" cstate="print">
                       <a:extLst>
                         <a:ext uri="{28A0092B-C50C-407E-A947-70E740481C1C}">
                           <a14:useLocalDpi xmlns:a14="http://schemas.microsoft.com/office/drawing/2010/main" val="0"/>
@@ -5760,7 +5704,7 @@
                     <pic:cNvPicPr/>
                   </pic:nvPicPr>
                   <pic:blipFill rotWithShape="1">
-                    <a:blip r:embed="rId18" cstate="print">
+                    <a:blip r:embed="rId14" cstate="print">
                       <a:extLst>
                         <a:ext uri="{28A0092B-C50C-407E-A947-70E740481C1C}">
                           <a14:useLocalDpi xmlns:a14="http://schemas.microsoft.com/office/drawing/2010/main" val="0"/>
@@ -5808,7 +5752,7 @@
           <w:lang w:val="en-US"/>
         </w:rPr>
       </w:pPr>
-      <w:bookmarkStart w:id="15" w:name="_Ref235109556"/>
+      <w:bookmarkStart w:id="13" w:name="_Ref235109556"/>
       <w:r>
         <w:rPr>
           <w:rFonts w:ascii="Garamond" w:hAnsi="Garamond"/>
@@ -5877,7 +5821,7 @@
         </w:rPr>
         <w:fldChar w:fldCharType="end"/>
       </w:r>
-      <w:bookmarkEnd w:id="15"/>
+      <w:bookmarkEnd w:id="13"/>
       <w:r>
         <w:rPr>
           <w:rFonts w:ascii="Garamond" w:hAnsi="Garamond"/>
@@ -5903,7 +5847,7 @@
           <w:lang w:val="en-GB"/>
         </w:rPr>
       </w:pPr>
-      <w:bookmarkStart w:id="16" w:name="_Toc235198497"/>
+      <w:bookmarkStart w:id="14" w:name="_Toc235198497"/>
       <w:r>
         <w:rPr>
           <w:rFonts w:ascii="Garamond" w:hAnsi="Garamond"/>
@@ -5925,7 +5869,7 @@
         </w:rPr>
         <w:t>: Setting up the control file</w:t>
       </w:r>
-      <w:bookmarkEnd w:id="16"/>
+      <w:bookmarkEnd w:id="14"/>
     </w:p>
     <w:p>
       <w:pPr>
@@ -6324,7 +6268,6 @@
         </w:rPr>
         <w:t xml:space="preserve">and </w:t>
       </w:r>
-      <w:commentRangeStart w:id="17"/>
       <w:r>
         <w:rPr>
           <w:rFonts w:ascii="Garamond" w:hAnsi="Garamond"/>
@@ -6345,17 +6288,6 @@
         </w:rPr>
         <w:t xml:space="preserve"> </w:t>
       </w:r>
-      <w:commentRangeEnd w:id="17"/>
-      <w:r>
-        <w:rPr>
-          <w:rStyle w:val="CommentReference"/>
-          <w:rFonts w:ascii="Garamond" w:hAnsi="Garamond"/>
-          <w:sz w:val="22"/>
-          <w:szCs w:val="20"/>
-          <w:lang w:val="en-US"/>
-        </w:rPr>
-        <w:commentReference w:id="17"/>
-      </w:r>
       <w:r>
         <w:rPr>
           <w:rFonts w:ascii="Garamond" w:hAnsi="Garamond"/>
@@ -7078,7 +7010,7 @@
           <w:color w:val="00B050"/>
           <w:lang w:val="en-US"/>
         </w:rPr>
-        <w:t>5</w:t>
+        <w:t>4</w:t>
       </w:r>
       <w:r>
         <w:rPr>
@@ -7103,67 +7035,470 @@
           <w:color w:val="00B050"/>
           <w:lang w:val="en-US"/>
         </w:rPr>
-        <w:t>6</w:t>
-      </w:r>
-      <w:r>
-        <w:rPr>
-          <w:rFonts w:ascii="Garamond" w:hAnsi="Garamond"/>
-          <w:lang w:val="en-US"/>
-        </w:rPr>
-        <w:t>. Leave the optional resource-threshold relaxation stage</w:t>
+        <w:t>5</w:t>
+      </w:r>
+      <w:r>
+        <w:rPr>
+          <w:rFonts w:ascii="Garamond" w:hAnsi="Garamond"/>
+          <w:lang w:val="en-US"/>
+        </w:rPr>
+        <w:t xml:space="preserve">. </w:t>
+      </w:r>
+    </w:p>
+    <w:p>
+      <w:pPr>
+        <w:rPr>
+          <w:rFonts w:ascii="Garamond" w:hAnsi="Garamond"/>
+          <w:lang w:val="en-US"/>
+        </w:rPr>
+      </w:pPr>
+    </w:p>
+    <w:p>
+      <w:pPr>
+        <w:rPr>
+          <w:rFonts w:ascii="Garamond" w:hAnsi="Garamond"/>
+          <w:lang w:val="en-US"/>
+        </w:rPr>
+      </w:pPr>
+      <w:r>
+        <w:rPr>
+          <w:rFonts w:ascii="Segoe UI Emoji" w:hAnsi="Segoe UI Emoji" w:cs="Segoe UI Emoji"/>
+          <w:lang w:val="en-US"/>
+        </w:rPr>
+        <w:t>👉🏼</w:t>
+      </w:r>
+      <w:r>
+        <w:rPr>
+          <w:rFonts w:ascii="Segoe UI Emoji" w:hAnsi="Segoe UI Emoji" w:cs="Segoe UI Emoji"/>
+          <w:lang w:val="en-US"/>
+        </w:rPr>
+        <w:t xml:space="preserve"> </w:t>
+      </w:r>
+      <w:r>
+        <w:rPr>
+          <w:rFonts w:ascii="Garamond" w:hAnsi="Garamond"/>
+          <w:lang w:val="en-US"/>
+        </w:rPr>
+        <w:t xml:space="preserve">Go to the </w:t>
       </w:r>
       <w:r>
         <w:rPr>
           <w:rFonts w:ascii="Garamond" w:hAnsi="Garamond"/>
           <w:i/>
           <w:iCs/>
-          <w:lang w:val="en-US"/>
-        </w:rPr>
-        <w:t xml:space="preserve">, </w:t>
-      </w:r>
-      <w:r>
-        <w:rPr>
-          <w:rFonts w:ascii="Garamond" w:hAnsi="Garamond"/>
+          <w:color w:val="00B0F0"/>
+          <w:lang w:val="en-US"/>
+        </w:rPr>
+        <w:t>parameters</w:t>
+      </w:r>
+      <w:r>
+        <w:rPr>
+          <w:rFonts w:ascii="Garamond" w:hAnsi="Garamond"/>
+          <w:color w:val="00B0F0"/>
+          <w:lang w:val="en-US"/>
+        </w:rPr>
+        <w:t xml:space="preserve"> </w:t>
+      </w:r>
+      <w:r>
+        <w:rPr>
+          <w:rFonts w:ascii="Garamond" w:hAnsi="Garamond"/>
+          <w:lang w:val="en-US"/>
+        </w:rPr>
+        <w:t>worksheet</w:t>
+      </w:r>
+      <w:r>
+        <w:rPr>
+          <w:rFonts w:ascii="Garamond" w:hAnsi="Garamond"/>
+          <w:lang w:val="en-US"/>
+        </w:rPr>
+        <w:t>.</w:t>
+      </w:r>
+    </w:p>
+    <w:p>
+      <w:pPr>
+        <w:rPr>
+          <w:rFonts w:ascii="Garamond" w:hAnsi="Garamond"/>
+          <w:lang w:val="en-US"/>
+        </w:rPr>
+      </w:pPr>
+    </w:p>
+    <w:p>
+      <w:pPr>
+        <w:rPr>
+          <w:rFonts w:ascii="Garamond" w:hAnsi="Garamond"/>
+          <w:lang w:val="en-US"/>
+        </w:rPr>
+      </w:pPr>
+      <w:r>
+        <w:rPr>
+          <w:rFonts w:ascii="Garamond" w:hAnsi="Garamond"/>
+          <w:lang w:val="en-US"/>
+        </w:rPr>
+        <w:t xml:space="preserve">This worksheet </w:t>
+      </w:r>
+      <w:r>
+        <w:rPr>
+          <w:rFonts w:ascii="Garamond" w:hAnsi="Garamond"/>
+          <w:lang w:val="en-US"/>
+        </w:rPr>
+        <w:t>specifies</w:t>
+      </w:r>
+      <w:r>
+        <w:rPr>
+          <w:rFonts w:ascii="Garamond" w:hAnsi="Garamond"/>
+          <w:lang w:val="en-US"/>
+        </w:rPr>
+        <w:t xml:space="preserve"> general and technology</w:t>
+      </w:r>
+      <w:r>
+        <w:rPr>
+          <w:rFonts w:ascii="Garamond" w:hAnsi="Garamond"/>
+          <w:lang w:val="en-US"/>
+        </w:rPr>
+        <w:t>-</w:t>
+      </w:r>
+      <w:r>
+        <w:rPr>
+          <w:rFonts w:ascii="Garamond" w:hAnsi="Garamond"/>
+          <w:lang w:val="en-US"/>
+        </w:rPr>
+        <w:t>specific parameters</w:t>
+      </w:r>
+      <w:r>
+        <w:rPr>
+          <w:rFonts w:ascii="Garamond" w:hAnsi="Garamond"/>
+          <w:lang w:val="en-US"/>
+        </w:rPr>
+        <w:t xml:space="preserve">, including resource </w:t>
+      </w:r>
+      <w:r>
+        <w:rPr>
+          <w:rFonts w:ascii="Garamond" w:hAnsi="Garamond"/>
+          <w:lang w:val="en-US"/>
+        </w:rPr>
+        <w:t>thresholds</w:t>
+      </w:r>
+      <w:r>
+        <w:rPr>
+          <w:rFonts w:ascii="Garamond" w:hAnsi="Garamond"/>
+          <w:lang w:val="en-US"/>
+        </w:rPr>
+        <w:t>, slope and elevation limits, population thresholds, suitable land-cover classes, minimum and maximum MSR capacities, etc</w:t>
+      </w:r>
+      <w:r>
+        <w:rPr>
+          <w:rFonts w:ascii="Garamond" w:hAnsi="Garamond"/>
+          <w:lang w:val="en-US"/>
+        </w:rPr>
+        <w:t>.</w:t>
+      </w:r>
+      <w:r>
+        <w:rPr>
+          <w:rFonts w:ascii="Garamond" w:hAnsi="Garamond"/>
+          <w:lang w:val="en-US"/>
+        </w:rPr>
+        <w:t xml:space="preserve"> as discussed in </w:t>
+      </w:r>
+      <w:r>
+        <w:rPr>
+          <w:rFonts w:ascii="Garamond" w:hAnsi="Garamond"/>
+          <w:b/>
+          <w:bCs/>
+          <w:lang w:val="en-US"/>
+        </w:rPr>
+        <w:fldChar w:fldCharType="begin"/>
+      </w:r>
+      <w:r>
+        <w:rPr>
+          <w:rFonts w:ascii="Garamond" w:hAnsi="Garamond"/>
+          <w:b/>
+          <w:bCs/>
+          <w:lang w:val="en-US"/>
+        </w:rPr>
+        <w:instrText xml:space="preserve"> REF _Ref235115185 \h </w:instrText>
+      </w:r>
+      <w:r>
+        <w:rPr>
+          <w:rFonts w:ascii="Garamond" w:hAnsi="Garamond"/>
+          <w:b/>
+          <w:bCs/>
+          <w:lang w:val="en-US"/>
+        </w:rPr>
+        <w:instrText xml:space="preserve"> \* MERGEFORMAT </w:instrText>
+      </w:r>
+      <w:r>
+        <w:rPr>
+          <w:rFonts w:ascii="Garamond" w:hAnsi="Garamond"/>
+          <w:b/>
+          <w:bCs/>
+          <w:lang w:val="en-US"/>
+        </w:rPr>
+      </w:r>
+      <w:r>
+        <w:rPr>
+          <w:rFonts w:ascii="Garamond" w:hAnsi="Garamond"/>
+          <w:b/>
+          <w:bCs/>
+          <w:lang w:val="en-US"/>
+        </w:rPr>
+        <w:fldChar w:fldCharType="separate"/>
+      </w:r>
+      <w:r>
+        <w:rPr>
+          <w:rFonts w:ascii="Garamond" w:hAnsi="Garamond"/>
+          <w:b/>
+          <w:bCs/>
+          <w:lang w:val="en-US"/>
+        </w:rPr>
+        <w:t>Part 2.2: Exclusion criteria</w:t>
+      </w:r>
+      <w:r>
+        <w:rPr>
+          <w:rFonts w:ascii="Garamond" w:hAnsi="Garamond"/>
+          <w:b/>
+          <w:bCs/>
+          <w:lang w:val="en-US"/>
+        </w:rPr>
+        <w:fldChar w:fldCharType="end"/>
+      </w:r>
+      <w:r>
+        <w:rPr>
+          <w:rFonts w:ascii="Garamond" w:hAnsi="Garamond"/>
+          <w:lang w:val="en-US"/>
+        </w:rPr>
+        <w:t>.</w:t>
+      </w:r>
+      <w:r>
+        <w:rPr>
+          <w:rFonts w:ascii="Garamond" w:hAnsi="Garamond"/>
+          <w:lang w:val="en-US"/>
+        </w:rPr>
+        <w:t xml:space="preserve"> </w:t>
+      </w:r>
+      <w:r>
+        <w:rPr>
+          <w:rFonts w:ascii="Garamond" w:hAnsi="Garamond"/>
+          <w:lang w:val="en-US"/>
+        </w:rPr>
+        <w:t xml:space="preserve">The parameters required for this exercise are listed in </w:t>
+      </w:r>
+      <w:r>
+        <w:rPr>
+          <w:rFonts w:ascii="Garamond" w:hAnsi="Garamond"/>
+          <w:b/>
+          <w:bCs/>
+          <w:i/>
+          <w:iCs/>
+          <w:color w:val="FF6700" w:themeColor="accent3"/>
+          <w:lang w:val="en-US"/>
+        </w:rPr>
+        <w:t>training_parameters.xlsx</w:t>
+      </w:r>
+      <w:r>
+        <w:rPr>
+          <w:rFonts w:ascii="Garamond" w:hAnsi="Garamond"/>
+          <w:lang w:val="en-US"/>
+        </w:rPr>
+        <w:t xml:space="preserve"> </w:t>
+      </w:r>
+      <w:r>
+        <w:rPr>
+          <w:rFonts w:ascii="Garamond" w:hAnsi="Garamond"/>
+          <w:lang w:val="en-US"/>
+        </w:rPr>
+        <w:sym w:font="Wingdings" w:char="F0E0"/>
+      </w:r>
+      <w:r>
+        <w:rPr>
+          <w:rFonts w:ascii="Garamond" w:hAnsi="Garamond"/>
+          <w:lang w:val="en-US"/>
+        </w:rPr>
+        <w:t xml:space="preserve"> </w:t>
+      </w:r>
+      <w:r>
+        <w:rPr>
+          <w:rFonts w:ascii="Garamond" w:hAnsi="Garamond"/>
+          <w:i/>
+          <w:iCs/>
+          <w:color w:val="00B0F0"/>
+          <w:lang w:val="en-US"/>
+        </w:rPr>
+        <w:t>msr_creator</w:t>
+      </w:r>
+      <w:r>
+        <w:rPr>
+          <w:rFonts w:ascii="Garamond" w:hAnsi="Garamond"/>
+          <w:color w:val="00B0F0"/>
+          <w:lang w:val="en-US"/>
+        </w:rPr>
+        <w:t xml:space="preserve"> </w:t>
+      </w:r>
+      <w:r>
+        <w:rPr>
+          <w:rFonts w:ascii="Garamond" w:hAnsi="Garamond"/>
+          <w:lang w:val="en-US"/>
+        </w:rPr>
+        <w:t xml:space="preserve">worksheet. The parameters are arranged in the correct order and can be copied directly into the </w:t>
+      </w:r>
+      <w:r>
+        <w:rPr>
+          <w:rFonts w:ascii="Garamond" w:hAnsi="Garamond"/>
+          <w:i/>
+          <w:iCs/>
+          <w:lang w:val="en-US"/>
+        </w:rPr>
+        <w:t>value</w:t>
+      </w:r>
+      <w:r>
+        <w:rPr>
+          <w:rFonts w:ascii="Garamond" w:hAnsi="Garamond"/>
+          <w:lang w:val="en-US"/>
+        </w:rPr>
+        <w:t xml:space="preserve"> column of the </w:t>
+      </w:r>
+      <w:r>
+        <w:rPr>
+          <w:rFonts w:ascii="Garamond" w:hAnsi="Garamond"/>
+          <w:b/>
+          <w:bCs/>
+          <w:i/>
+          <w:iCs/>
+          <w:color w:val="FF6700" w:themeColor="accent3"/>
+          <w:lang w:val="en-US"/>
+        </w:rPr>
+        <w:t>control file</w:t>
+      </w:r>
+      <w:r>
+        <w:rPr>
+          <w:rFonts w:ascii="Garamond" w:hAnsi="Garamond"/>
+          <w:lang w:val="en-US"/>
+        </w:rPr>
+        <w:t xml:space="preserve">. </w:t>
+      </w:r>
+    </w:p>
+    <w:p>
+      <w:pPr>
+        <w:pStyle w:val="Heading3"/>
+        <w:rPr>
+          <w:rFonts w:ascii="Garamond" w:hAnsi="Garamond"/>
+          <w:lang w:val="en-GB"/>
+        </w:rPr>
+      </w:pPr>
+      <w:bookmarkStart w:id="15" w:name="_Toc235198498"/>
+      <w:r>
+        <w:rPr>
+          <w:rFonts w:ascii="Garamond" w:hAnsi="Garamond"/>
+          <w:lang w:val="en-GB"/>
+        </w:rPr>
+        <w:lastRenderedPageBreak/>
+        <w:t>Part 2.</w:t>
+      </w:r>
+      <w:r>
+        <w:rPr>
+          <w:rFonts w:ascii="Garamond" w:hAnsi="Garamond"/>
+          <w:lang w:val="en-GB"/>
+        </w:rPr>
+        <w:t>4</w:t>
+      </w:r>
+      <w:r>
+        <w:rPr>
+          <w:rFonts w:ascii="Garamond" w:hAnsi="Garamond"/>
+          <w:lang w:val="en-GB"/>
+        </w:rPr>
+        <w:t>: Running the MSR Creator</w:t>
+      </w:r>
+      <w:bookmarkEnd w:id="15"/>
+    </w:p>
+    <w:p>
+      <w:pPr>
+        <w:rPr>
+          <w:rFonts w:ascii="Garamond" w:hAnsi="Garamond"/>
+          <w:lang w:val="en-US"/>
+        </w:rPr>
+      </w:pPr>
+    </w:p>
+    <w:p>
+      <w:pPr>
+        <w:rPr>
+          <w:rFonts w:ascii="Garamond" w:hAnsi="Garamond"/>
+          <w:lang w:val="en-US"/>
+        </w:rPr>
+      </w:pPr>
+      <w:r>
+        <w:rPr>
+          <w:rFonts w:ascii="Garamond" w:hAnsi="Garamond"/>
+          <w:lang w:val="en-US"/>
+        </w:rPr>
+        <w:t>Once the input datasets and control file have been prepared, open a terminal in your preferred IDE</w:t>
+      </w:r>
+      <w:r>
+        <w:rPr>
+          <w:rFonts w:ascii="Garamond" w:hAnsi="Garamond"/>
+          <w:lang w:val="en-US"/>
+        </w:rPr>
+        <w:t>.</w:t>
+      </w:r>
+      <w:r>
+        <w:rPr>
+          <w:rFonts w:ascii="Garamond" w:hAnsi="Garamond"/>
+          <w:lang w:val="en-US"/>
+        </w:rPr>
+        <w:t xml:space="preserve">. </w:t>
+      </w:r>
+    </w:p>
+    <w:p>
+      <w:pPr>
+        <w:rPr>
+          <w:rFonts w:ascii="Garamond" w:hAnsi="Garamond"/>
+          <w:lang w:val="en-US"/>
+        </w:rPr>
+      </w:pPr>
+    </w:p>
+    <w:p>
+      <w:pPr>
+        <w:rPr>
+          <w:rFonts w:ascii="Garamond" w:hAnsi="Garamond"/>
+          <w:color w:val="FFC000"/>
+          <w:lang w:val="en-US"/>
+        </w:rPr>
+      </w:pPr>
+      <w:r>
+        <w:rPr>
+          <w:rFonts w:ascii="Segoe UI Emoji" w:hAnsi="Segoe UI Emoji" w:cs="Segoe UI Emoji"/>
+          <w:lang w:val="en-US"/>
+        </w:rPr>
+        <w:t>👉🏼</w:t>
+      </w:r>
+      <w:r>
+        <w:rPr>
+          <w:rFonts w:ascii="Garamond" w:hAnsi="Garamond"/>
+          <w:lang w:val="en-US"/>
+        </w:rPr>
+        <w:t xml:space="preserve"> </w:t>
+      </w:r>
+      <w:r>
+        <w:rPr>
+          <w:rFonts w:ascii="Garamond" w:hAnsi="Garamond"/>
+          <w:lang w:val="en-US"/>
+        </w:rPr>
+        <w:t xml:space="preserve">Navigate to the </w:t>
+      </w:r>
+      <w:r>
+        <w:rPr>
+          <w:rFonts w:ascii="Garamond" w:hAnsi="Garamond"/>
+          <w:b/>
+          <w:bCs/>
           <w:i/>
           <w:iCs/>
           <w:color w:val="00B050"/>
           <w:lang w:val="en-US"/>
         </w:rPr>
-        <w:t>stage 4</w:t>
-      </w:r>
-      <w:r>
-        <w:rPr>
-          <w:rFonts w:ascii="Garamond" w:hAnsi="Garamond"/>
-          <w:lang w:val="en-US"/>
-        </w:rPr>
-        <w:t>, disabled.</w:t>
-      </w:r>
-    </w:p>
-    <w:p>
-      <w:pPr>
-        <w:rPr>
-          <w:rFonts w:ascii="Garamond" w:hAnsi="Garamond"/>
-          <w:lang w:val="en-US"/>
-        </w:rPr>
-      </w:pPr>
-    </w:p>
-    <w:p>
-      <w:pPr>
-        <w:rPr>
-          <w:rFonts w:ascii="Garamond" w:hAnsi="Garamond"/>
-          <w:lang w:val="en-US"/>
-        </w:rPr>
-      </w:pPr>
-      <w:r>
-        <w:rPr>
-          <w:rFonts w:ascii="Segoe UI Emoji" w:hAnsi="Segoe UI Emoji" w:cs="Segoe UI Emoji"/>
-          <w:lang w:val="en-US"/>
-        </w:rPr>
-        <w:t>👉🏼</w:t>
-      </w:r>
-      <w:r>
-        <w:rPr>
-          <w:rFonts w:ascii="Segoe UI Emoji" w:hAnsi="Segoe UI Emoji" w:cs="Segoe UI Emoji"/>
+        <w:t>1_msr_creator</w:t>
+      </w:r>
+      <w:r>
+        <w:rPr>
+          <w:rFonts w:ascii="Garamond" w:hAnsi="Garamond"/>
+          <w:color w:val="00B050"/>
           <w:lang w:val="en-US"/>
         </w:rPr>
         <w:t xml:space="preserve"> </w:t>
@@ -7173,32 +7508,26 @@
           <w:rFonts w:ascii="Garamond" w:hAnsi="Garamond"/>
           <w:lang w:val="en-US"/>
         </w:rPr>
-        <w:t xml:space="preserve">Go to the </w:t>
-      </w:r>
-      <w:r>
-        <w:rPr>
-          <w:rFonts w:ascii="Garamond" w:hAnsi="Garamond"/>
+        <w:t>folder and run</w:t>
+      </w:r>
+      <w:r>
+        <w:rPr>
+          <w:rFonts w:ascii="Garamond" w:hAnsi="Garamond"/>
+          <w:lang w:val="en-US"/>
+        </w:rPr>
+        <w:t xml:space="preserve"> </w:t>
+      </w:r>
+      <w:r>
+        <w:rPr>
+          <w:rFonts w:ascii="Garamond" w:hAnsi="Garamond"/>
+          <w:b/>
+          <w:bCs/>
           <w:i/>
           <w:iCs/>
-          <w:color w:val="00B0F0"/>
-          <w:lang w:val="en-US"/>
-        </w:rPr>
-        <w:t>parameters</w:t>
-      </w:r>
-      <w:r>
-        <w:rPr>
-          <w:rFonts w:ascii="Garamond" w:hAnsi="Garamond"/>
-          <w:color w:val="00B0F0"/>
-          <w:lang w:val="en-US"/>
-        </w:rPr>
-        <w:t xml:space="preserve"> </w:t>
-      </w:r>
-      <w:r>
-        <w:rPr>
-          <w:rFonts w:ascii="Garamond" w:hAnsi="Garamond"/>
-          <w:lang w:val="en-US"/>
-        </w:rPr>
-        <w:t>worksheet</w:t>
+          <w:color w:val="808080" w:themeColor="background1" w:themeShade="80"/>
+          <w:lang w:val="en-US"/>
+        </w:rPr>
+        <w:t>msr_creator.py</w:t>
       </w:r>
       <w:r>
         <w:rPr>
@@ -7228,354 +7557,74 @@
           <w:rFonts w:ascii="Garamond" w:hAnsi="Garamond"/>
           <w:lang w:val="en-US"/>
         </w:rPr>
-        <w:t xml:space="preserve">This worksheet </w:t>
-      </w:r>
-      <w:r>
-        <w:rPr>
-          <w:rFonts w:ascii="Garamond" w:hAnsi="Garamond"/>
-          <w:lang w:val="en-US"/>
-        </w:rPr>
-        <w:t>specifies</w:t>
-      </w:r>
-      <w:r>
-        <w:rPr>
-          <w:rFonts w:ascii="Garamond" w:hAnsi="Garamond"/>
-          <w:lang w:val="en-US"/>
-        </w:rPr>
-        <w:t xml:space="preserve"> general and technology</w:t>
-      </w:r>
-      <w:r>
-        <w:rPr>
-          <w:rFonts w:ascii="Garamond" w:hAnsi="Garamond"/>
-          <w:lang w:val="en-US"/>
-        </w:rPr>
-        <w:t>-</w:t>
-      </w:r>
-      <w:r>
-        <w:rPr>
-          <w:rFonts w:ascii="Garamond" w:hAnsi="Garamond"/>
-          <w:lang w:val="en-US"/>
-        </w:rPr>
-        <w:t>specific parameters</w:t>
-      </w:r>
-      <w:r>
-        <w:rPr>
-          <w:rFonts w:ascii="Garamond" w:hAnsi="Garamond"/>
-          <w:lang w:val="en-US"/>
-        </w:rPr>
-        <w:t xml:space="preserve">, including resource </w:t>
-      </w:r>
-      <w:r>
-        <w:rPr>
-          <w:rFonts w:ascii="Garamond" w:hAnsi="Garamond"/>
-          <w:lang w:val="en-US"/>
-        </w:rPr>
-        <w:t>thresholds</w:t>
-      </w:r>
-      <w:r>
-        <w:rPr>
-          <w:rFonts w:ascii="Garamond" w:hAnsi="Garamond"/>
-          <w:lang w:val="en-US"/>
-        </w:rPr>
-        <w:t>, slope and elevation limits, population thresholds, suitable land-cover classes, minimum and maximum MSR capacities, etc</w:t>
-      </w:r>
-      <w:r>
-        <w:rPr>
-          <w:rFonts w:ascii="Garamond" w:hAnsi="Garamond"/>
-          <w:lang w:val="en-US"/>
-        </w:rPr>
-        <w:t>.</w:t>
-      </w:r>
-      <w:r>
-        <w:rPr>
-          <w:rFonts w:ascii="Garamond" w:hAnsi="Garamond"/>
-          <w:lang w:val="en-US"/>
-        </w:rPr>
-        <w:t xml:space="preserve"> as discussed in </w:t>
-      </w:r>
-      <w:r>
-        <w:rPr>
-          <w:rFonts w:ascii="Garamond" w:hAnsi="Garamond"/>
-          <w:b/>
-          <w:bCs/>
-          <w:lang w:val="en-US"/>
-        </w:rPr>
-        <w:fldChar w:fldCharType="begin"/>
-      </w:r>
-      <w:r>
-        <w:rPr>
-          <w:rFonts w:ascii="Garamond" w:hAnsi="Garamond"/>
-          <w:b/>
-          <w:bCs/>
-          <w:lang w:val="en-US"/>
-        </w:rPr>
-        <w:instrText xml:space="preserve"> REF _Ref235115185 \h </w:instrText>
-      </w:r>
-      <w:r>
-        <w:rPr>
-          <w:rFonts w:ascii="Garamond" w:hAnsi="Garamond"/>
-          <w:b/>
-          <w:bCs/>
-          <w:lang w:val="en-US"/>
-        </w:rPr>
-        <w:instrText xml:space="preserve"> \* MERGEFORMAT </w:instrText>
-      </w:r>
-      <w:r>
-        <w:rPr>
-          <w:rFonts w:ascii="Garamond" w:hAnsi="Garamond"/>
-          <w:b/>
-          <w:bCs/>
-          <w:lang w:val="en-US"/>
-        </w:rPr>
-      </w:r>
-      <w:r>
-        <w:rPr>
-          <w:rFonts w:ascii="Garamond" w:hAnsi="Garamond"/>
-          <w:b/>
-          <w:bCs/>
-          <w:lang w:val="en-US"/>
-        </w:rPr>
-        <w:fldChar w:fldCharType="separate"/>
-      </w:r>
-      <w:r>
-        <w:rPr>
-          <w:rFonts w:ascii="Garamond" w:hAnsi="Garamond"/>
-          <w:b/>
-          <w:bCs/>
-          <w:lang w:val="en-US"/>
-        </w:rPr>
-        <w:t>Part 2.2: Exclusion criteria</w:t>
-      </w:r>
-      <w:r>
-        <w:rPr>
-          <w:rFonts w:ascii="Garamond" w:hAnsi="Garamond"/>
-          <w:b/>
-          <w:bCs/>
-          <w:lang w:val="en-US"/>
-        </w:rPr>
-        <w:fldChar w:fldCharType="end"/>
-      </w:r>
-      <w:r>
-        <w:rPr>
-          <w:rFonts w:ascii="Garamond" w:hAnsi="Garamond"/>
-          <w:lang w:val="en-US"/>
-        </w:rPr>
-        <w:t>.</w:t>
-      </w:r>
-      <w:r>
-        <w:rPr>
-          <w:rFonts w:ascii="Garamond" w:hAnsi="Garamond"/>
-          <w:lang w:val="en-US"/>
-        </w:rPr>
-        <w:t xml:space="preserve"> </w:t>
-      </w:r>
-      <w:r>
-        <w:rPr>
-          <w:rFonts w:ascii="Garamond" w:hAnsi="Garamond"/>
-          <w:lang w:val="en-US"/>
-        </w:rPr>
-        <w:t xml:space="preserve">The parameters required for this exercise are listed in </w:t>
-      </w:r>
-      <w:r>
-        <w:rPr>
-          <w:rFonts w:ascii="Garamond" w:hAnsi="Garamond"/>
-          <w:b/>
-          <w:bCs/>
+        <w:t xml:space="preserve">Follow the log messages in the terminal to monitor the progress of the workflow. The script reports the active region, technology and </w:t>
+      </w:r>
+      <w:r>
+        <w:rPr>
+          <w:rFonts w:ascii="Garamond" w:hAnsi="Garamond"/>
+          <w:lang w:val="en-US"/>
+        </w:rPr>
+        <w:t>workflow</w:t>
+      </w:r>
+      <w:r>
+        <w:rPr>
+          <w:rFonts w:ascii="Garamond" w:hAnsi="Garamond"/>
+          <w:lang w:val="en-US"/>
+        </w:rPr>
+        <w:t xml:space="preserve"> stage. The run is complete when the message “</w:t>
+      </w:r>
+      <w:r>
+        <w:rPr>
+          <w:rFonts w:ascii="Garamond" w:hAnsi="Garamond"/>
           <w:i/>
           <w:iCs/>
-          <w:color w:val="FF6700" w:themeColor="accent3"/>
-          <w:lang w:val="en-US"/>
-        </w:rPr>
-        <w:t>training_parameters.xlsx</w:t>
-      </w:r>
-      <w:r>
-        <w:rPr>
-          <w:rFonts w:ascii="Garamond" w:hAnsi="Garamond"/>
-          <w:lang w:val="en-US"/>
-        </w:rPr>
-        <w:t xml:space="preserve"> </w:t>
-      </w:r>
-      <w:r>
-        <w:rPr>
-          <w:rFonts w:ascii="Garamond" w:hAnsi="Garamond"/>
-          <w:lang w:val="en-US"/>
-        </w:rPr>
-        <w:sym w:font="Wingdings" w:char="F0E0"/>
-      </w:r>
-      <w:r>
-        <w:rPr>
-          <w:rFonts w:ascii="Garamond" w:hAnsi="Garamond"/>
-          <w:lang w:val="en-US"/>
-        </w:rPr>
-        <w:t xml:space="preserve"> </w:t>
-      </w:r>
-      <w:r>
-        <w:rPr>
-          <w:rFonts w:ascii="Garamond" w:hAnsi="Garamond"/>
-          <w:i/>
-          <w:iCs/>
-          <w:color w:val="00B0F0"/>
-          <w:lang w:val="en-US"/>
-        </w:rPr>
-        <w:t>msr_creator</w:t>
-      </w:r>
-      <w:r>
-        <w:rPr>
-          <w:rFonts w:ascii="Garamond" w:hAnsi="Garamond"/>
-          <w:color w:val="00B0F0"/>
-          <w:lang w:val="en-US"/>
-        </w:rPr>
-        <w:t xml:space="preserve"> </w:t>
-      </w:r>
-      <w:r>
-        <w:rPr>
-          <w:rFonts w:ascii="Garamond" w:hAnsi="Garamond"/>
-          <w:lang w:val="en-US"/>
-        </w:rPr>
-        <w:t xml:space="preserve">worksheet. The parameters are arranged in the correct order and can be copied directly into the </w:t>
-      </w:r>
-      <w:r>
-        <w:rPr>
-          <w:rFonts w:ascii="Garamond" w:hAnsi="Garamond"/>
-          <w:i/>
-          <w:iCs/>
-          <w:lang w:val="en-US"/>
-        </w:rPr>
-        <w:t>value</w:t>
-      </w:r>
-      <w:r>
-        <w:rPr>
-          <w:rFonts w:ascii="Garamond" w:hAnsi="Garamond"/>
-          <w:lang w:val="en-US"/>
-        </w:rPr>
-        <w:t xml:space="preserve"> column of the </w:t>
-      </w:r>
-      <w:r>
-        <w:rPr>
-          <w:rFonts w:ascii="Garamond" w:hAnsi="Garamond"/>
-          <w:b/>
-          <w:bCs/>
-          <w:i/>
-          <w:iCs/>
-          <w:color w:val="FF6700" w:themeColor="accent3"/>
-          <w:lang w:val="en-US"/>
-        </w:rPr>
-        <w:t>control file</w:t>
-      </w:r>
-      <w:r>
-        <w:rPr>
-          <w:rFonts w:ascii="Garamond" w:hAnsi="Garamond"/>
-          <w:lang w:val="en-US"/>
-        </w:rPr>
-        <w:t xml:space="preserve">. </w:t>
-      </w:r>
-    </w:p>
-    <w:p>
-      <w:pPr>
-        <w:pStyle w:val="Heading3"/>
-        <w:rPr>
-          <w:rFonts w:ascii="Garamond" w:hAnsi="Garamond"/>
-          <w:lang w:val="en-GB"/>
-        </w:rPr>
-      </w:pPr>
-      <w:bookmarkStart w:id="18" w:name="_Toc235198498"/>
-      <w:r>
-        <w:rPr>
-          <w:rFonts w:ascii="Garamond" w:hAnsi="Garamond"/>
-          <w:lang w:val="en-GB"/>
-        </w:rPr>
-        <w:lastRenderedPageBreak/>
-        <w:t>Part 2.</w:t>
-      </w:r>
-      <w:r>
-        <w:rPr>
-          <w:rFonts w:ascii="Garamond" w:hAnsi="Garamond"/>
-          <w:lang w:val="en-GB"/>
-        </w:rPr>
-        <w:t>4</w:t>
-      </w:r>
-      <w:r>
-        <w:rPr>
-          <w:rFonts w:ascii="Garamond" w:hAnsi="Garamond"/>
-          <w:lang w:val="en-GB"/>
-        </w:rPr>
-        <w:t>: Running the MSR Creator</w:t>
-      </w:r>
-      <w:bookmarkEnd w:id="18"/>
-    </w:p>
-    <w:p>
-      <w:pPr>
-        <w:rPr>
-          <w:rFonts w:ascii="Garamond" w:hAnsi="Garamond"/>
-          <w:lang w:val="en-US"/>
-        </w:rPr>
-      </w:pPr>
-    </w:p>
-    <w:p>
-      <w:pPr>
-        <w:rPr>
-          <w:rFonts w:ascii="Garamond" w:hAnsi="Garamond"/>
-          <w:lang w:val="en-US"/>
-        </w:rPr>
-      </w:pPr>
-      <w:r>
-        <w:rPr>
-          <w:rFonts w:ascii="Garamond" w:hAnsi="Garamond"/>
-          <w:lang w:val="en-US"/>
-        </w:rPr>
-        <w:t>Once the input datasets and control file have been prepared, open a terminal in your preferred IDE</w:t>
-      </w:r>
-      <w:r>
-        <w:rPr>
-          <w:rFonts w:ascii="Garamond" w:hAnsi="Garamond"/>
-          <w:lang w:val="en-US"/>
-        </w:rPr>
-        <w:t>.</w:t>
-      </w:r>
-      <w:r>
-        <w:rPr>
-          <w:rFonts w:ascii="Garamond" w:hAnsi="Garamond"/>
-          <w:lang w:val="en-US"/>
-        </w:rPr>
-        <w:t xml:space="preserve">. </w:t>
-      </w:r>
-    </w:p>
-    <w:p>
-      <w:pPr>
-        <w:rPr>
-          <w:rFonts w:ascii="Garamond" w:hAnsi="Garamond"/>
-          <w:lang w:val="en-US"/>
-        </w:rPr>
-      </w:pPr>
-    </w:p>
-    <w:p>
-      <w:pPr>
-        <w:rPr>
-          <w:rFonts w:ascii="Garamond" w:hAnsi="Garamond"/>
-          <w:color w:val="FFC000"/>
-          <w:lang w:val="en-US"/>
-        </w:rPr>
-      </w:pPr>
-      <w:r>
-        <w:rPr>
-          <w:rFonts w:ascii="Segoe UI Emoji" w:hAnsi="Segoe UI Emoji" w:cs="Segoe UI Emoji"/>
-          <w:lang w:val="en-US"/>
-        </w:rPr>
-        <w:t>👉🏼</w:t>
-      </w:r>
-      <w:r>
-        <w:rPr>
-          <w:rFonts w:ascii="Garamond" w:hAnsi="Garamond"/>
-          <w:lang w:val="en-US"/>
-        </w:rPr>
-        <w:t xml:space="preserve"> </w:t>
-      </w:r>
-      <w:r>
-        <w:rPr>
-          <w:rFonts w:ascii="Garamond" w:hAnsi="Garamond"/>
-          <w:lang w:val="en-US"/>
-        </w:rPr>
-        <w:t xml:space="preserve">Navigate to the </w:t>
+          <w:lang w:val="en-US"/>
+        </w:rPr>
+        <w:t>MSR Creator workflow completed</w:t>
+      </w:r>
+      <w:r>
+        <w:rPr>
+          <w:rFonts w:ascii="Garamond" w:hAnsi="Garamond"/>
+          <w:lang w:val="en-US"/>
+        </w:rPr>
+        <w:t>” appears in the terminal.</w:t>
+      </w:r>
+    </w:p>
+    <w:p>
+      <w:pPr>
+        <w:rPr>
+          <w:rFonts w:ascii="Garamond" w:hAnsi="Garamond"/>
+          <w:lang w:val="en-US"/>
+        </w:rPr>
+      </w:pPr>
+    </w:p>
+    <w:p>
+      <w:pPr>
+        <w:rPr>
+          <w:rFonts w:ascii="Garamond" w:hAnsi="Garamond"/>
+          <w:lang w:val="en-US"/>
+        </w:rPr>
+      </w:pPr>
+      <w:r>
+        <w:rPr>
+          <w:rFonts w:ascii="Garamond" w:hAnsi="Garamond"/>
+          <w:lang w:val="en-US"/>
+        </w:rPr>
+        <w:t>T</w:t>
+      </w:r>
+      <w:r>
+        <w:rPr>
+          <w:rFonts w:ascii="Garamond" w:hAnsi="Garamond"/>
+          <w:lang w:val="en-US"/>
+        </w:rPr>
+        <w:t>he script creates a subfolder for each modelled region</w:t>
+      </w:r>
+      <w:r>
+        <w:rPr>
+          <w:rFonts w:ascii="Garamond" w:hAnsi="Garamond"/>
+          <w:lang w:val="en-US"/>
+        </w:rPr>
+        <w:t xml:space="preserve"> in the </w:t>
       </w:r>
       <w:r>
         <w:rPr>
@@ -7587,7 +7636,7 @@
           <w:color w:val="00B050"/>
           <w:lang w:val="en-US"/>
         </w:rPr>
-        <w:t>1_msr_creator</w:t>
+        <w:t>output</w:t>
       </w:r>
       <w:r>
         <w:rPr>
@@ -7602,123 +7651,14 @@
           <w:rFonts w:ascii="Garamond" w:hAnsi="Garamond"/>
           <w:lang w:val="en-US"/>
         </w:rPr>
-        <w:t>folder and run</w:t>
-      </w:r>
-      <w:r>
-        <w:rPr>
-          <w:rFonts w:ascii="Garamond" w:hAnsi="Garamond"/>
-          <w:lang w:val="en-US"/>
-        </w:rPr>
-        <w:t xml:space="preserve"> </w:t>
-      </w:r>
-      <w:r>
-        <w:rPr>
-          <w:rFonts w:ascii="Garamond" w:hAnsi="Garamond"/>
-          <w:b/>
-          <w:bCs/>
-          <w:i/>
-          <w:iCs/>
-          <w:color w:val="808080" w:themeColor="background1" w:themeShade="80"/>
-          <w:lang w:val="en-US"/>
-        </w:rPr>
-        <w:t>msr_creator.py</w:t>
-      </w:r>
-      <w:r>
-        <w:rPr>
-          <w:rFonts w:ascii="Garamond" w:hAnsi="Garamond"/>
-          <w:lang w:val="en-US"/>
-        </w:rPr>
-        <w:t>.</w:t>
-      </w:r>
-    </w:p>
-    <w:p>
-      <w:pPr>
-        <w:rPr>
-          <w:rFonts w:ascii="Garamond" w:hAnsi="Garamond"/>
-          <w:lang w:val="en-US"/>
-        </w:rPr>
-      </w:pPr>
-    </w:p>
-    <w:p>
-      <w:pPr>
-        <w:rPr>
-          <w:rFonts w:ascii="Garamond" w:hAnsi="Garamond"/>
-          <w:lang w:val="en-US"/>
-        </w:rPr>
-      </w:pPr>
-      <w:r>
-        <w:rPr>
-          <w:rFonts w:ascii="Garamond" w:hAnsi="Garamond"/>
-          <w:lang w:val="en-US"/>
-        </w:rPr>
-        <w:t xml:space="preserve">Follow the log messages in the terminal to monitor the progress of the workflow. The script reports the active region, technology and </w:t>
-      </w:r>
-      <w:r>
-        <w:rPr>
-          <w:rFonts w:ascii="Garamond" w:hAnsi="Garamond"/>
-          <w:lang w:val="en-US"/>
-        </w:rPr>
-        <w:t>workflow</w:t>
-      </w:r>
-      <w:r>
-        <w:rPr>
-          <w:rFonts w:ascii="Garamond" w:hAnsi="Garamond"/>
-          <w:lang w:val="en-US"/>
-        </w:rPr>
-        <w:t xml:space="preserve"> stage. The run is complete when the message “</w:t>
-      </w:r>
-      <w:r>
-        <w:rPr>
-          <w:rFonts w:ascii="Garamond" w:hAnsi="Garamond"/>
-          <w:i/>
-          <w:iCs/>
-          <w:lang w:val="en-US"/>
-        </w:rPr>
-        <w:t>MSR Creator workflow completed</w:t>
-      </w:r>
-      <w:r>
-        <w:rPr>
-          <w:rFonts w:ascii="Garamond" w:hAnsi="Garamond"/>
-          <w:lang w:val="en-US"/>
-        </w:rPr>
-        <w:t>” appears in the terminal.</w:t>
-      </w:r>
-    </w:p>
-    <w:p>
-      <w:pPr>
-        <w:rPr>
-          <w:rFonts w:ascii="Garamond" w:hAnsi="Garamond"/>
-          <w:lang w:val="en-US"/>
-        </w:rPr>
-      </w:pPr>
-    </w:p>
-    <w:p>
-      <w:pPr>
-        <w:rPr>
-          <w:rFonts w:ascii="Garamond" w:hAnsi="Garamond"/>
-          <w:lang w:val="en-US"/>
-        </w:rPr>
-      </w:pPr>
-      <w:r>
-        <w:rPr>
-          <w:rFonts w:ascii="Garamond" w:hAnsi="Garamond"/>
-          <w:lang w:val="en-US"/>
-        </w:rPr>
-        <w:t>T</w:t>
-      </w:r>
-      <w:r>
-        <w:rPr>
-          <w:rFonts w:ascii="Garamond" w:hAnsi="Garamond"/>
-          <w:lang w:val="en-US"/>
-        </w:rPr>
-        <w:t>he script creates a subfolder for each modelled region</w:t>
-      </w:r>
-      <w:r>
-        <w:rPr>
-          <w:rFonts w:ascii="Garamond" w:hAnsi="Garamond"/>
-          <w:lang w:val="en-US"/>
-        </w:rPr>
-        <w:t xml:space="preserve"> in the </w:t>
+        <w:t>folder</w:t>
+      </w:r>
+      <w:r>
+        <w:rPr>
+          <w:rFonts w:ascii="Garamond" w:hAnsi="Garamond"/>
+          <w:lang w:val="en-US"/>
+        </w:rPr>
+        <w:t xml:space="preserve">. For this exercise, the outputs are stored in the </w:t>
       </w:r>
       <w:r>
         <w:rPr>
@@ -7730,7 +7670,7 @@
           <w:color w:val="00B050"/>
           <w:lang w:val="en-US"/>
         </w:rPr>
-        <w:t>output</w:t>
+        <w:t>Ecuador</w:t>
       </w:r>
       <w:r>
         <w:rPr>
@@ -7745,14 +7685,54 @@
           <w:rFonts w:ascii="Garamond" w:hAnsi="Garamond"/>
           <w:lang w:val="en-US"/>
         </w:rPr>
-        <w:t>folder</w:t>
-      </w:r>
-      <w:r>
-        <w:rPr>
-          <w:rFonts w:ascii="Garamond" w:hAnsi="Garamond"/>
-          <w:lang w:val="en-US"/>
-        </w:rPr>
-        <w:t xml:space="preserve">. For this exercise, the outputs are stored in the </w:t>
+        <w:t>subfolder</w:t>
+      </w:r>
+      <w:r>
+        <w:rPr>
+          <w:rFonts w:ascii="Garamond" w:hAnsi="Garamond"/>
+          <w:lang w:val="en-US"/>
+        </w:rPr>
+        <w:t xml:space="preserve">, and intermediate outputs are organised by workflow stage. </w:t>
+      </w:r>
+    </w:p>
+    <w:p>
+      <w:pPr>
+        <w:rPr>
+          <w:rFonts w:ascii="Garamond" w:hAnsi="Garamond"/>
+          <w:lang w:val="en-US"/>
+        </w:rPr>
+      </w:pPr>
+    </w:p>
+    <w:p>
+      <w:pPr>
+        <w:rPr>
+          <w:rFonts w:ascii="Garamond" w:hAnsi="Garamond"/>
+          <w:lang w:val="en-US"/>
+        </w:rPr>
+      </w:pPr>
+      <w:r>
+        <w:rPr>
+          <w:rFonts w:ascii="Garamond" w:hAnsi="Garamond"/>
+        </w:rPr>
+        <w:t xml:space="preserve">The </w:t>
+      </w:r>
+      <w:r>
+        <w:rPr>
+          <w:rFonts w:ascii="Garamond" w:hAnsi="Garamond"/>
+        </w:rPr>
+        <w:t>region-specific</w:t>
+      </w:r>
+      <w:r>
+        <w:rPr>
+          <w:rFonts w:ascii="Garamond" w:hAnsi="Garamond"/>
+        </w:rPr>
+        <w:t xml:space="preserve"> </w:t>
+      </w:r>
+      <w:r>
+        <w:rPr>
+          <w:rFonts w:ascii="Garamond" w:hAnsi="Garamond"/>
+        </w:rPr>
+        <w:t xml:space="preserve">input datasets are stored in the </w:t>
       </w:r>
       <w:r>
         <w:rPr>
@@ -7762,48 +7742,96 @@
           <w:i/>
           <w:iCs/>
           <w:color w:val="00B050"/>
-          <w:lang w:val="en-US"/>
-        </w:rPr>
-        <w:t>Ecuador</w:t>
+        </w:rPr>
+        <w:t>stage1_input_datasets</w:t>
       </w:r>
       <w:r>
         <w:rPr>
           <w:rFonts w:ascii="Garamond" w:hAnsi="Garamond"/>
           <w:color w:val="00B050"/>
-          <w:lang w:val="en-US"/>
         </w:rPr>
         <w:t xml:space="preserve"> </w:t>
       </w:r>
       <w:r>
         <w:rPr>
           <w:rFonts w:ascii="Garamond" w:hAnsi="Garamond"/>
-          <w:lang w:val="en-US"/>
-        </w:rPr>
-        <w:t>subfolder</w:t>
-      </w:r>
-      <w:r>
-        <w:rPr>
-          <w:rFonts w:ascii="Garamond" w:hAnsi="Garamond"/>
-          <w:lang w:val="en-US"/>
-        </w:rPr>
-        <w:t xml:space="preserve">, and intermediate outputs are organised by workflow stage. </w:t>
-      </w:r>
-    </w:p>
-    <w:p>
-      <w:pPr>
-        <w:rPr>
-          <w:rFonts w:ascii="Garamond" w:hAnsi="Garamond"/>
-          <w:lang w:val="en-US"/>
-        </w:rPr>
-      </w:pPr>
-    </w:p>
-    <w:p>
-      <w:pPr>
-        <w:rPr>
-          <w:rFonts w:ascii="Garamond" w:hAnsi="Garamond"/>
-          <w:lang w:val="en-US"/>
-        </w:rPr>
-      </w:pPr>
+        </w:rPr>
+        <w:t>folder</w:t>
+      </w:r>
+      <w:r>
+        <w:rPr>
+          <w:rFonts w:ascii="Garamond" w:hAnsi="Garamond"/>
+        </w:rPr>
+        <w:t xml:space="preserve">. The outputs from stage 1 were </w:t>
+      </w:r>
+      <w:r>
+        <w:rPr>
+          <w:rFonts w:ascii="Garamond" w:hAnsi="Garamond"/>
+        </w:rPr>
+        <w:t xml:space="preserve">shown in </w:t>
+      </w:r>
+      <w:r>
+        <w:rPr>
+          <w:rFonts w:ascii="Garamond" w:hAnsi="Garamond"/>
+          <w:b/>
+          <w:bCs/>
+        </w:rPr>
+        <w:fldChar w:fldCharType="begin"/>
+      </w:r>
+      <w:r>
+        <w:rPr>
+          <w:rFonts w:ascii="Garamond" w:hAnsi="Garamond"/>
+          <w:b/>
+          <w:bCs/>
+        </w:rPr>
+        <w:instrText xml:space="preserve"> REF _Ref235115238 \h </w:instrText>
+      </w:r>
+      <w:r>
+        <w:rPr>
+          <w:rFonts w:ascii="Garamond" w:hAnsi="Garamond"/>
+          <w:b/>
+          <w:bCs/>
+        </w:rPr>
+        <w:instrText xml:space="preserve"> \* MERGEFORMAT </w:instrText>
+      </w:r>
+      <w:r>
+        <w:rPr>
+          <w:rFonts w:ascii="Garamond" w:hAnsi="Garamond"/>
+          <w:b/>
+          <w:bCs/>
+        </w:rPr>
+      </w:r>
+      <w:r>
+        <w:rPr>
+          <w:rFonts w:ascii="Garamond" w:hAnsi="Garamond"/>
+          <w:b/>
+          <w:bCs/>
+        </w:rPr>
+        <w:fldChar w:fldCharType="separate"/>
+      </w:r>
+      <w:r>
+        <w:rPr>
+          <w:rFonts w:ascii="Garamond" w:hAnsi="Garamond"/>
+          <w:b/>
+          <w:bCs/>
+          <w:lang w:val="en-US"/>
+        </w:rPr>
+        <w:t>Part 2.1: QGIS regional geospatial inputs</w:t>
+      </w:r>
+      <w:r>
+        <w:rPr>
+          <w:rFonts w:ascii="Garamond" w:hAnsi="Garamond"/>
+          <w:b/>
+          <w:bCs/>
+        </w:rPr>
+        <w:fldChar w:fldCharType="end"/>
+      </w:r>
+      <w:r>
+        <w:rPr>
+          <w:rFonts w:ascii="Garamond" w:hAnsi="Garamond"/>
+        </w:rPr>
+        <w:t xml:space="preserve">. </w:t>
+      </w:r>
       <w:r>
         <w:rPr>
           <w:rFonts w:ascii="Garamond" w:hAnsi="Garamond"/>
@@ -7814,19 +7842,13 @@
         <w:rPr>
           <w:rFonts w:ascii="Garamond" w:hAnsi="Garamond"/>
         </w:rPr>
-        <w:t>region-specific</w:t>
-      </w:r>
-      <w:r>
-        <w:rPr>
-          <w:rFonts w:ascii="Garamond" w:hAnsi="Garamond"/>
-        </w:rPr>
-        <w:t xml:space="preserve"> </w:t>
-      </w:r>
-      <w:r>
-        <w:rPr>
-          <w:rFonts w:ascii="Garamond" w:hAnsi="Garamond"/>
-        </w:rPr>
-        <w:t xml:space="preserve">input datasets are stored in the </w:t>
+        <w:t xml:space="preserve">suitability and </w:t>
+      </w:r>
+      <w:r>
+        <w:rPr>
+          <w:rFonts w:ascii="Garamond" w:hAnsi="Garamond"/>
+        </w:rPr>
+        <w:t xml:space="preserve">exclusion layers are stored in the </w:t>
       </w:r>
       <w:r>
         <w:rPr>
@@ -7837,112 +7859,7 @@
           <w:iCs/>
           <w:color w:val="00B050"/>
         </w:rPr>
-        <w:t>stage1_input_datasets</w:t>
-      </w:r>
-      <w:r>
-        <w:rPr>
-          <w:rFonts w:ascii="Garamond" w:hAnsi="Garamond"/>
-          <w:color w:val="00B050"/>
-        </w:rPr>
-        <w:t xml:space="preserve"> </w:t>
-      </w:r>
-      <w:r>
-        <w:rPr>
-          <w:rFonts w:ascii="Garamond" w:hAnsi="Garamond"/>
-        </w:rPr>
-        <w:t>folder</w:t>
-      </w:r>
-      <w:r>
-        <w:rPr>
-          <w:rFonts w:ascii="Garamond" w:hAnsi="Garamond"/>
-        </w:rPr>
-        <w:t xml:space="preserve">. The outputs from stage 1 were </w:t>
-      </w:r>
-      <w:r>
-        <w:rPr>
-          <w:rFonts w:ascii="Garamond" w:hAnsi="Garamond"/>
-        </w:rPr>
-        <w:t xml:space="preserve">shown in </w:t>
-      </w:r>
-      <w:r>
-        <w:rPr>
-          <w:rFonts w:ascii="Garamond" w:hAnsi="Garamond"/>
-          <w:b/>
-          <w:bCs/>
-        </w:rPr>
-        <w:fldChar w:fldCharType="begin"/>
-      </w:r>
-      <w:r>
-        <w:rPr>
-          <w:rFonts w:ascii="Garamond" w:hAnsi="Garamond"/>
-          <w:b/>
-          <w:bCs/>
-        </w:rPr>
-        <w:instrText xml:space="preserve"> REF _Ref235115238 \h </w:instrText>
-      </w:r>
-      <w:r>
-        <w:rPr>
-          <w:rFonts w:ascii="Garamond" w:hAnsi="Garamond"/>
-          <w:b/>
-          <w:bCs/>
-        </w:rPr>
-        <w:instrText xml:space="preserve"> \* MERGEFORMAT </w:instrText>
-      </w:r>
-      <w:r>
-        <w:rPr>
-          <w:rFonts w:ascii="Garamond" w:hAnsi="Garamond"/>
-          <w:b/>
-          <w:bCs/>
-        </w:rPr>
-      </w:r>
-      <w:r>
-        <w:rPr>
-          <w:rFonts w:ascii="Garamond" w:hAnsi="Garamond"/>
-          <w:b/>
-          <w:bCs/>
-        </w:rPr>
-        <w:fldChar w:fldCharType="separate"/>
-      </w:r>
-      <w:r>
-        <w:rPr>
-          <w:rFonts w:ascii="Garamond" w:hAnsi="Garamond"/>
-          <w:b/>
-          <w:bCs/>
-          <w:lang w:val="en-US"/>
-        </w:rPr>
-        <w:t>Part 2.1: QGIS regional geospatial inputs</w:t>
-      </w:r>
-      <w:r>
-        <w:rPr>
-          <w:rFonts w:ascii="Garamond" w:hAnsi="Garamond"/>
-          <w:b/>
-          <w:bCs/>
-        </w:rPr>
-        <w:fldChar w:fldCharType="end"/>
-      </w:r>
-      <w:r>
-        <w:rPr>
-          <w:rFonts w:ascii="Garamond" w:hAnsi="Garamond"/>
-        </w:rPr>
-        <w:t xml:space="preserve">. </w:t>
-      </w:r>
-      <w:r>
-        <w:rPr>
-          <w:rFonts w:ascii="Garamond" w:hAnsi="Garamond"/>
-        </w:rPr>
-        <w:t xml:space="preserve">The </w:t>
-      </w:r>
-      <w:r>
-        <w:rPr>
-          <w:rFonts w:ascii="Garamond" w:hAnsi="Garamond"/>
-        </w:rPr>
-        <w:t xml:space="preserve">suitability and </w:t>
-      </w:r>
-      <w:r>
-        <w:rPr>
-          <w:rFonts w:ascii="Garamond" w:hAnsi="Garamond"/>
-        </w:rPr>
-        <w:t xml:space="preserve">exclusion layers are stored in the </w:t>
+        <w:t>stage2_scored</w:t>
       </w:r>
       <w:r>
         <w:rPr>
@@ -7953,7 +7870,7 @@
           <w:iCs/>
           <w:color w:val="00B050"/>
         </w:rPr>
-        <w:t>stage2_scored</w:t>
+        <w:t>_</w:t>
       </w:r>
       <w:r>
         <w:rPr>
@@ -7964,7 +7881,68 @@
           <w:iCs/>
           <w:color w:val="00B050"/>
         </w:rPr>
-        <w:t>_</w:t>
+        <w:t>datasets</w:t>
+      </w:r>
+      <w:r>
+        <w:rPr>
+          <w:rFonts w:ascii="Garamond" w:hAnsi="Garamond"/>
+          <w:color w:val="00B050"/>
+        </w:rPr>
+        <w:t xml:space="preserve"> </w:t>
+      </w:r>
+      <w:r>
+        <w:rPr>
+          <w:rFonts w:ascii="Garamond" w:hAnsi="Garamond"/>
+        </w:rPr>
+        <w:t xml:space="preserve">folder </w:t>
+      </w:r>
+      <w:r>
+        <w:rPr>
+          <w:rFonts w:ascii="Garamond" w:hAnsi="Garamond"/>
+        </w:rPr>
+        <w:t xml:space="preserve">providing the suitable </w:t>
+      </w:r>
+      <w:r>
+        <w:rPr>
+          <w:rFonts w:ascii="Garamond" w:hAnsi="Garamond"/>
+        </w:rPr>
+        <w:t>area</w:t>
+      </w:r>
+      <w:r>
+        <w:rPr>
+          <w:rFonts w:ascii="Garamond" w:hAnsi="Garamond"/>
+        </w:rPr>
+        <w:t xml:space="preserve">. The resource competitive </w:t>
+      </w:r>
+      <w:r>
+        <w:rPr>
+          <w:rFonts w:ascii="Garamond" w:hAnsi="Garamond"/>
+        </w:rPr>
+        <w:t>area</w:t>
+      </w:r>
+      <w:r>
+        <w:rPr>
+          <w:rFonts w:ascii="Garamond" w:hAnsi="Garamond"/>
+        </w:rPr>
+        <w:t xml:space="preserve"> is </w:t>
+      </w:r>
+      <w:r>
+        <w:rPr>
+          <w:rFonts w:ascii="Garamond" w:hAnsi="Garamond"/>
+        </w:rPr>
+        <w:t>located</w:t>
+      </w:r>
+      <w:r>
+        <w:rPr>
+          <w:rFonts w:ascii="Garamond" w:hAnsi="Garamond"/>
+        </w:rPr>
+        <w:t xml:space="preserve"> in </w:t>
+      </w:r>
+      <w:r>
+        <w:rPr>
+          <w:rFonts w:ascii="Garamond" w:hAnsi="Garamond"/>
+        </w:rPr>
+        <w:t xml:space="preserve">the </w:t>
       </w:r>
       <w:r>
         <w:rPr>
@@ -7975,68 +7953,7 @@
           <w:iCs/>
           <w:color w:val="00B050"/>
         </w:rPr>
-        <w:t>datasets</w:t>
-      </w:r>
-      <w:r>
-        <w:rPr>
-          <w:rFonts w:ascii="Garamond" w:hAnsi="Garamond"/>
-          <w:color w:val="00B050"/>
-        </w:rPr>
-        <w:t xml:space="preserve"> </w:t>
-      </w:r>
-      <w:r>
-        <w:rPr>
-          <w:rFonts w:ascii="Garamond" w:hAnsi="Garamond"/>
-        </w:rPr>
-        <w:t xml:space="preserve">folder </w:t>
-      </w:r>
-      <w:r>
-        <w:rPr>
-          <w:rFonts w:ascii="Garamond" w:hAnsi="Garamond"/>
-        </w:rPr>
-        <w:t xml:space="preserve">providing the suitable </w:t>
-      </w:r>
-      <w:r>
-        <w:rPr>
-          <w:rFonts w:ascii="Garamond" w:hAnsi="Garamond"/>
-        </w:rPr>
-        <w:t>area</w:t>
-      </w:r>
-      <w:r>
-        <w:rPr>
-          <w:rFonts w:ascii="Garamond" w:hAnsi="Garamond"/>
-        </w:rPr>
-        <w:t xml:space="preserve">. The resource competitive </w:t>
-      </w:r>
-      <w:r>
-        <w:rPr>
-          <w:rFonts w:ascii="Garamond" w:hAnsi="Garamond"/>
-        </w:rPr>
-        <w:t>area</w:t>
-      </w:r>
-      <w:r>
-        <w:rPr>
-          <w:rFonts w:ascii="Garamond" w:hAnsi="Garamond"/>
-        </w:rPr>
-        <w:t xml:space="preserve"> is </w:t>
-      </w:r>
-      <w:r>
-        <w:rPr>
-          <w:rFonts w:ascii="Garamond" w:hAnsi="Garamond"/>
-        </w:rPr>
-        <w:t>located</w:t>
-      </w:r>
-      <w:r>
-        <w:rPr>
-          <w:rFonts w:ascii="Garamond" w:hAnsi="Garamond"/>
-        </w:rPr>
-        <w:t xml:space="preserve"> in </w:t>
-      </w:r>
-      <w:r>
-        <w:rPr>
-          <w:rFonts w:ascii="Garamond" w:hAnsi="Garamond"/>
-        </w:rPr>
-        <w:t xml:space="preserve">the </w:t>
+        <w:t>stage3_competitive</w:t>
       </w:r>
       <w:r>
         <w:rPr>
@@ -8047,7 +7964,7 @@
           <w:iCs/>
           <w:color w:val="00B050"/>
         </w:rPr>
-        <w:t>stage3_competitive</w:t>
+        <w:t>_</w:t>
       </w:r>
       <w:r>
         <w:rPr>
@@ -8058,7 +7975,7 @@
           <w:iCs/>
           <w:color w:val="00B050"/>
         </w:rPr>
-        <w:t>_</w:t>
+        <w:t>resource</w:t>
       </w:r>
       <w:r>
         <w:rPr>
@@ -8069,7 +7986,7 @@
           <w:iCs/>
           <w:color w:val="00B050"/>
         </w:rPr>
-        <w:t>resource</w:t>
+        <w:t>_</w:t>
       </w:r>
       <w:r>
         <w:rPr>
@@ -8080,7 +7997,146 @@
           <w:iCs/>
           <w:color w:val="00B050"/>
         </w:rPr>
-        <w:t>_</w:t>
+        <w:t>area</w:t>
+      </w:r>
+      <w:r>
+        <w:rPr>
+          <w:rFonts w:ascii="Garamond" w:hAnsi="Garamond"/>
+          <w:color w:val="00B050"/>
+        </w:rPr>
+        <w:t xml:space="preserve"> </w:t>
+      </w:r>
+      <w:r>
+        <w:rPr>
+          <w:rFonts w:ascii="Garamond" w:hAnsi="Garamond"/>
+        </w:rPr>
+        <w:t>folder</w:t>
+      </w:r>
+      <w:r>
+        <w:rPr>
+          <w:rFonts w:ascii="Garamond" w:hAnsi="Garamond"/>
+        </w:rPr>
+        <w:t xml:space="preserve">. The suitable land area for wind and solar PV MSRs were shown in </w:t>
+      </w:r>
+      <w:r>
+        <w:rPr>
+          <w:rFonts w:ascii="Garamond" w:hAnsi="Garamond"/>
+          <w:b/>
+          <w:bCs/>
+        </w:rPr>
+        <w:fldChar w:fldCharType="begin"/>
+      </w:r>
+      <w:r>
+        <w:rPr>
+          <w:rFonts w:ascii="Garamond" w:hAnsi="Garamond"/>
+          <w:b/>
+          <w:bCs/>
+        </w:rPr>
+        <w:instrText xml:space="preserve"> REF _Ref235115185 \h </w:instrText>
+      </w:r>
+      <w:r>
+        <w:rPr>
+          <w:rFonts w:ascii="Garamond" w:hAnsi="Garamond"/>
+          <w:b/>
+          <w:bCs/>
+        </w:rPr>
+        <w:instrText xml:space="preserve"> \* MERGEFORMAT </w:instrText>
+      </w:r>
+      <w:r>
+        <w:rPr>
+          <w:rFonts w:ascii="Garamond" w:hAnsi="Garamond"/>
+          <w:b/>
+          <w:bCs/>
+        </w:rPr>
+      </w:r>
+      <w:r>
+        <w:rPr>
+          <w:rFonts w:ascii="Garamond" w:hAnsi="Garamond"/>
+          <w:b/>
+          <w:bCs/>
+        </w:rPr>
+        <w:fldChar w:fldCharType="separate"/>
+      </w:r>
+      <w:r>
+        <w:rPr>
+          <w:rFonts w:ascii="Garamond" w:hAnsi="Garamond"/>
+          <w:b/>
+          <w:bCs/>
+          <w:lang w:val="en-US"/>
+        </w:rPr>
+        <w:t>Part 2.2: Exclusion criteria</w:t>
+      </w:r>
+      <w:r>
+        <w:rPr>
+          <w:rFonts w:ascii="Garamond" w:hAnsi="Garamond"/>
+          <w:b/>
+          <w:bCs/>
+        </w:rPr>
+        <w:fldChar w:fldCharType="end"/>
+      </w:r>
+      <w:r>
+        <w:rPr>
+          <w:rFonts w:ascii="Garamond" w:hAnsi="Garamond"/>
+        </w:rPr>
+        <w:t>.</w:t>
+      </w:r>
+      <w:r>
+        <w:rPr>
+          <w:rFonts w:ascii="Garamond" w:hAnsi="Garamond"/>
+        </w:rPr>
+        <w:t xml:space="preserve"> The </w:t>
+      </w:r>
+      <w:r>
+        <w:rPr>
+          <w:rFonts w:ascii="Garamond" w:hAnsi="Garamond"/>
+        </w:rPr>
+        <w:t xml:space="preserve">suitable </w:t>
+      </w:r>
+      <w:r>
+        <w:rPr>
+          <w:rFonts w:ascii="Garamond" w:hAnsi="Garamond"/>
+        </w:rPr>
+        <w:t xml:space="preserve">MSRs </w:t>
+      </w:r>
+      <w:r>
+        <w:rPr>
+          <w:rFonts w:ascii="Garamond" w:hAnsi="Garamond"/>
+        </w:rPr>
+        <w:t xml:space="preserve">locations </w:t>
+      </w:r>
+      <w:r>
+        <w:rPr>
+          <w:rFonts w:ascii="Garamond" w:hAnsi="Garamond"/>
+        </w:rPr>
+        <w:t xml:space="preserve">are defined in the </w:t>
+      </w:r>
+      <w:r>
+        <w:rPr>
+          <w:rFonts w:ascii="Garamond" w:hAnsi="Garamond"/>
+          <w:i/>
+          <w:iCs/>
+          <w:color w:val="BF4D00" w:themeColor="accent3" w:themeShade="BF"/>
+        </w:rPr>
+        <w:t>wind_2000_final_msrs.shp</w:t>
+      </w:r>
+      <w:r>
+        <w:rPr>
+          <w:rFonts w:ascii="Garamond" w:hAnsi="Garamond"/>
+          <w:color w:val="BF4D00" w:themeColor="accent3" w:themeShade="BF"/>
+        </w:rPr>
+        <w:t xml:space="preserve"> </w:t>
+      </w:r>
+      <w:r>
+        <w:rPr>
+          <w:rFonts w:ascii="Garamond" w:hAnsi="Garamond"/>
+        </w:rPr>
+        <w:t xml:space="preserve">shapefile </w:t>
+      </w:r>
+      <w:r>
+        <w:rPr>
+          <w:rFonts w:ascii="Garamond" w:hAnsi="Garamond"/>
+        </w:rPr>
+        <w:t xml:space="preserve">and is stored in the </w:t>
       </w:r>
       <w:r>
         <w:rPr>
@@ -8091,146 +8147,7 @@
           <w:iCs/>
           <w:color w:val="00B050"/>
         </w:rPr>
-        <w:t>area</w:t>
-      </w:r>
-      <w:r>
-        <w:rPr>
-          <w:rFonts w:ascii="Garamond" w:hAnsi="Garamond"/>
-          <w:color w:val="00B050"/>
-        </w:rPr>
-        <w:t xml:space="preserve"> </w:t>
-      </w:r>
-      <w:r>
-        <w:rPr>
-          <w:rFonts w:ascii="Garamond" w:hAnsi="Garamond"/>
-        </w:rPr>
-        <w:t>folder</w:t>
-      </w:r>
-      <w:r>
-        <w:rPr>
-          <w:rFonts w:ascii="Garamond" w:hAnsi="Garamond"/>
-        </w:rPr>
-        <w:t xml:space="preserve">. The suitable land area for wind and solar PV MSRs were shown in </w:t>
-      </w:r>
-      <w:r>
-        <w:rPr>
-          <w:rFonts w:ascii="Garamond" w:hAnsi="Garamond"/>
-          <w:b/>
-          <w:bCs/>
-        </w:rPr>
-        <w:fldChar w:fldCharType="begin"/>
-      </w:r>
-      <w:r>
-        <w:rPr>
-          <w:rFonts w:ascii="Garamond" w:hAnsi="Garamond"/>
-          <w:b/>
-          <w:bCs/>
-        </w:rPr>
-        <w:instrText xml:space="preserve"> REF _Ref235115185 \h </w:instrText>
-      </w:r>
-      <w:r>
-        <w:rPr>
-          <w:rFonts w:ascii="Garamond" w:hAnsi="Garamond"/>
-          <w:b/>
-          <w:bCs/>
-        </w:rPr>
-        <w:instrText xml:space="preserve"> \* MERGEFORMAT </w:instrText>
-      </w:r>
-      <w:r>
-        <w:rPr>
-          <w:rFonts w:ascii="Garamond" w:hAnsi="Garamond"/>
-          <w:b/>
-          <w:bCs/>
-        </w:rPr>
-      </w:r>
-      <w:r>
-        <w:rPr>
-          <w:rFonts w:ascii="Garamond" w:hAnsi="Garamond"/>
-          <w:b/>
-          <w:bCs/>
-        </w:rPr>
-        <w:fldChar w:fldCharType="separate"/>
-      </w:r>
-      <w:r>
-        <w:rPr>
-          <w:rFonts w:ascii="Garamond" w:hAnsi="Garamond"/>
-          <w:b/>
-          <w:bCs/>
-          <w:lang w:val="en-US"/>
-        </w:rPr>
-        <w:t>Part 2.2: Exclusion criteria</w:t>
-      </w:r>
-      <w:r>
-        <w:rPr>
-          <w:rFonts w:ascii="Garamond" w:hAnsi="Garamond"/>
-          <w:b/>
-          <w:bCs/>
-        </w:rPr>
-        <w:fldChar w:fldCharType="end"/>
-      </w:r>
-      <w:r>
-        <w:rPr>
-          <w:rFonts w:ascii="Garamond" w:hAnsi="Garamond"/>
-        </w:rPr>
-        <w:t>.</w:t>
-      </w:r>
-      <w:r>
-        <w:rPr>
-          <w:rFonts w:ascii="Garamond" w:hAnsi="Garamond"/>
-        </w:rPr>
-        <w:t xml:space="preserve"> The </w:t>
-      </w:r>
-      <w:r>
-        <w:rPr>
-          <w:rFonts w:ascii="Garamond" w:hAnsi="Garamond"/>
-        </w:rPr>
-        <w:t xml:space="preserve">suitable </w:t>
-      </w:r>
-      <w:r>
-        <w:rPr>
-          <w:rFonts w:ascii="Garamond" w:hAnsi="Garamond"/>
-        </w:rPr>
-        <w:t xml:space="preserve">MSRs </w:t>
-      </w:r>
-      <w:r>
-        <w:rPr>
-          <w:rFonts w:ascii="Garamond" w:hAnsi="Garamond"/>
-        </w:rPr>
-        <w:t xml:space="preserve">locations </w:t>
-      </w:r>
-      <w:r>
-        <w:rPr>
-          <w:rFonts w:ascii="Garamond" w:hAnsi="Garamond"/>
-        </w:rPr>
-        <w:t xml:space="preserve">are defined in the </w:t>
-      </w:r>
-      <w:r>
-        <w:rPr>
-          <w:rFonts w:ascii="Garamond" w:hAnsi="Garamond"/>
-          <w:i/>
-          <w:iCs/>
-          <w:color w:val="BF4D00" w:themeColor="accent3" w:themeShade="BF"/>
-        </w:rPr>
-        <w:t>wind_2000_final_msrs.shp</w:t>
-      </w:r>
-      <w:r>
-        <w:rPr>
-          <w:rFonts w:ascii="Garamond" w:hAnsi="Garamond"/>
-          <w:color w:val="BF4D00" w:themeColor="accent3" w:themeShade="BF"/>
-        </w:rPr>
-        <w:t xml:space="preserve"> </w:t>
-      </w:r>
-      <w:r>
-        <w:rPr>
-          <w:rFonts w:ascii="Garamond" w:hAnsi="Garamond"/>
-        </w:rPr>
-        <w:t xml:space="preserve">shapefile </w:t>
-      </w:r>
-      <w:r>
-        <w:rPr>
-          <w:rFonts w:ascii="Garamond" w:hAnsi="Garamond"/>
-        </w:rPr>
-        <w:t xml:space="preserve">and is stored in the </w:t>
+        <w:t>stage</w:t>
       </w:r>
       <w:r>
         <w:rPr>
@@ -8241,7 +8158,18 @@
           <w:iCs/>
           <w:color w:val="00B050"/>
         </w:rPr>
-        <w:t>stage6_attribution</w:t>
+        <w:t>5</w:t>
+      </w:r>
+      <w:r>
+        <w:rPr>
+          <w:rFonts w:ascii="Garamond" w:hAnsi="Garamond"/>
+          <w:b/>
+          <w:bCs/>
+          <w:i/>
+          <w:iCs/>
+          <w:color w:val="00B050"/>
+        </w:rPr>
+        <w:t>_attribution</w:t>
       </w:r>
       <w:r>
         <w:rPr>
@@ -8488,7 +8416,7 @@
                     <pic:cNvPicPr/>
                   </pic:nvPicPr>
                   <pic:blipFill rotWithShape="1">
-                    <a:blip r:embed="rId19" cstate="print">
+                    <a:blip r:embed="rId15" cstate="print">
                       <a:extLst>
                         <a:ext uri="{28A0092B-C50C-407E-A947-70E740481C1C}">
                           <a14:useLocalDpi xmlns:a14="http://schemas.microsoft.com/office/drawing/2010/main" val="0"/>
@@ -8535,7 +8463,7 @@
           <w:szCs w:val="16"/>
         </w:rPr>
       </w:pPr>
-      <w:bookmarkStart w:id="19" w:name="_Ref235111415"/>
+      <w:bookmarkStart w:id="16" w:name="_Ref235111415"/>
       <w:r>
         <w:rPr>
           <w:rFonts w:ascii="Garamond" w:hAnsi="Garamond"/>
@@ -8604,7 +8532,7 @@
         </w:rPr>
         <w:fldChar w:fldCharType="end"/>
       </w:r>
-      <w:bookmarkEnd w:id="19"/>
+      <w:bookmarkEnd w:id="16"/>
       <w:r>
         <w:rPr>
           <w:rFonts w:ascii="Garamond" w:hAnsi="Garamond"/>
@@ -8644,7 +8572,7 @@
           <w:noProof/>
         </w:rPr>
         <w:drawing>
-          <wp:inline distT="0" distB="0" distL="0" distR="0" wp14:anchorId="3C266C2A" wp14:editId="3856C6B2">
+          <wp:inline distT="0" distB="0" distL="0" distR="0" wp14:anchorId="3C266C2A" wp14:editId="3AB9C99F">
             <wp:extent cx="3416300" cy="2271095"/>
             <wp:effectExtent l="0" t="0" r="0" b="0"/>
             <wp:docPr id="1712662771" name="Picture 18"/>
@@ -8659,7 +8587,7 @@
                     <pic:cNvPicPr/>
                   </pic:nvPicPr>
                   <pic:blipFill>
-                    <a:blip r:embed="rId20" cstate="print">
+                    <a:blip r:embed="rId16" cstate="print">
                       <a:extLst>
                         <a:ext uri="{28A0092B-C50C-407E-A947-70E740481C1C}">
                           <a14:useLocalDpi xmlns:a14="http://schemas.microsoft.com/office/drawing/2010/main" val="0"/>
@@ -8698,7 +8626,7 @@
           <w:lang w:val="en-US"/>
         </w:rPr>
       </w:pPr>
-      <w:bookmarkStart w:id="20" w:name="_Ref235113368"/>
+      <w:bookmarkStart w:id="17" w:name="_Ref235113368"/>
       <w:r>
         <w:rPr>
           <w:rFonts w:ascii="Garamond" w:hAnsi="Garamond"/>
@@ -8767,7 +8695,7 @@
         </w:rPr>
         <w:fldChar w:fldCharType="end"/>
       </w:r>
-      <w:bookmarkEnd w:id="20"/>
+      <w:bookmarkEnd w:id="17"/>
       <w:r>
         <w:rPr>
           <w:rFonts w:ascii="Garamond" w:hAnsi="Garamond"/>
@@ -8794,7 +8722,7 @@
           <w:lang w:val="en-GB"/>
         </w:rPr>
       </w:pPr>
-      <w:bookmarkStart w:id="21" w:name="_Toc235198499"/>
+      <w:bookmarkStart w:id="18" w:name="_Toc235198499"/>
       <w:r>
         <w:rPr>
           <w:rFonts w:ascii="Garamond" w:hAnsi="Garamond"/>
@@ -8817,7 +8745,7 @@
         </w:rPr>
         <w:t xml:space="preserve"> elevation threshold</w:t>
       </w:r>
-      <w:bookmarkEnd w:id="21"/>
+      <w:bookmarkEnd w:id="18"/>
     </w:p>
     <w:p>
       <w:pPr>
@@ -9089,88 +9017,7 @@
           <w:color w:val="00B050"/>
           <w:lang w:val="en-US"/>
         </w:rPr>
-        <w:t>stage 1</w:t>
-      </w:r>
-      <w:r>
-        <w:rPr>
-          <w:rFonts w:ascii="Garamond" w:hAnsi="Garamond"/>
-          <w:lang w:val="en-US"/>
-        </w:rPr>
-        <w:t xml:space="preserve">, </w:t>
-      </w:r>
-      <w:r>
-        <w:rPr>
-          <w:rFonts w:ascii="Garamond" w:hAnsi="Garamond"/>
-          <w:lang w:val="en-US"/>
-        </w:rPr>
-        <w:t xml:space="preserve">as </w:t>
-      </w:r>
-      <w:r>
-        <w:rPr>
-          <w:rFonts w:ascii="Garamond" w:hAnsi="Garamond"/>
-          <w:lang w:val="en-US"/>
-        </w:rPr>
-        <w:t>the region-specific input datasets</w:t>
-      </w:r>
-      <w:r>
-        <w:rPr>
-          <w:rFonts w:ascii="Garamond" w:hAnsi="Garamond"/>
-          <w:lang w:val="en-US"/>
-        </w:rPr>
-        <w:t xml:space="preserve"> were previously created</w:t>
-      </w:r>
-      <w:r>
-        <w:rPr>
-          <w:rFonts w:ascii="Garamond" w:hAnsi="Garamond"/>
-          <w:lang w:val="en-US"/>
-        </w:rPr>
-        <w:t>,</w:t>
-      </w:r>
-      <w:r>
-        <w:rPr>
-          <w:rFonts w:ascii="Garamond" w:hAnsi="Garamond"/>
-          <w:i/>
-          <w:iCs/>
-          <w:lang w:val="en-US"/>
-        </w:rPr>
-        <w:t xml:space="preserve"> </w:t>
-      </w:r>
-      <w:r>
-        <w:rPr>
-          <w:rFonts w:ascii="Garamond" w:hAnsi="Garamond"/>
-          <w:lang w:val="en-US"/>
-        </w:rPr>
-        <w:t xml:space="preserve">and </w:t>
-      </w:r>
-      <w:r>
-        <w:rPr>
-          <w:rFonts w:ascii="Garamond" w:hAnsi="Garamond"/>
-          <w:lang w:val="en-US"/>
-        </w:rPr>
-        <w:t>leave</w:t>
-      </w:r>
-      <w:r>
-        <w:rPr>
-          <w:rFonts w:ascii="Garamond" w:hAnsi="Garamond"/>
-          <w:lang w:val="en-US"/>
-        </w:rPr>
-        <w:t xml:space="preserve"> </w:t>
-      </w:r>
-      <w:r>
-        <w:rPr>
-          <w:rFonts w:ascii="Garamond" w:hAnsi="Garamond"/>
-          <w:lang w:val="en-US"/>
-        </w:rPr>
-        <w:t>stages</w:t>
-      </w:r>
-      <w:r>
-        <w:rPr>
-          <w:rFonts w:ascii="Garamond" w:hAnsi="Garamond"/>
-          <w:i/>
-          <w:iCs/>
-          <w:lang w:val="en-US"/>
-        </w:rPr>
-        <w:t xml:space="preserve"> </w:t>
+        <w:t>stage</w:t>
       </w:r>
       <w:r>
         <w:rPr>
@@ -9180,16 +9027,7 @@
           <w:color w:val="00B050"/>
           <w:lang w:val="en-US"/>
         </w:rPr>
-        <w:t>2</w:t>
-      </w:r>
-      <w:r>
-        <w:rPr>
-          <w:rFonts w:ascii="Garamond" w:hAnsi="Garamond"/>
-          <w:i/>
-          <w:iCs/>
-          <w:lang w:val="en-US"/>
-        </w:rPr>
-        <w:t xml:space="preserve">, </w:t>
+        <w:t> </w:t>
       </w:r>
       <w:r>
         <w:rPr>
@@ -9199,7 +9037,42 @@
           <w:color w:val="00B050"/>
           <w:lang w:val="en-US"/>
         </w:rPr>
-        <w:t>3</w:t>
+        <w:t>1</w:t>
+      </w:r>
+      <w:r>
+        <w:rPr>
+          <w:rFonts w:ascii="Garamond" w:hAnsi="Garamond"/>
+          <w:lang w:val="en-US"/>
+        </w:rPr>
+        <w:t xml:space="preserve">, </w:t>
+      </w:r>
+      <w:r>
+        <w:rPr>
+          <w:rFonts w:ascii="Garamond" w:hAnsi="Garamond"/>
+          <w:lang w:val="en-US"/>
+        </w:rPr>
+        <w:t xml:space="preserve">as </w:t>
+      </w:r>
+      <w:r>
+        <w:rPr>
+          <w:rFonts w:ascii="Garamond" w:hAnsi="Garamond"/>
+          <w:lang w:val="en-US"/>
+        </w:rPr>
+        <w:t>the region-specific input datasets</w:t>
+      </w:r>
+      <w:r>
+        <w:rPr>
+          <w:rFonts w:ascii="Garamond" w:hAnsi="Garamond"/>
+          <w:lang w:val="en-US"/>
+        </w:rPr>
+        <w:t xml:space="preserve"> were previously created</w:t>
+      </w:r>
+      <w:r>
+        <w:rPr>
+          <w:rFonts w:ascii="Garamond" w:hAnsi="Garamond"/>
+          <w:lang w:val="en-US"/>
+        </w:rPr>
+        <w:t>,</w:t>
       </w:r>
       <w:r>
         <w:rPr>
@@ -9208,7 +9081,44 @@
           <w:iCs/>
           <w:lang w:val="en-US"/>
         </w:rPr>
-        <w:t xml:space="preserve">, </w:t>
+        <w:t xml:space="preserve"> </w:t>
+      </w:r>
+      <w:r>
+        <w:rPr>
+          <w:rFonts w:ascii="Garamond" w:hAnsi="Garamond"/>
+          <w:lang w:val="en-US"/>
+        </w:rPr>
+        <w:t xml:space="preserve">and </w:t>
+      </w:r>
+      <w:r>
+        <w:rPr>
+          <w:rFonts w:ascii="Garamond" w:hAnsi="Garamond"/>
+          <w:lang w:val="en-US"/>
+        </w:rPr>
+        <w:t>leave</w:t>
+      </w:r>
+      <w:r>
+        <w:rPr>
+          <w:rFonts w:ascii="Garamond" w:hAnsi="Garamond"/>
+          <w:lang w:val="en-US"/>
+        </w:rPr>
+        <w:t xml:space="preserve"> </w:t>
+      </w:r>
+      <w:r>
+        <w:rPr>
+          <w:rFonts w:ascii="Garamond" w:hAnsi="Garamond"/>
+          <w:lang w:val="en-US"/>
+        </w:rPr>
+        <w:t>stages</w:t>
+      </w:r>
+      <w:r>
+        <w:rPr>
+          <w:rFonts w:ascii="Garamond" w:hAnsi="Garamond"/>
+          <w:i/>
+          <w:iCs/>
+          <w:lang w:val="en-US"/>
+        </w:rPr>
+        <w:t xml:space="preserve"> </w:t>
       </w:r>
       <w:r>
         <w:rPr>
@@ -9218,14 +9128,16 @@
           <w:color w:val="00B050"/>
           <w:lang w:val="en-US"/>
         </w:rPr>
-        <w:t>5</w:t>
-      </w:r>
-      <w:r>
-        <w:rPr>
-          <w:rFonts w:ascii="Garamond" w:hAnsi="Garamond"/>
-          <w:lang w:val="en-US"/>
-        </w:rPr>
-        <w:t xml:space="preserve"> and </w:t>
+        <w:t>2</w:t>
+      </w:r>
+      <w:r>
+        <w:rPr>
+          <w:rFonts w:ascii="Garamond" w:hAnsi="Garamond"/>
+          <w:i/>
+          <w:iCs/>
+          <w:lang w:val="en-US"/>
+        </w:rPr>
+        <w:t xml:space="preserve">, </w:t>
       </w:r>
       <w:r>
         <w:rPr>
@@ -9235,7 +9147,16 @@
           <w:color w:val="00B050"/>
           <w:lang w:val="en-US"/>
         </w:rPr>
-        <w:t>6</w:t>
+        <w:t>3</w:t>
+      </w:r>
+      <w:r>
+        <w:rPr>
+          <w:rFonts w:ascii="Garamond" w:hAnsi="Garamond"/>
+          <w:i/>
+          <w:iCs/>
+          <w:lang w:val="en-US"/>
+        </w:rPr>
+        <w:t xml:space="preserve">, </w:t>
       </w:r>
       <w:r>
         <w:rPr>
@@ -9245,23 +9166,14 @@
           <w:color w:val="00B050"/>
           <w:lang w:val="en-US"/>
         </w:rPr>
-        <w:t xml:space="preserve"> enabled</w:t>
-      </w:r>
-      <w:r>
-        <w:rPr>
-          <w:rFonts w:ascii="Garamond" w:hAnsi="Garamond"/>
-          <w:lang w:val="en-US"/>
-        </w:rPr>
-        <w:t>. Leave the optional resource-threshold relaxation stage</w:t>
-      </w:r>
-      <w:r>
-        <w:rPr>
-          <w:rFonts w:ascii="Garamond" w:hAnsi="Garamond"/>
-          <w:i/>
-          <w:iCs/>
-          <w:lang w:val="en-US"/>
-        </w:rPr>
-        <w:t xml:space="preserve">, </w:t>
+        <w:t>4</w:t>
+      </w:r>
+      <w:r>
+        <w:rPr>
+          <w:rFonts w:ascii="Garamond" w:hAnsi="Garamond"/>
+          <w:lang w:val="en-US"/>
+        </w:rPr>
+        <w:t xml:space="preserve"> and </w:t>
       </w:r>
       <w:r>
         <w:rPr>
@@ -9271,14 +9183,24 @@
           <w:color w:val="00B050"/>
           <w:lang w:val="en-US"/>
         </w:rPr>
-        <w:t>stage 4</w:t>
-      </w:r>
-      <w:r>
-        <w:rPr>
-          <w:rFonts w:ascii="Garamond" w:hAnsi="Garamond"/>
-          <w:lang w:val="en-US"/>
-        </w:rPr>
-        <w:t>, disabled.</w:t>
+        <w:t>5</w:t>
+      </w:r>
+      <w:r>
+        <w:rPr>
+          <w:rFonts w:ascii="Garamond" w:hAnsi="Garamond"/>
+          <w:i/>
+          <w:iCs/>
+          <w:color w:val="00B050"/>
+          <w:lang w:val="en-US"/>
+        </w:rPr>
+        <w:t xml:space="preserve"> enabled</w:t>
+      </w:r>
+      <w:r>
+        <w:rPr>
+          <w:rFonts w:ascii="Garamond" w:hAnsi="Garamond"/>
+          <w:lang w:val="en-US"/>
+        </w:rPr>
+        <w:t xml:space="preserve">. </w:t>
       </w:r>
     </w:p>
     <w:p>
@@ -9575,7 +9497,27 @@
           <w:color w:val="00B050"/>
           <w:lang w:val="en-US"/>
         </w:rPr>
-        <w:t>stage6_attribution</w:t>
+        <w:t>stage</w:t>
+      </w:r>
+      <w:r>
+        <w:rPr>
+          <w:rFonts w:ascii="Garamond" w:hAnsi="Garamond"/>
+          <w:i/>
+          <w:iCs/>
+          <w:color w:val="00B050"/>
+          <w:lang w:val="en-US"/>
+        </w:rPr>
+        <w:t>5</w:t>
+      </w:r>
+      <w:r>
+        <w:rPr>
+          <w:rFonts w:ascii="Garamond" w:hAnsi="Garamond"/>
+          <w:i/>
+          <w:iCs/>
+          <w:color w:val="00B050"/>
+          <w:lang w:val="en-US"/>
+        </w:rPr>
+        <w:t>_attribution</w:t>
       </w:r>
       <w:r>
         <w:rPr>
@@ -9897,7 +9839,7 @@
                     <pic:cNvPicPr/>
                   </pic:nvPicPr>
                   <pic:blipFill rotWithShape="1">
-                    <a:blip r:embed="rId21" cstate="print">
+                    <a:blip r:embed="rId17" cstate="print">
                       <a:extLst>
                         <a:ext uri="{28A0092B-C50C-407E-A947-70E740481C1C}">
                           <a14:useLocalDpi xmlns:a14="http://schemas.microsoft.com/office/drawing/2010/main" val="0"/>
@@ -9944,7 +9886,7 @@
           <w:szCs w:val="16"/>
         </w:rPr>
       </w:pPr>
-      <w:bookmarkStart w:id="22" w:name="_Ref235110789"/>
+      <w:bookmarkStart w:id="19" w:name="_Ref235110789"/>
       <w:r>
         <w:rPr>
           <w:rFonts w:ascii="Garamond" w:hAnsi="Garamond"/>
@@ -10013,7 +9955,7 @@
         </w:rPr>
         <w:fldChar w:fldCharType="end"/>
       </w:r>
-      <w:bookmarkEnd w:id="22"/>
+      <w:bookmarkEnd w:id="19"/>
       <w:r>
         <w:rPr>
           <w:rFonts w:ascii="Garamond" w:hAnsi="Garamond"/>
@@ -10046,7 +9988,7 @@
           <w:lang w:val="en-US"/>
         </w:rPr>
         <w:drawing>
-          <wp:inline distT="0" distB="0" distL="0" distR="0" wp14:anchorId="4D499EA3" wp14:editId="1EEE559A">
+          <wp:inline distT="0" distB="0" distL="0" distR="0" wp14:anchorId="4D499EA3" wp14:editId="0B0E32A6">
             <wp:extent cx="3435914" cy="2381250"/>
             <wp:effectExtent l="0" t="0" r="0" b="0"/>
             <wp:docPr id="1429674699" name="Picture 19"/>
@@ -10061,7 +10003,7 @@
                     <pic:cNvPicPr/>
                   </pic:nvPicPr>
                   <pic:blipFill>
-                    <a:blip r:embed="rId22" cstate="print">
+                    <a:blip r:embed="rId18" cstate="print">
                       <a:extLst>
                         <a:ext uri="{28A0092B-C50C-407E-A947-70E740481C1C}">
                           <a14:useLocalDpi xmlns:a14="http://schemas.microsoft.com/office/drawing/2010/main" val="0"/>
@@ -10098,7 +10040,7 @@
           <w:lang w:val="en-US"/>
         </w:rPr>
       </w:pPr>
-      <w:bookmarkStart w:id="23" w:name="_Ref235105416"/>
+      <w:bookmarkStart w:id="20" w:name="_Ref235105416"/>
       <w:r>
         <w:rPr>
           <w:rFonts w:ascii="Garamond" w:hAnsi="Garamond"/>
@@ -10167,7 +10109,7 @@
         </w:rPr>
         <w:fldChar w:fldCharType="end"/>
       </w:r>
-      <w:bookmarkEnd w:id="23"/>
+      <w:bookmarkEnd w:id="20"/>
       <w:r>
         <w:rPr>
           <w:rFonts w:ascii="Garamond" w:hAnsi="Garamond"/>
@@ -10203,7 +10145,6 @@
           <w:rFonts w:ascii="Garamond" w:hAnsi="Garamond"/>
           <w:lang w:val="en-US"/>
         </w:rPr>
-        <w:lastRenderedPageBreak/>
         <w:t xml:space="preserve">The region subfolder also contains summary figures showing the composition </w:t>
       </w:r>
       <w:r>
@@ -10430,7 +10371,7 @@
                     <pic:cNvPicPr/>
                   </pic:nvPicPr>
                   <pic:blipFill>
-                    <a:blip r:embed="rId23" cstate="print">
+                    <a:blip r:embed="rId19" cstate="print">
                       <a:extLst>
                         <a:ext uri="{28A0092B-C50C-407E-A947-70E740481C1C}">
                           <a14:useLocalDpi xmlns:a14="http://schemas.microsoft.com/office/drawing/2010/main" val="0"/>
@@ -10480,7 +10421,7 @@
           <w:lang w:val="en-US"/>
         </w:rPr>
       </w:pPr>
-      <w:bookmarkStart w:id="24" w:name="_Ref235105268"/>
+      <w:bookmarkStart w:id="21" w:name="_Ref235105268"/>
       <w:r>
         <w:rPr>
           <w:rFonts w:ascii="Garamond" w:hAnsi="Garamond"/>
@@ -10549,7 +10490,7 @@
         </w:rPr>
         <w:fldChar w:fldCharType="end"/>
       </w:r>
-      <w:bookmarkEnd w:id="24"/>
+      <w:bookmarkEnd w:id="21"/>
       <w:r>
         <w:rPr>
           <w:rFonts w:ascii="Garamond" w:hAnsi="Garamond"/>
@@ -10589,7 +10530,7 @@
                     <pic:cNvPicPr/>
                   </pic:nvPicPr>
                   <pic:blipFill>
-                    <a:blip r:embed="rId24" cstate="print">
+                    <a:blip r:embed="rId20" cstate="print">
                       <a:extLst>
                         <a:ext uri="{28A0092B-C50C-407E-A947-70E740481C1C}">
                           <a14:useLocalDpi xmlns:a14="http://schemas.microsoft.com/office/drawing/2010/main" val="0"/>
@@ -10636,7 +10577,7 @@
           <w:szCs w:val="16"/>
         </w:rPr>
       </w:pPr>
-      <w:bookmarkStart w:id="25" w:name="_Ref235105424"/>
+      <w:bookmarkStart w:id="22" w:name="_Ref235105424"/>
       <w:r>
         <w:rPr>
           <w:rFonts w:ascii="Garamond" w:hAnsi="Garamond"/>
@@ -10705,7 +10646,7 @@
         </w:rPr>
         <w:fldChar w:fldCharType="end"/>
       </w:r>
-      <w:bookmarkEnd w:id="25"/>
+      <w:bookmarkEnd w:id="22"/>
       <w:r>
         <w:rPr>
           <w:rFonts w:ascii="Garamond" w:hAnsi="Garamond"/>
@@ -10724,7 +10665,7 @@
           <w:lang w:val="en-GB"/>
         </w:rPr>
       </w:pPr>
-      <w:bookmarkStart w:id="26" w:name="_Toc235198500"/>
+      <w:bookmarkStart w:id="23" w:name="_Toc235198500"/>
       <w:r>
         <w:rPr>
           <w:rFonts w:ascii="Garamond" w:hAnsi="Garamond"/>
@@ -10767,7 +10708,7 @@
         </w:rPr>
         <w:t>solar PV</w:t>
       </w:r>
-      <w:bookmarkEnd w:id="26"/>
+      <w:bookmarkEnd w:id="23"/>
     </w:p>
     <w:p>
       <w:pPr>
@@ -11077,7 +11018,7 @@
           <w:color w:val="00B050"/>
           <w:lang w:val="en-US"/>
         </w:rPr>
-        <w:t>5</w:t>
+        <w:t>4</w:t>
       </w:r>
       <w:r>
         <w:rPr>
@@ -11102,117 +11043,103 @@
           <w:color w:val="00B050"/>
           <w:lang w:val="en-US"/>
         </w:rPr>
-        <w:t>6</w:t>
-      </w:r>
-      <w:r>
-        <w:rPr>
-          <w:rFonts w:ascii="Garamond" w:hAnsi="Garamond"/>
-          <w:lang w:val="en-US"/>
-        </w:rPr>
-        <w:t>. Leave the optional resource-threshold relaxation stage</w:t>
-      </w:r>
-      <w:r>
-        <w:rPr>
-          <w:rFonts w:ascii="Garamond" w:hAnsi="Garamond"/>
+        <w:t>5</w:t>
+      </w:r>
+      <w:r>
+        <w:rPr>
+          <w:rFonts w:ascii="Garamond" w:hAnsi="Garamond"/>
+          <w:lang w:val="en-US"/>
+        </w:rPr>
+        <w:t xml:space="preserve">. </w:t>
+      </w:r>
+    </w:p>
+    <w:p>
+      <w:pPr>
+        <w:rPr>
+          <w:rFonts w:ascii="Garamond" w:hAnsi="Garamond"/>
+          <w:lang w:val="en-US"/>
+        </w:rPr>
+      </w:pPr>
+    </w:p>
+    <w:p>
+      <w:pPr>
+        <w:rPr>
+          <w:rFonts w:ascii="Garamond" w:hAnsi="Garamond"/>
+          <w:lang w:val="en-US"/>
+        </w:rPr>
+      </w:pPr>
+      <w:r>
+        <w:rPr>
+          <w:rFonts w:ascii="Segoe UI Emoji" w:hAnsi="Segoe UI Emoji" w:cs="Segoe UI Emoji"/>
+          <w:lang w:val="en-US"/>
+        </w:rPr>
+        <w:t>👉🏼</w:t>
+      </w:r>
+      <w:r>
+        <w:rPr>
+          <w:rFonts w:ascii="Garamond" w:hAnsi="Garamond"/>
+          <w:lang w:val="en-US"/>
+        </w:rPr>
+        <w:t xml:space="preserve"> </w:t>
+      </w:r>
+      <w:r>
+        <w:rPr>
+          <w:rFonts w:ascii="Garamond" w:hAnsi="Garamond"/>
+          <w:lang w:val="en-US"/>
+        </w:rPr>
+        <w:t xml:space="preserve">Run </w:t>
+      </w:r>
+      <w:r>
+        <w:rPr>
+          <w:rFonts w:ascii="Garamond" w:hAnsi="Garamond"/>
+          <w:b/>
+          <w:bCs/>
           <w:i/>
           <w:iCs/>
-          <w:lang w:val="en-US"/>
-        </w:rPr>
-        <w:t xml:space="preserve">, </w:t>
-      </w:r>
-      <w:r>
-        <w:rPr>
-          <w:rFonts w:ascii="Garamond" w:hAnsi="Garamond"/>
+          <w:color w:val="808080" w:themeColor="background1" w:themeShade="80"/>
+          <w:lang w:val="en-US"/>
+        </w:rPr>
+        <w:t>msr_creator.py</w:t>
+      </w:r>
+      <w:r>
+        <w:rPr>
+          <w:rFonts w:ascii="Garamond" w:hAnsi="Garamond"/>
+          <w:lang w:val="en-US"/>
+        </w:rPr>
+        <w:t xml:space="preserve">. </w:t>
+      </w:r>
+      <w:r>
+        <w:rPr>
+          <w:rFonts w:ascii="Garamond" w:hAnsi="Garamond"/>
+          <w:lang w:val="en-US"/>
+        </w:rPr>
+        <w:t xml:space="preserve">A </w:t>
+      </w:r>
+      <w:r>
+        <w:rPr>
+          <w:rFonts w:ascii="Garamond" w:hAnsi="Garamond"/>
+          <w:lang w:val="en-US"/>
+        </w:rPr>
+        <w:t xml:space="preserve">new shapefile is created </w:t>
+      </w:r>
+      <w:r>
+        <w:rPr>
+          <w:rFonts w:ascii="Garamond" w:hAnsi="Garamond"/>
+          <w:lang w:val="en-US"/>
+        </w:rPr>
+        <w:t xml:space="preserve">in the </w:t>
+      </w:r>
+      <w:r>
+        <w:rPr>
+          <w:rFonts w:ascii="Garamond" w:hAnsi="Garamond"/>
+          <w:b/>
+          <w:bCs/>
           <w:i/>
           <w:iCs/>
           <w:color w:val="00B050"/>
           <w:lang w:val="en-US"/>
         </w:rPr>
-        <w:t>stage 4</w:t>
-      </w:r>
-      <w:r>
-        <w:rPr>
-          <w:rFonts w:ascii="Garamond" w:hAnsi="Garamond"/>
-          <w:lang w:val="en-US"/>
-        </w:rPr>
-        <w:t>, disabled.</w:t>
-      </w:r>
-    </w:p>
-    <w:p>
-      <w:pPr>
-        <w:rPr>
-          <w:rFonts w:ascii="Garamond" w:hAnsi="Garamond"/>
-          <w:lang w:val="en-US"/>
-        </w:rPr>
-      </w:pPr>
-    </w:p>
-    <w:p>
-      <w:pPr>
-        <w:rPr>
-          <w:rFonts w:ascii="Garamond" w:hAnsi="Garamond"/>
-          <w:lang w:val="en-US"/>
-        </w:rPr>
-      </w:pPr>
-      <w:r>
-        <w:rPr>
-          <w:rFonts w:ascii="Segoe UI Emoji" w:hAnsi="Segoe UI Emoji" w:cs="Segoe UI Emoji"/>
-          <w:lang w:val="en-US"/>
-        </w:rPr>
-        <w:t>👉🏼</w:t>
-      </w:r>
-      <w:r>
-        <w:rPr>
-          <w:rFonts w:ascii="Garamond" w:hAnsi="Garamond"/>
-          <w:lang w:val="en-US"/>
-        </w:rPr>
-        <w:t xml:space="preserve"> </w:t>
-      </w:r>
-      <w:r>
-        <w:rPr>
-          <w:rFonts w:ascii="Garamond" w:hAnsi="Garamond"/>
-          <w:lang w:val="en-US"/>
-        </w:rPr>
-        <w:t xml:space="preserve">Run </w:t>
-      </w:r>
-      <w:r>
-        <w:rPr>
-          <w:rFonts w:ascii="Garamond" w:hAnsi="Garamond"/>
-          <w:b/>
-          <w:bCs/>
-          <w:i/>
-          <w:iCs/>
-          <w:color w:val="808080" w:themeColor="background1" w:themeShade="80"/>
-          <w:lang w:val="en-US"/>
-        </w:rPr>
-        <w:t>msr_creator.py</w:t>
-      </w:r>
-      <w:r>
-        <w:rPr>
-          <w:rFonts w:ascii="Garamond" w:hAnsi="Garamond"/>
-          <w:lang w:val="en-US"/>
-        </w:rPr>
-        <w:t xml:space="preserve">. </w:t>
-      </w:r>
-      <w:r>
-        <w:rPr>
-          <w:rFonts w:ascii="Garamond" w:hAnsi="Garamond"/>
-          <w:lang w:val="en-US"/>
-        </w:rPr>
-        <w:t xml:space="preserve">A </w:t>
-      </w:r>
-      <w:r>
-        <w:rPr>
-          <w:rFonts w:ascii="Garamond" w:hAnsi="Garamond"/>
-          <w:lang w:val="en-US"/>
-        </w:rPr>
-        <w:t xml:space="preserve">new shapefile is created </w:t>
-      </w:r>
-      <w:r>
-        <w:rPr>
-          <w:rFonts w:ascii="Garamond" w:hAnsi="Garamond"/>
-          <w:lang w:val="en-US"/>
-        </w:rPr>
-        <w:t xml:space="preserve">in the </w:t>
+        <w:t>stage</w:t>
       </w:r>
       <w:r>
         <w:rPr>
@@ -11224,7 +11151,19 @@
           <w:color w:val="00B050"/>
           <w:lang w:val="en-US"/>
         </w:rPr>
-        <w:t>stage6_attribution</w:t>
+        <w:t>5</w:t>
+      </w:r>
+      <w:r>
+        <w:rPr>
+          <w:rFonts w:ascii="Garamond" w:hAnsi="Garamond"/>
+          <w:b/>
+          <w:bCs/>
+          <w:i/>
+          <w:iCs/>
+          <w:color w:val="00B050"/>
+          <w:lang w:val="en-US"/>
+        </w:rPr>
+        <w:t>_attribution</w:t>
       </w:r>
       <w:r>
         <w:rPr>
@@ -11379,7 +11318,7 @@
                     <pic:cNvPicPr/>
                   </pic:nvPicPr>
                   <pic:blipFill rotWithShape="1">
-                    <a:blip r:embed="rId25" cstate="print">
+                    <a:blip r:embed="rId21" cstate="print">
                       <a:extLst>
                         <a:ext uri="{28A0092B-C50C-407E-A947-70E740481C1C}">
                           <a14:useLocalDpi xmlns:a14="http://schemas.microsoft.com/office/drawing/2010/main" val="0"/>
@@ -11427,7 +11366,7 @@
           <w:lang w:val="en-US"/>
         </w:rPr>
       </w:pPr>
-      <w:bookmarkStart w:id="27" w:name="_Ref235201190"/>
+      <w:bookmarkStart w:id="24" w:name="_Ref235201190"/>
       <w:r>
         <w:rPr>
           <w:rFonts w:ascii="Garamond" w:hAnsi="Garamond"/>
@@ -11496,7 +11435,7 @@
         </w:rPr>
         <w:fldChar w:fldCharType="end"/>
       </w:r>
-      <w:bookmarkEnd w:id="27"/>
+      <w:bookmarkEnd w:id="24"/>
       <w:r>
         <w:rPr>
           <w:rFonts w:ascii="Garamond" w:hAnsi="Garamond"/>
@@ -11530,7 +11469,7 @@
           <w:lang w:val="en-GB"/>
         </w:rPr>
       </w:pPr>
-      <w:bookmarkStart w:id="28" w:name="_Toc235198501"/>
+      <w:bookmarkStart w:id="25" w:name="_Toc235198501"/>
       <w:r>
         <w:rPr>
           <w:rFonts w:ascii="Garamond" w:hAnsi="Garamond"/>
@@ -11559,7 +11498,7 @@
         </w:rPr>
         <w:t>Profile Generator</w:t>
       </w:r>
-      <w:bookmarkEnd w:id="28"/>
+      <w:bookmarkEnd w:id="25"/>
     </w:p>
     <w:p>
       <w:pPr>
@@ -11677,7 +11616,7 @@
           <w:lang w:val="en-GB"/>
         </w:rPr>
       </w:pPr>
-      <w:bookmarkStart w:id="29" w:name="_Toc235198502"/>
+      <w:bookmarkStart w:id="26" w:name="_Toc235198502"/>
       <w:r>
         <w:rPr>
           <w:rFonts w:ascii="Garamond" w:hAnsi="Garamond"/>
@@ -11706,7 +11645,7 @@
         </w:rPr>
         <w:t>Attributor Combiner</w:t>
       </w:r>
-      <w:bookmarkEnd w:id="29"/>
+      <w:bookmarkEnd w:id="26"/>
     </w:p>
     <w:p>
       <w:pPr>
@@ -11761,7 +11700,7 @@
           <w:lang w:val="en-GB"/>
         </w:rPr>
       </w:pPr>
-      <w:bookmarkStart w:id="30" w:name="_Toc235198503"/>
+      <w:bookmarkStart w:id="27" w:name="_Toc235198503"/>
       <w:r>
         <w:rPr>
           <w:rFonts w:ascii="Garamond" w:hAnsi="Garamond"/>
@@ -11769,7 +11708,7 @@
         </w:rPr>
         <w:t>Part 4.1: LCOE</w:t>
       </w:r>
-      <w:bookmarkEnd w:id="30"/>
+      <w:bookmarkEnd w:id="27"/>
     </w:p>
     <w:p>
       <w:pPr>
@@ -11806,7 +11745,7 @@
           <w:lang w:val="en-GB"/>
         </w:rPr>
       </w:pPr>
-      <w:bookmarkStart w:id="31" w:name="_Toc235198504"/>
+      <w:bookmarkStart w:id="28" w:name="_Toc235198504"/>
       <w:r>
         <w:rPr>
           <w:rFonts w:ascii="Garamond" w:hAnsi="Garamond"/>
@@ -11821,7 +11760,7 @@
         </w:rPr>
         <w:t>4.2: Setting up the control file</w:t>
       </w:r>
-      <w:bookmarkEnd w:id="31"/>
+      <w:bookmarkEnd w:id="28"/>
     </w:p>
     <w:p>
       <w:pPr>
@@ -12569,7 +12508,7 @@
           <w:lang w:val="en-GB"/>
         </w:rPr>
       </w:pPr>
-      <w:bookmarkStart w:id="32" w:name="_Toc235198505"/>
+      <w:bookmarkStart w:id="29" w:name="_Toc235198505"/>
       <w:r>
         <w:rPr>
           <w:rFonts w:ascii="Garamond" w:hAnsi="Garamond"/>
@@ -12577,7 +12516,7 @@
         </w:rPr>
         <w:t>Part 4.3: Running the Attributor Combiner for wind</w:t>
       </w:r>
-      <w:bookmarkEnd w:id="32"/>
+      <w:bookmarkEnd w:id="29"/>
     </w:p>
     <w:p>
       <w:pPr>
@@ -13112,7 +13051,7 @@
                     <pic:cNvPicPr/>
                   </pic:nvPicPr>
                   <pic:blipFill>
-                    <a:blip r:embed="rId26" cstate="print">
+                    <a:blip r:embed="rId22" cstate="print">
                       <a:extLst>
                         <a:ext uri="{28A0092B-C50C-407E-A947-70E740481C1C}">
                           <a14:useLocalDpi xmlns:a14="http://schemas.microsoft.com/office/drawing/2010/main" val="0"/>
@@ -13151,7 +13090,7 @@
           <w:lang w:val="en-US"/>
         </w:rPr>
       </w:pPr>
-      <w:bookmarkStart w:id="33" w:name="_Ref235183406"/>
+      <w:bookmarkStart w:id="30" w:name="_Ref235183406"/>
       <w:r>
         <w:rPr>
           <w:rFonts w:ascii="Garamond" w:hAnsi="Garamond"/>
@@ -13219,7 +13158,7 @@
         </w:rPr>
         <w:fldChar w:fldCharType="end"/>
       </w:r>
-      <w:bookmarkEnd w:id="33"/>
+      <w:bookmarkEnd w:id="30"/>
       <w:r>
         <w:rPr>
           <w:rFonts w:ascii="Garamond" w:hAnsi="Garamond"/>
@@ -13237,7 +13176,7 @@
           <w:lang w:val="en-US"/>
         </w:rPr>
       </w:pPr>
-      <w:commentRangeStart w:id="34"/>
+      <w:commentRangeStart w:id="31"/>
       <w:r>
         <w:rPr>
           <w:rFonts w:ascii="Garamond" w:hAnsi="Garamond"/>
@@ -13260,7 +13199,7 @@
                     <pic:cNvPicPr/>
                   </pic:nvPicPr>
                   <pic:blipFill>
-                    <a:blip r:embed="rId27" cstate="print">
+                    <a:blip r:embed="rId23" cstate="print">
                       <a:extLst>
                         <a:ext uri="{28A0092B-C50C-407E-A947-70E740481C1C}">
                           <a14:useLocalDpi xmlns:a14="http://schemas.microsoft.com/office/drawing/2010/main" val="0"/>
@@ -13286,7 +13225,7 @@
           </wp:inline>
         </w:drawing>
       </w:r>
-      <w:commentRangeEnd w:id="34"/>
+      <w:commentRangeEnd w:id="31"/>
       <w:r>
         <w:rPr>
           <w:rStyle w:val="CommentReference"/>
@@ -13295,7 +13234,7 @@
           <w:szCs w:val="20"/>
           <w:lang w:val="en-US"/>
         </w:rPr>
-        <w:commentReference w:id="34"/>
+        <w:commentReference w:id="31"/>
       </w:r>
     </w:p>
     <w:p>
@@ -13309,7 +13248,7 @@
           <w:szCs w:val="16"/>
         </w:rPr>
       </w:pPr>
-      <w:bookmarkStart w:id="35" w:name="_Ref235183419"/>
+      <w:bookmarkStart w:id="32" w:name="_Ref235183419"/>
       <w:r>
         <w:rPr>
           <w:rFonts w:ascii="Garamond" w:hAnsi="Garamond"/>
@@ -13377,7 +13316,7 @@
         </w:rPr>
         <w:fldChar w:fldCharType="end"/>
       </w:r>
-      <w:bookmarkEnd w:id="35"/>
+      <w:bookmarkEnd w:id="32"/>
       <w:r>
         <w:rPr>
           <w:rFonts w:ascii="Garamond" w:hAnsi="Garamond"/>
@@ -13463,7 +13402,7 @@
           <w:szCs w:val="16"/>
         </w:rPr>
       </w:pPr>
-      <w:bookmarkStart w:id="36" w:name="_Ref235183429"/>
+      <w:bookmarkStart w:id="33" w:name="_Ref235183429"/>
       <w:r>
         <w:rPr>
           <w:rFonts w:ascii="Garamond" w:hAnsi="Garamond"/>
@@ -13531,7 +13470,7 @@
         </w:rPr>
         <w:fldChar w:fldCharType="end"/>
       </w:r>
-      <w:bookmarkEnd w:id="36"/>
+      <w:bookmarkEnd w:id="33"/>
       <w:r>
         <w:rPr>
           <w:rFonts w:ascii="Garamond" w:hAnsi="Garamond"/>
@@ -13550,7 +13489,7 @@
           <w:lang w:val="en-GB"/>
         </w:rPr>
       </w:pPr>
-      <w:bookmarkStart w:id="37" w:name="_Toc235198506"/>
+      <w:bookmarkStart w:id="34" w:name="_Toc235198506"/>
       <w:r>
         <w:rPr>
           <w:rFonts w:ascii="Garamond" w:hAnsi="Garamond"/>
@@ -13558,7 +13497,7 @@
         </w:rPr>
         <w:t>Part 4.3: Running the Attributor Combiner for solar PV</w:t>
       </w:r>
-      <w:bookmarkEnd w:id="37"/>
+      <w:bookmarkEnd w:id="34"/>
     </w:p>
     <w:p>
       <w:pPr>
@@ -14090,7 +14029,7 @@
           <w:lang w:val="en-US"/>
         </w:rPr>
       </w:pPr>
-      <w:bookmarkStart w:id="38" w:name="_Ref235187310"/>
+      <w:bookmarkStart w:id="35" w:name="_Ref235187310"/>
       <w:r>
         <w:rPr>
           <w:rFonts w:ascii="Garamond" w:hAnsi="Garamond"/>
@@ -14158,7 +14097,7 @@
         </w:rPr>
         <w:fldChar w:fldCharType="end"/>
       </w:r>
-      <w:bookmarkEnd w:id="38"/>
+      <w:bookmarkEnd w:id="35"/>
       <w:r>
         <w:rPr>
           <w:rFonts w:ascii="Garamond" w:hAnsi="Garamond"/>
@@ -14237,7 +14176,7 @@
           <w:szCs w:val="16"/>
         </w:rPr>
       </w:pPr>
-      <w:bookmarkStart w:id="39" w:name="_Ref235187303"/>
+      <w:bookmarkStart w:id="36" w:name="_Ref235187303"/>
       <w:r>
         <w:rPr>
           <w:rFonts w:ascii="Garamond" w:hAnsi="Garamond"/>
@@ -14305,7 +14244,7 @@
         </w:rPr>
         <w:fldChar w:fldCharType="end"/>
       </w:r>
-      <w:bookmarkEnd w:id="39"/>
+      <w:bookmarkEnd w:id="36"/>
       <w:r>
         <w:rPr>
           <w:rFonts w:ascii="Garamond" w:hAnsi="Garamond"/>
@@ -14393,7 +14332,7 @@
           <w:szCs w:val="16"/>
         </w:rPr>
       </w:pPr>
-      <w:bookmarkStart w:id="40" w:name="_Ref235187295"/>
+      <w:bookmarkStart w:id="37" w:name="_Ref235187295"/>
       <w:r>
         <w:rPr>
           <w:rFonts w:ascii="Garamond" w:hAnsi="Garamond"/>
@@ -14461,7 +14400,7 @@
         </w:rPr>
         <w:fldChar w:fldCharType="end"/>
       </w:r>
-      <w:bookmarkEnd w:id="40"/>
+      <w:bookmarkEnd w:id="37"/>
       <w:r>
         <w:rPr>
           <w:rFonts w:ascii="Garamond" w:hAnsi="Garamond"/>
@@ -14673,7 +14612,7 @@
           <w:lang w:val="en-US"/>
         </w:rPr>
       </w:pPr>
-      <w:bookmarkStart w:id="41" w:name="_Ref235188012"/>
+      <w:bookmarkStart w:id="38" w:name="_Ref235188012"/>
       <w:r>
         <w:rPr>
           <w:rFonts w:ascii="Garamond" w:hAnsi="Garamond"/>
@@ -14742,7 +14681,7 @@
         </w:rPr>
         <w:fldChar w:fldCharType="end"/>
       </w:r>
-      <w:bookmarkEnd w:id="41"/>
+      <w:bookmarkEnd w:id="38"/>
       <w:r>
         <w:rPr>
           <w:rFonts w:ascii="Garamond" w:hAnsi="Garamond"/>
@@ -14760,7 +14699,7 @@
           <w:lang w:val="en-GB"/>
         </w:rPr>
       </w:pPr>
-      <w:bookmarkStart w:id="42" w:name="_Toc235198507"/>
+      <w:bookmarkStart w:id="39" w:name="_Toc235198507"/>
       <w:r>
         <w:rPr>
           <w:rFonts w:ascii="Garamond" w:hAnsi="Garamond"/>
@@ -14775,7 +14714,7 @@
         </w:rPr>
         <w:t>Screener</w:t>
       </w:r>
-      <w:bookmarkEnd w:id="42"/>
+      <w:bookmarkEnd w:id="39"/>
     </w:p>
     <w:p>
       <w:pPr>
@@ -14862,7 +14801,7 @@
           <w:rFonts w:ascii="Garamond" w:hAnsi="Garamond"/>
         </w:rPr>
       </w:pPr>
-      <w:bookmarkStart w:id="43" w:name="_Toc235198508"/>
+      <w:bookmarkStart w:id="40" w:name="_Toc235198508"/>
       <w:r>
         <w:rPr>
           <w:rFonts w:ascii="Garamond" w:hAnsi="Garamond"/>
@@ -14876,7 +14815,7 @@
         </w:rPr>
         <w:t>Clustering</w:t>
       </w:r>
-      <w:bookmarkEnd w:id="43"/>
+      <w:bookmarkEnd w:id="40"/>
     </w:p>
     <w:p>
       <w:pPr>
@@ -14938,68 +14877,7 @@
 
 <file path=word/comments.xml><?xml version="1.0" encoding="utf-8"?>
 <w:comments xmlns:wpc="http://schemas.microsoft.com/office/word/2010/wordprocessingCanvas" xmlns:cx="http://schemas.microsoft.com/office/drawing/2014/chartex" xmlns:cx1="http://schemas.microsoft.com/office/drawing/2015/9/8/chartex" xmlns:cx2="http://schemas.microsoft.com/office/drawing/2015/10/21/chartex" xmlns:cx3="http://schemas.microsoft.com/office/drawing/2016/5/9/chartex" xmlns:cx4="http://schemas.microsoft.com/office/drawing/2016/5/10/chartex" xmlns:cx5="http://schemas.microsoft.com/office/drawing/2016/5/11/chartex" xmlns:cx6="http://schemas.microsoft.com/office/drawing/2016/5/12/chartex" xmlns:cx7="http://schemas.microsoft.com/office/drawing/2016/5/13/chartex" xmlns:cx8="http://schemas.microsoft.com/office/drawing/2016/5/14/chartex" xmlns:mc="http://schemas.openxmlformats.org/markup-compatibility/2006" xmlns:aink="http://schemas.microsoft.com/office/drawing/2016/ink" xmlns:am3d="http://schemas.microsoft.com/office/drawing/2017/model3d" xmlns:o="urn:schemas-microsoft-com:office:office" xmlns:oel="http://schemas.microsoft.com/office/2019/extlst" xmlns:r="http://schemas.openxmlformats.org/officeDocument/2006/relationships" xmlns:m="http://schemas.openxmlformats.org/officeDocument/2006/math" xmlns:v="urn:schemas-microsoft-com:vml" xmlns:wp14="http://schemas.microsoft.com/office/word/2010/wordprocessingDrawing" xmlns:wp="http://schemas.openxmlformats.org/drawingml/2006/wordprocessingDrawing" xmlns:w10="urn:schemas-microsoft-com:office:word" xmlns:w="http://schemas.openxmlformats.org/wordprocessingml/2006/main" xmlns:w14="http://schemas.microsoft.com/office/word/2010/wordml" xmlns:w15="http://schemas.microsoft.com/office/word/2012/wordml" xmlns:w16cex="http://schemas.microsoft.com/office/word/2018/wordml/cex" xmlns:w16cid="http://schemas.microsoft.com/office/word/2016/wordml/cid" xmlns:w16="http://schemas.microsoft.com/office/word/2018/wordml" xmlns:w16du="http://schemas.microsoft.com/office/word/2023/wordml/word16du" xmlns:w16sdtdh="http://schemas.microsoft.com/office/word/2020/wordml/sdtdatahash" xmlns:w16sdtfl="http://schemas.microsoft.com/office/word/2024/wordml/sdtformatlock" xmlns:w16se="http://schemas.microsoft.com/office/word/2015/wordml/symex" xmlns:wpg="http://schemas.microsoft.com/office/word/2010/wordprocessingGroup" xmlns:wpi="http://schemas.microsoft.com/office/word/2010/wordprocessingInk" xmlns:wne="http://schemas.microsoft.com/office/word/2006/wordml" xmlns:wps="http://schemas.microsoft.com/office/word/2010/wordprocessingShape" mc:Ignorable="w14 w15 w16se w16cid w16 w16cex w16sdtdh w16sdtfl w16du wp14">
-  <w:comment w:id="3" w:author="Sebastian Hendrik Sterl" w:date="2026-07-17T16:12:00Z" w:initials="SS">
-    <w:p>
-      <w:pPr>
-        <w:pStyle w:val="CommentText"/>
-        <w:jc w:val="left"/>
-      </w:pPr>
-      <w:r>
-        <w:rPr>
-          <w:rStyle w:val="CommentReference"/>
-        </w:rPr>
-        <w:annotationRef/>
-      </w:r>
-      <w:r>
-        <w:t xml:space="preserve">Deze mist nog op de repo (en </w:t>
-      </w:r>
-      <w:r>
-        <w:rPr>
-          <w:i/>
-          <w:iCs/>
-        </w:rPr>
-        <w:t>outputs</w:t>
-      </w:r>
-      <w:r>
-        <w:t xml:space="preserve"> ook)</w:t>
-      </w:r>
-    </w:p>
-  </w:comment>
-  <w:comment w:id="6" w:author="Sebastian Hendrik Sterl" w:date="2026-07-17T16:35:00Z" w:initials="SS">
-    <w:p>
-      <w:pPr>
-        <w:pStyle w:val="CommentText"/>
-        <w:jc w:val="left"/>
-      </w:pPr>
-      <w:r>
-        <w:rPr>
-          <w:rStyle w:val="CommentReference"/>
-        </w:rPr>
-        <w:annotationRef/>
-      </w:r>
-      <w:r>
-        <w:t>Ik vraag me af of het niet wat logischer is om deze sectie na afloop van de MSR creator opdracht te introduceren.</w:t>
-      </w:r>
-    </w:p>
-  </w:comment>
-  <w:comment w:id="17" w:author="Sebastian Hendrik Sterl" w:date="2026-07-17T15:21:00Z" w:initials="SS">
-    <w:p>
-      <w:pPr>
-        <w:pStyle w:val="CommentText"/>
-        <w:jc w:val="left"/>
-      </w:pPr>
-      <w:r>
-        <w:rPr>
-          <w:rStyle w:val="CommentReference"/>
-        </w:rPr>
-        <w:annotationRef/>
-      </w:r>
-      <w:r>
-        <w:t>Moet deze al bestaan of wordt deze gecreëerd?</w:t>
-      </w:r>
-    </w:p>
-  </w:comment>
-  <w:comment w:id="34" w:author="Sebastian Hendrik Sterl" w:date="2026-07-18T18:31:00Z" w:initials="SS">
+  <w:comment w:id="31" w:author="Sebastian Hendrik Sterl" w:date="2026-07-18T18:31:00Z" w:initials="SS">
     <w:p>
       <w:pPr>
         <w:pStyle w:val="CommentText"/>
@@ -15021,27 +14899,18 @@
 
 <file path=word/commentsExtended.xml><?xml version="1.0" encoding="utf-8"?>
 <w15:commentsEx xmlns:wpc="http://schemas.microsoft.com/office/word/2010/wordprocessingCanvas" xmlns:cx="http://schemas.microsoft.com/office/drawing/2014/chartex" xmlns:cx1="http://schemas.microsoft.com/office/drawing/2015/9/8/chartex" xmlns:cx2="http://schemas.microsoft.com/office/drawing/2015/10/21/chartex" xmlns:cx3="http://schemas.microsoft.com/office/drawing/2016/5/9/chartex" xmlns:cx4="http://schemas.microsoft.com/office/drawing/2016/5/10/chartex" xmlns:cx5="http://schemas.microsoft.com/office/drawing/2016/5/11/chartex" xmlns:cx6="http://schemas.microsoft.com/office/drawing/2016/5/12/chartex" xmlns:cx7="http://schemas.microsoft.com/office/drawing/2016/5/13/chartex" xmlns:cx8="http://schemas.microsoft.com/office/drawing/2016/5/14/chartex" xmlns:mc="http://schemas.openxmlformats.org/markup-compatibility/2006" xmlns:aink="http://schemas.microsoft.com/office/drawing/2016/ink" xmlns:am3d="http://schemas.microsoft.com/office/drawing/2017/model3d" xmlns:o="urn:schemas-microsoft-com:office:office" xmlns:oel="http://schemas.microsoft.com/office/2019/extlst" xmlns:r="http://schemas.openxmlformats.org/officeDocument/2006/relationships" xmlns:m="http://schemas.openxmlformats.org/officeDocument/2006/math" xmlns:v="urn:schemas-microsoft-com:vml" xmlns:wp14="http://schemas.microsoft.com/office/word/2010/wordprocessingDrawing" xmlns:wp="http://schemas.openxmlformats.org/drawingml/2006/wordprocessingDrawing" xmlns:w10="urn:schemas-microsoft-com:office:word" xmlns:w="http://schemas.openxmlformats.org/wordprocessingml/2006/main" xmlns:w14="http://schemas.microsoft.com/office/word/2010/wordml" xmlns:w15="http://schemas.microsoft.com/office/word/2012/wordml" xmlns:w16cex="http://schemas.microsoft.com/office/word/2018/wordml/cex" xmlns:w16cid="http://schemas.microsoft.com/office/word/2016/wordml/cid" xmlns:w16="http://schemas.microsoft.com/office/word/2018/wordml" xmlns:w16du="http://schemas.microsoft.com/office/word/2023/wordml/word16du" xmlns:w16sdtdh="http://schemas.microsoft.com/office/word/2020/wordml/sdtdatahash" xmlns:w16sdtfl="http://schemas.microsoft.com/office/word/2024/wordml/sdtformatlock" xmlns:w16se="http://schemas.microsoft.com/office/word/2015/wordml/symex" xmlns:wpg="http://schemas.microsoft.com/office/word/2010/wordprocessingGroup" xmlns:wpi="http://schemas.microsoft.com/office/word/2010/wordprocessingInk" xmlns:wne="http://schemas.microsoft.com/office/word/2006/wordml" xmlns:wps="http://schemas.microsoft.com/office/word/2010/wordprocessingShape" mc:Ignorable="w14 w15 w16se w16cid w16 w16cex w16sdtdh w16sdtfl w16du wp14">
-  <w15:commentEx w15:paraId="3723FF27" w15:done="1"/>
-  <w15:commentEx w15:paraId="26833D54" w15:done="0"/>
-  <w15:commentEx w15:paraId="2800DE26" w15:done="1"/>
   <w15:commentEx w15:paraId="5F9CFA9E" w15:done="0"/>
 </w15:commentsEx>
 </file>
 
 <file path=word/commentsExtensible.xml><?xml version="1.0" encoding="utf-8"?>
 <w16cex:commentsExtensible xmlns:wpc="http://schemas.microsoft.com/office/word/2010/wordprocessingCanvas" xmlns:cx="http://schemas.microsoft.com/office/drawing/2014/chartex" xmlns:cx1="http://schemas.microsoft.com/office/drawing/2015/9/8/chartex" xmlns:cx2="http://schemas.microsoft.com/office/drawing/2015/10/21/chartex" xmlns:cx3="http://schemas.microsoft.com/office/drawing/2016/5/9/chartex" xmlns:cx4="http://schemas.microsoft.com/office/drawing/2016/5/10/chartex" xmlns:cx5="http://schemas.microsoft.com/office/drawing/2016/5/11/chartex" xmlns:cx6="http://schemas.microsoft.com/office/drawing/2016/5/12/chartex" xmlns:cx7="http://schemas.microsoft.com/office/drawing/2016/5/13/chartex" xmlns:cx8="http://schemas.microsoft.com/office/drawing/2016/5/14/chartex" xmlns:cr="http://schemas.microsoft.com/office/comments/2020/reactions" xmlns:mc="http://schemas.openxmlformats.org/markup-compatibility/2006" xmlns:aink="http://schemas.microsoft.com/office/drawing/2016/ink" xmlns:am3d="http://schemas.microsoft.com/office/drawing/2017/model3d" xmlns:o="urn:schemas-microsoft-com:office:office" xmlns:oel="http://schemas.microsoft.com/office/2019/extlst" xmlns:r="http://schemas.openxmlformats.org/officeDocument/2006/relationships" xmlns:m="http://schemas.openxmlformats.org/officeDocument/2006/math" xmlns:v="urn:schemas-microsoft-com:vml" xmlns:wp14="http://schemas.microsoft.com/office/word/2010/wordprocessingDrawing" xmlns:wp="http://schemas.openxmlformats.org/drawingml/2006/wordprocessingDrawing" xmlns:w10="urn:schemas-microsoft-com:office:word" xmlns:w="http://schemas.openxmlformats.org/wordprocessingml/2006/main" xmlns:w14="http://schemas.microsoft.com/office/word/2010/wordml" xmlns:w15="http://schemas.microsoft.com/office/word/2012/wordml" xmlns:w16cex="http://schemas.microsoft.com/office/word/2018/wordml/cex" xmlns:w16cid="http://schemas.microsoft.com/office/word/2016/wordml/cid" xmlns:w16="http://schemas.microsoft.com/office/word/2018/wordml" xmlns:w16du="http://schemas.microsoft.com/office/word/2023/wordml/word16du" xmlns:w16sdtdh="http://schemas.microsoft.com/office/word/2020/wordml/sdtdatahash" xmlns:w16sdtfl="http://schemas.microsoft.com/office/word/2024/wordml/sdtformatlock" xmlns:w16se="http://schemas.microsoft.com/office/word/2015/wordml/symex" xmlns:wpg="http://schemas.microsoft.com/office/word/2010/wordprocessingGroup" xmlns:wpi="http://schemas.microsoft.com/office/word/2010/wordprocessingInk" xmlns:wne="http://schemas.microsoft.com/office/word/2006/wordml" xmlns:wps="http://schemas.microsoft.com/office/word/2010/wordprocessingShape" mc:Ignorable="w14 w15 w16se w16cid w16 w16cex w16sdtdh w16sdtfl cr w16du wp14">
-  <w16cex:commentExtensible w16cex:durableId="628A6A4D" w16cex:dateUtc="2026-07-17T14:12:00Z"/>
-  <w16cex:commentExtensible w16cex:durableId="3A95A9BB" w16cex:dateUtc="2026-07-17T14:35:00Z"/>
-  <w16cex:commentExtensible w16cex:durableId="2277D42F" w16cex:dateUtc="2026-07-17T13:21:00Z"/>
   <w16cex:commentExtensible w16cex:durableId="23C3CAF9" w16cex:dateUtc="2026-07-18T16:31:00Z"/>
 </w16cex:commentsExtensible>
 </file>
 
 <file path=word/commentsIds.xml><?xml version="1.0" encoding="utf-8"?>
 <w16cid:commentsIds xmlns:wpc="http://schemas.microsoft.com/office/word/2010/wordprocessingCanvas" xmlns:cx="http://schemas.microsoft.com/office/drawing/2014/chartex" xmlns:cx1="http://schemas.microsoft.com/office/drawing/2015/9/8/chartex" xmlns:cx2="http://schemas.microsoft.com/office/drawing/2015/10/21/chartex" xmlns:cx3="http://schemas.microsoft.com/office/drawing/2016/5/9/chartex" xmlns:cx4="http://schemas.microsoft.com/office/drawing/2016/5/10/chartex" xmlns:cx5="http://schemas.microsoft.com/office/drawing/2016/5/11/chartex" xmlns:cx6="http://schemas.microsoft.com/office/drawing/2016/5/12/chartex" xmlns:cx7="http://schemas.microsoft.com/office/drawing/2016/5/13/chartex" xmlns:cx8="http://schemas.microsoft.com/office/drawing/2016/5/14/chartex" xmlns:mc="http://schemas.openxmlformats.org/markup-compatibility/2006" xmlns:aink="http://schemas.microsoft.com/office/drawing/2016/ink" xmlns:am3d="http://schemas.microsoft.com/office/drawing/2017/model3d" xmlns:o="urn:schemas-microsoft-com:office:office" xmlns:oel="http://schemas.microsoft.com/office/2019/extlst" xmlns:r="http://schemas.openxmlformats.org/officeDocument/2006/relationships" xmlns:m="http://schemas.openxmlformats.org/officeDocument/2006/math" xmlns:v="urn:schemas-microsoft-com:vml" xmlns:wp14="http://schemas.microsoft.com/office/word/2010/wordprocessingDrawing" xmlns:wp="http://schemas.openxmlformats.org/drawingml/2006/wordprocessingDrawing" xmlns:w10="urn:schemas-microsoft-com:office:word" xmlns:w="http://schemas.openxmlformats.org/wordprocessingml/2006/main" xmlns:w14="http://schemas.microsoft.com/office/word/2010/wordml" xmlns:w15="http://schemas.microsoft.com/office/word/2012/wordml" xmlns:w16cex="http://schemas.microsoft.com/office/word/2018/wordml/cex" xmlns:w16cid="http://schemas.microsoft.com/office/word/2016/wordml/cid" xmlns:w16="http://schemas.microsoft.com/office/word/2018/wordml" xmlns:w16du="http://schemas.microsoft.com/office/word/2023/wordml/word16du" xmlns:w16sdtdh="http://schemas.microsoft.com/office/word/2020/wordml/sdtdatahash" xmlns:w16sdtfl="http://schemas.microsoft.com/office/word/2024/wordml/sdtformatlock" xmlns:w16se="http://schemas.microsoft.com/office/word/2015/wordml/symex" xmlns:wpg="http://schemas.microsoft.com/office/word/2010/wordprocessingGroup" xmlns:wpi="http://schemas.microsoft.com/office/word/2010/wordprocessingInk" xmlns:wne="http://schemas.microsoft.com/office/word/2006/wordml" xmlns:wps="http://schemas.microsoft.com/office/word/2010/wordprocessingShape" mc:Ignorable="w14 w15 w16se w16cid w16 w16cex w16sdtdh w16sdtfl w16du wp14">
-  <w16cid:commentId w16cid:paraId="3723FF27" w16cid:durableId="628A6A4D"/>
-  <w16cid:commentId w16cid:paraId="26833D54" w16cid:durableId="3A95A9BB"/>
-  <w16cid:commentId w16cid:paraId="2800DE26" w16cid:durableId="2277D42F"/>
   <w16cid:commentId w16cid:paraId="5F9CFA9E" w16cid:durableId="23C3CAF9"/>
 </w16cid:commentsIds>
 </file>

</xml_diff>